<commit_message>
docs: update informe_seguridad, add Fase 7
</commit_message>
<xml_diff>
--- a/docs/informe_seguridad.docx
+++ b/docs/informe_seguridad.docx
@@ -5320,45 +5320,25 @@
     </w:p>
     <w:p>
       <w:pPr>
-        <w:spacing w:after="100" w:line="360" w:lineRule="auto"/>
-        <w:jc w:val="both"/>
-        <w:rPr>
-          <w:rFonts w:ascii="Arial" w:hAnsi="Arial" w:cs="Arial"/>
-        </w:rPr>
+        <w:pStyle w:val="apa7"/>
       </w:pPr>
       <w:r>
-        <w:rPr>
-          <w:rFonts w:ascii="Arial" w:hAnsi="Arial" w:cs="Arial"/>
-        </w:rPr>
         <w:t xml:space="preserve">Este documento registra el trabajo de aseguramiento de calidad realizado por Ian en las Fases B y C del laboratorio autorizado </w:t>
       </w:r>
       <w:proofErr w:type="spellStart"/>
       <w:r>
-        <w:rPr>
-          <w:rFonts w:ascii="Arial" w:hAnsi="Arial" w:cs="Arial"/>
-        </w:rPr>
         <w:t>laboratorio_seguridad</w:t>
       </w:r>
       <w:proofErr w:type="spellEnd"/>
       <w:r>
-        <w:rPr>
-          <w:rFonts w:ascii="Arial" w:hAnsi="Arial" w:cs="Arial"/>
-        </w:rPr>
         <w:t>. El alcance comprende el diseño de 12 casos de prueba, automatización, ciclos TDD, pruebas manuales de API, revisión estática, correcciones y regresión. Las pruebas usan únicamente datos sintéticos y el servicio local 127.0.0.1:8765.</w:t>
       </w:r>
     </w:p>
     <w:p>
       <w:pPr>
-        <w:spacing w:after="100" w:line="360" w:lineRule="auto"/>
-        <w:jc w:val="both"/>
-        <w:rPr>
-          <w:rFonts w:ascii="Arial" w:hAnsi="Arial" w:cs="Arial"/>
-        </w:rPr>
+        <w:pStyle w:val="apa7"/>
       </w:pPr>
       <w:r>
-        <w:rPr>
-          <w:rFonts w:ascii="Arial" w:hAnsi="Arial" w:cs="Arial"/>
-        </w:rPr>
         <w:lastRenderedPageBreak/>
         <w:t>La ejecución final cubre los 12 casos diseñados mediante 12 pruebas unitarias y 2 pruebas de integración HTTP, para un total de 14 pruebas aprobadas. T6 permanece como riesgo residual fuera del alcance de corrección del laboratorio.</w:t>
       </w:r>
@@ -6408,16 +6388,9 @@
     </w:p>
     <w:p>
       <w:pPr>
-        <w:spacing w:after="100" w:line="360" w:lineRule="auto"/>
-        <w:jc w:val="both"/>
-        <w:rPr>
-          <w:rFonts w:ascii="Arial" w:hAnsi="Arial" w:cs="Arial"/>
-        </w:rPr>
+        <w:pStyle w:val="apa7"/>
       </w:pPr>
       <w:r>
-        <w:rPr>
-          <w:rFonts w:ascii="Arial" w:hAnsi="Arial" w:cs="Arial"/>
-        </w:rPr>
         <w:t>La clasificación cumple 3 positivos, 6 negativos y 3 de frontera. Cada caso conserva requisito, precondiciones, entrada/pasos, oráculo y evidencia. El estado refleja la ejecución real de la Fase C.</w:t>
       </w:r>
     </w:p>
@@ -11779,16 +11752,9 @@
     </w:p>
     <w:p>
       <w:pPr>
-        <w:spacing w:after="100" w:line="360" w:lineRule="auto"/>
-        <w:jc w:val="both"/>
-        <w:rPr>
-          <w:rFonts w:ascii="Arial" w:hAnsi="Arial" w:cs="Arial"/>
-        </w:rPr>
+        <w:pStyle w:val="apa7"/>
       </w:pPr>
       <w:r>
-        <w:rPr>
-          <w:rFonts w:ascii="Arial" w:hAnsi="Arial" w:cs="Arial"/>
-        </w:rPr>
         <w:t>Se incorporan los campos de control de ejecución solicitados por la plantilla de script de prueba. No se utiliza relación con casos de uso porque el laboratorio no define casos de uso formales; la trazabilidad operativa se conserva mediante SEC, amenaza, caso y evidencia.</w:t>
       </w:r>
     </w:p>
@@ -14360,50 +14326,32 @@
     </w:p>
     <w:p>
       <w:pPr>
-        <w:spacing w:after="100" w:line="360" w:lineRule="auto"/>
-        <w:jc w:val="both"/>
+        <w:pStyle w:val="apa7"/>
         <w:rPr>
-          <w:rFonts w:ascii="Arial" w:hAnsi="Arial" w:cs="Arial"/>
           <w:lang w:val="en-US"/>
         </w:rPr>
       </w:pPr>
       <w:r>
-        <w:rPr>
-          <w:rFonts w:ascii="Arial" w:hAnsi="Arial" w:cs="Arial"/>
-        </w:rPr>
         <w:t xml:space="preserve">tests/test_laboratorio.py contiene doce pruebas unitarias, una por cada caso de TC-01 a TC-12. </w:t>
       </w:r>
       <w:proofErr w:type="spellStart"/>
       <w:r>
-        <w:rPr>
-          <w:rFonts w:ascii="Arial" w:hAnsi="Arial" w:cs="Arial"/>
-        </w:rPr>
         <w:t>setUp</w:t>
       </w:r>
       <w:proofErr w:type="spellEnd"/>
       <w:r>
-        <w:rPr>
-          <w:rFonts w:ascii="Arial" w:hAnsi="Arial" w:cs="Arial"/>
-        </w:rPr>
         <w:t xml:space="preserve"> crea </w:t>
       </w:r>
       <w:proofErr w:type="spellStart"/>
       <w:r>
-        <w:rPr>
-          <w:rFonts w:ascii="Arial" w:hAnsi="Arial" w:cs="Arial"/>
-        </w:rPr>
         <w:t>estado_inicial</w:t>
       </w:r>
       <w:proofErr w:type="spellEnd"/>
       <w:r>
-        <w:rPr>
-          <w:rFonts w:ascii="Arial" w:hAnsi="Arial" w:cs="Arial"/>
-        </w:rPr>
         <w:t xml:space="preserve"> para aislar cada caso. tests/test_api.py inicia un servidor HTTP local efímero y automatiza TC-03 y TC-05. </w:t>
       </w:r>
       <w:r>
         <w:rPr>
-          <w:rFonts w:ascii="Arial" w:hAnsi="Arial" w:cs="Arial"/>
           <w:lang w:val="en-US"/>
         </w:rPr>
         <w:t xml:space="preserve">El </w:t>
@@ -14411,7 +14359,6 @@
       <w:proofErr w:type="spellStart"/>
       <w:r>
         <w:rPr>
-          <w:rFonts w:ascii="Arial" w:hAnsi="Arial" w:cs="Arial"/>
           <w:lang w:val="en-US"/>
         </w:rPr>
         <w:t>comando</w:t>
@@ -14419,24 +14366,21 @@
       <w:proofErr w:type="spellEnd"/>
       <w:r>
         <w:rPr>
-          <w:rFonts w:ascii="Arial" w:hAnsi="Arial" w:cs="Arial"/>
           <w:lang w:val="en-US"/>
         </w:rPr>
-        <w:t xml:space="preserve"> reproducible es: </w:t>
+        <w:t xml:space="preserve"> reproducible </w:t>
       </w:r>
       <w:r>
         <w:rPr>
-          <w:rFonts w:ascii="Arial" w:hAnsi="Arial" w:cs="Arial"/>
           <w:lang w:val="en-US"/>
         </w:rPr>
         <w:lastRenderedPageBreak/>
-        <w:t>$</w:t>
+        <w:t>es: $</w:t>
       </w:r>
       <w:proofErr w:type="spellStart"/>
       <w:proofErr w:type="gramStart"/>
       <w:r>
         <w:rPr>
-          <w:rFonts w:ascii="Arial" w:hAnsi="Arial" w:cs="Arial"/>
           <w:lang w:val="en-US"/>
         </w:rPr>
         <w:t>env:PYTHONPATH</w:t>
@@ -14445,31 +14389,13 @@
       <w:proofErr w:type="gramEnd"/>
       <w:r>
         <w:rPr>
-          <w:rFonts w:ascii="Arial" w:hAnsi="Arial" w:cs="Arial"/>
           <w:lang w:val="en-US"/>
         </w:rPr>
-        <w:t xml:space="preserve"> </w:t>
-      </w:r>
-      <w:proofErr w:type="gramStart"/>
-      <w:r>
-        <w:rPr>
-          <w:rFonts w:ascii="Arial" w:hAnsi="Arial" w:cs="Arial"/>
-          <w:lang w:val="en-US"/>
-        </w:rPr>
-        <w:t>= "."</w:t>
-      </w:r>
-      <w:proofErr w:type="gramEnd"/>
-      <w:r>
-        <w:rPr>
-          <w:rFonts w:ascii="Arial" w:hAnsi="Arial" w:cs="Arial"/>
-          <w:lang w:val="en-US"/>
-        </w:rPr>
-        <w:t xml:space="preserve">; python -m </w:t>
+        <w:t xml:space="preserve"> = "."; python -m </w:t>
       </w:r>
       <w:proofErr w:type="spellStart"/>
       <w:r>
         <w:rPr>
-          <w:rFonts w:ascii="Arial" w:hAnsi="Arial" w:cs="Arial"/>
           <w:lang w:val="en-US"/>
         </w:rPr>
         <w:t>unittest</w:t>
@@ -14477,25 +14403,20 @@
       <w:proofErr w:type="spellEnd"/>
       <w:r>
         <w:rPr>
-          <w:rFonts w:ascii="Arial" w:hAnsi="Arial" w:cs="Arial"/>
           <w:lang w:val="en-US"/>
         </w:rPr>
         <w:t xml:space="preserve"> discover -s tests -v; Remove-Item </w:t>
       </w:r>
       <w:proofErr w:type="spellStart"/>
-      <w:proofErr w:type="gramStart"/>
       <w:r>
         <w:rPr>
-          <w:rFonts w:ascii="Arial" w:hAnsi="Arial" w:cs="Arial"/>
           <w:lang w:val="en-US"/>
         </w:rPr>
         <w:t>Env:PYTHONPATH</w:t>
       </w:r>
       <w:proofErr w:type="spellEnd"/>
-      <w:proofErr w:type="gramEnd"/>
       <w:r>
         <w:rPr>
-          <w:rFonts w:ascii="Arial" w:hAnsi="Arial" w:cs="Arial"/>
           <w:lang w:val="en-US"/>
         </w:rPr>
         <w:t>.</w:t>
@@ -14503,59 +14424,33 @@
     </w:p>
     <w:p>
       <w:pPr>
-        <w:spacing w:after="100" w:line="360" w:lineRule="auto"/>
-        <w:jc w:val="both"/>
-        <w:rPr>
-          <w:rFonts w:ascii="Arial" w:hAnsi="Arial" w:cs="Arial"/>
-        </w:rPr>
+        <w:pStyle w:val="apa7"/>
       </w:pPr>
       <w:r>
-        <w:rPr>
-          <w:rFonts w:ascii="Arial" w:hAnsi="Arial" w:cs="Arial"/>
-        </w:rPr>
         <w:t>La ejecución previa a la corrección de auditoría registra 10 pruebas aprobadas en evidencias/</w:t>
       </w:r>
       <w:proofErr w:type="spellStart"/>
       <w:r>
-        <w:rPr>
-          <w:rFonts w:ascii="Arial" w:hAnsi="Arial" w:cs="Arial"/>
-        </w:rPr>
         <w:t>integracion</w:t>
       </w:r>
       <w:proofErr w:type="spellEnd"/>
       <w:r>
-        <w:rPr>
-          <w:rFonts w:ascii="Arial" w:hAnsi="Arial" w:cs="Arial"/>
-        </w:rPr>
         <w:t>-api/02-regresion-suite. La regresión posterior registra 11 pruebas aprobadas en evidencias/tc-07-auditoria-segura/03-regresion-suite. La versión de Python usada en el laboratorio fue 3.14.6.</w:t>
       </w:r>
     </w:p>
     <w:p>
       <w:pPr>
-        <w:spacing w:after="100" w:line="360" w:lineRule="auto"/>
-        <w:jc w:val="both"/>
-        <w:rPr>
-          <w:rFonts w:ascii="Arial" w:hAnsi="Arial" w:cs="Arial"/>
-        </w:rPr>
+        <w:pStyle w:val="apa7"/>
       </w:pPr>
       <w:r>
-        <w:rPr>
-          <w:rFonts w:ascii="Arial" w:hAnsi="Arial" w:cs="Arial"/>
-        </w:rPr>
         <w:t>La ejecución final, con los doce casos completos, registra 14 pruebas aprobadas en evidencias/</w:t>
       </w:r>
       <w:proofErr w:type="spellStart"/>
       <w:r>
-        <w:rPr>
-          <w:rFonts w:ascii="Arial" w:hAnsi="Arial" w:cs="Arial"/>
-        </w:rPr>
         <w:t>regresion</w:t>
       </w:r>
       <w:proofErr w:type="spellEnd"/>
       <w:r>
-        <w:rPr>
-          <w:rFonts w:ascii="Arial" w:hAnsi="Arial" w:cs="Arial"/>
-        </w:rPr>
         <w:t>-suite-final, repetida en dos corridas independientes (01-regresion-14-pruebas y 02-regresion-14-pruebas).</w:t>
       </w:r>
     </w:p>
@@ -16133,15 +16028,9 @@
     </w:p>
     <w:p>
       <w:pPr>
-        <w:spacing w:after="100" w:line="360" w:lineRule="auto"/>
-        <w:rPr>
-          <w:rFonts w:ascii="Arial" w:hAnsi="Arial" w:cs="Arial"/>
-        </w:rPr>
+        <w:pStyle w:val="apa7"/>
       </w:pPr>
       <w:r>
-        <w:rPr>
-          <w:rFonts w:ascii="Arial" w:hAnsi="Arial" w:cs="Arial"/>
-        </w:rPr>
         <w:t>PM-01 es una comprobación manual adicional de entrada no numérica para SEC-04. No se llama TC-11: TC-11 conserva el diseño de frontera del valor válido 0. Esta decisión elimina una ambigüedad de identificación sin cambiar el catálogo.</w:t>
       </w:r>
     </w:p>
@@ -16898,56 +16787,31 @@
     </w:p>
     <w:p>
       <w:pPr>
-        <w:spacing w:after="100" w:line="360" w:lineRule="auto"/>
-        <w:jc w:val="both"/>
-        <w:rPr>
-          <w:rFonts w:ascii="Arial" w:hAnsi="Arial" w:cs="Arial"/>
-        </w:rPr>
+        <w:pStyle w:val="apa7"/>
       </w:pPr>
       <w:r>
-        <w:rPr>
-          <w:rFonts w:ascii="Arial" w:hAnsi="Arial" w:cs="Arial"/>
-        </w:rPr>
         <w:t xml:space="preserve">Las evidencias textuales y capturas saneadas se guardan en evidencias/: tc-01-expediente-propio, tc-02-acceso-horizontal-tdd, tc-03-modificacion-entre-sedes-tdd, tc-04-sesion-revocada-tdd, tc-05-nota-fuera-rango, tc-06-sesion-expirada, tc-07-auditoria-segura-tdd, tc-08-administrador-sin-modificacion, tc-09-docente-misma-sede, tc-11-limite-inferior-valido, tc-12-limite-superior-invalido, </w:t>
       </w:r>
       <w:proofErr w:type="spellStart"/>
       <w:r>
-        <w:rPr>
-          <w:rFonts w:ascii="Arial" w:hAnsi="Arial" w:cs="Arial"/>
-        </w:rPr>
         <w:t>integracion</w:t>
       </w:r>
       <w:proofErr w:type="spellEnd"/>
       <w:r>
-        <w:rPr>
-          <w:rFonts w:ascii="Arial" w:hAnsi="Arial" w:cs="Arial"/>
-        </w:rPr>
         <w:t xml:space="preserve">-api, manual-api-postman y </w:t>
       </w:r>
       <w:proofErr w:type="spellStart"/>
       <w:r>
-        <w:rPr>
-          <w:rFonts w:ascii="Arial" w:hAnsi="Arial" w:cs="Arial"/>
-        </w:rPr>
         <w:t>regresion</w:t>
       </w:r>
       <w:proofErr w:type="spellEnd"/>
       <w:r>
-        <w:rPr>
-          <w:rFonts w:ascii="Arial" w:hAnsi="Arial" w:cs="Arial"/>
-        </w:rPr>
         <w:t xml:space="preserve">-suite-final (dos corridas limpias). </w:t>
       </w:r>
       <w:r>
-        <w:rPr>
-          <w:rFonts w:ascii="Arial" w:hAnsi="Arial" w:cs="Arial"/>
-        </w:rPr>
         <w:t>TC-10 permanece evidenciado dentro de la regresión global</w:t>
       </w:r>
       <w:r>
-        <w:rPr>
-          <w:rFonts w:ascii="Arial" w:hAnsi="Arial" w:cs="Arial"/>
-        </w:rPr>
         <w:t>.</w:t>
       </w:r>
     </w:p>
@@ -16959,6 +16823,3079 @@
           <w:rFonts w:ascii="Arial" w:hAnsi="Arial" w:cs="Arial"/>
         </w:rPr>
       </w:pPr>
+    </w:p>
+    <w:p>
+      <w:pPr>
+        <w:rPr>
+          <w:rFonts w:ascii="Arial" w:hAnsi="Arial" w:cs="Arial"/>
+        </w:rPr>
+      </w:pPr>
+    </w:p>
+    <w:p>
+      <w:pPr>
+        <w:rPr>
+          <w:rFonts w:ascii="Arial" w:hAnsi="Arial" w:cs="Arial"/>
+        </w:rPr>
+      </w:pPr>
+      <w:r>
+        <w:rPr>
+          <w:rFonts w:ascii="Arial" w:hAnsi="Arial" w:cs="Arial"/>
+        </w:rPr>
+        <w:br w:type="page"/>
+      </w:r>
+    </w:p>
+    <w:p>
+      <w:pPr>
+        <w:pStyle w:val="Ttulo1"/>
+      </w:pPr>
+      <w:r>
+        <w:lastRenderedPageBreak/>
+        <w:t>Fase F — Análisis de resultados y dictamen</w:t>
+      </w:r>
+    </w:p>
+    <w:p>
+      <w:pPr>
+        <w:pStyle w:val="Ttulo2"/>
+      </w:pPr>
+      <w:r>
+        <w:t>Estado consolidado de los 12 casos</w:t>
+      </w:r>
+    </w:p>
+    <w:tbl>
+      <w:tblPr>
+        <w:tblStyle w:val="Tablaconcuadrcula"/>
+        <w:tblW w:w="0" w:type="auto"/>
+        <w:tblLook w:val="04A0" w:firstRow="1" w:lastRow="0" w:firstColumn="1" w:lastColumn="0" w:noHBand="0" w:noVBand="1"/>
+      </w:tblPr>
+      <w:tblGrid>
+        <w:gridCol w:w="1413"/>
+        <w:gridCol w:w="5812"/>
+      </w:tblGrid>
+      <w:tr>
+        <w:tc>
+          <w:tcPr>
+            <w:tcW w:w="1413" w:type="dxa"/>
+            <w:vAlign w:val="center"/>
+          </w:tcPr>
+          <w:p>
+            <w:pPr>
+              <w:spacing w:line="360" w:lineRule="auto"/>
+              <w:jc w:val="both"/>
+              <w:rPr>
+                <w:rFonts w:ascii="Arial" w:hAnsi="Arial" w:cs="Arial"/>
+                <w:sz w:val="24"/>
+                <w:szCs w:val="24"/>
+              </w:rPr>
+            </w:pPr>
+            <w:r>
+              <w:rPr>
+                <w:rFonts w:ascii="Arial" w:hAnsi="Arial" w:cs="Arial"/>
+                <w:b/>
+                <w:bCs/>
+                <w:sz w:val="24"/>
+                <w:szCs w:val="24"/>
+              </w:rPr>
+              <w:t>Caso</w:t>
+            </w:r>
+          </w:p>
+        </w:tc>
+        <w:tc>
+          <w:tcPr>
+            <w:tcW w:w="5812" w:type="dxa"/>
+            <w:vAlign w:val="center"/>
+          </w:tcPr>
+          <w:p>
+            <w:pPr>
+              <w:spacing w:line="360" w:lineRule="auto"/>
+              <w:jc w:val="both"/>
+              <w:rPr>
+                <w:rFonts w:ascii="Arial" w:hAnsi="Arial" w:cs="Arial"/>
+                <w:sz w:val="24"/>
+                <w:szCs w:val="24"/>
+              </w:rPr>
+            </w:pPr>
+            <w:r>
+              <w:rPr>
+                <w:rFonts w:ascii="Arial" w:hAnsi="Arial" w:cs="Arial"/>
+                <w:b/>
+                <w:bCs/>
+                <w:sz w:val="24"/>
+                <w:szCs w:val="24"/>
+              </w:rPr>
+              <w:t>Estado final</w:t>
+            </w:r>
+          </w:p>
+        </w:tc>
+      </w:tr>
+      <w:tr>
+        <w:tc>
+          <w:tcPr>
+            <w:tcW w:w="1413" w:type="dxa"/>
+            <w:vAlign w:val="center"/>
+          </w:tcPr>
+          <w:p>
+            <w:pPr>
+              <w:spacing w:line="360" w:lineRule="auto"/>
+              <w:jc w:val="both"/>
+              <w:rPr>
+                <w:rFonts w:ascii="Arial" w:hAnsi="Arial" w:cs="Arial"/>
+                <w:sz w:val="24"/>
+                <w:szCs w:val="24"/>
+              </w:rPr>
+            </w:pPr>
+            <w:r>
+              <w:rPr>
+                <w:rFonts w:ascii="Arial" w:hAnsi="Arial" w:cs="Arial"/>
+                <w:sz w:val="24"/>
+                <w:szCs w:val="24"/>
+              </w:rPr>
+              <w:t>TC-01</w:t>
+            </w:r>
+          </w:p>
+        </w:tc>
+        <w:tc>
+          <w:tcPr>
+            <w:tcW w:w="5812" w:type="dxa"/>
+            <w:vAlign w:val="center"/>
+          </w:tcPr>
+          <w:p>
+            <w:pPr>
+              <w:spacing w:line="360" w:lineRule="auto"/>
+              <w:jc w:val="both"/>
+              <w:rPr>
+                <w:rFonts w:ascii="Arial" w:hAnsi="Arial" w:cs="Arial"/>
+                <w:sz w:val="24"/>
+                <w:szCs w:val="24"/>
+              </w:rPr>
+            </w:pPr>
+            <w:proofErr w:type="spellStart"/>
+            <w:r>
+              <w:rPr>
+                <w:rFonts w:ascii="Arial" w:hAnsi="Arial" w:cs="Arial"/>
+                <w:sz w:val="24"/>
+                <w:szCs w:val="24"/>
+              </w:rPr>
+              <w:t>Aprobado</w:t>
+            </w:r>
+            <w:proofErr w:type="spellEnd"/>
+          </w:p>
+        </w:tc>
+      </w:tr>
+      <w:tr>
+        <w:tc>
+          <w:tcPr>
+            <w:tcW w:w="1413" w:type="dxa"/>
+            <w:vAlign w:val="center"/>
+          </w:tcPr>
+          <w:p>
+            <w:pPr>
+              <w:spacing w:line="360" w:lineRule="auto"/>
+              <w:jc w:val="both"/>
+              <w:rPr>
+                <w:rFonts w:ascii="Arial" w:hAnsi="Arial" w:cs="Arial"/>
+                <w:sz w:val="24"/>
+                <w:szCs w:val="24"/>
+              </w:rPr>
+            </w:pPr>
+            <w:r>
+              <w:rPr>
+                <w:rFonts w:ascii="Arial" w:hAnsi="Arial" w:cs="Arial"/>
+                <w:sz w:val="24"/>
+                <w:szCs w:val="24"/>
+              </w:rPr>
+              <w:t>TC-02</w:t>
+            </w:r>
+          </w:p>
+        </w:tc>
+        <w:tc>
+          <w:tcPr>
+            <w:tcW w:w="5812" w:type="dxa"/>
+            <w:vAlign w:val="center"/>
+          </w:tcPr>
+          <w:p>
+            <w:pPr>
+              <w:spacing w:line="360" w:lineRule="auto"/>
+              <w:jc w:val="both"/>
+              <w:rPr>
+                <w:rFonts w:ascii="Arial" w:hAnsi="Arial" w:cs="Arial"/>
+                <w:sz w:val="24"/>
+                <w:szCs w:val="24"/>
+                <w:lang w:val="es-MX"/>
+              </w:rPr>
+            </w:pPr>
+            <w:r>
+              <w:rPr>
+                <w:rFonts w:ascii="Arial" w:hAnsi="Arial" w:cs="Arial"/>
+                <w:sz w:val="24"/>
+                <w:szCs w:val="24"/>
+                <w:lang w:val="es-MX"/>
+              </w:rPr>
+              <w:t>Aprobado (defecto B-DEF-01 corregido)</w:t>
+            </w:r>
+          </w:p>
+        </w:tc>
+      </w:tr>
+      <w:tr>
+        <w:tc>
+          <w:tcPr>
+            <w:tcW w:w="1413" w:type="dxa"/>
+            <w:vAlign w:val="center"/>
+          </w:tcPr>
+          <w:p>
+            <w:pPr>
+              <w:spacing w:line="360" w:lineRule="auto"/>
+              <w:jc w:val="both"/>
+              <w:rPr>
+                <w:rFonts w:ascii="Arial" w:hAnsi="Arial" w:cs="Arial"/>
+                <w:sz w:val="24"/>
+                <w:szCs w:val="24"/>
+              </w:rPr>
+            </w:pPr>
+            <w:r>
+              <w:rPr>
+                <w:rFonts w:ascii="Arial" w:hAnsi="Arial" w:cs="Arial"/>
+                <w:sz w:val="24"/>
+                <w:szCs w:val="24"/>
+              </w:rPr>
+              <w:t>TC-03</w:t>
+            </w:r>
+          </w:p>
+        </w:tc>
+        <w:tc>
+          <w:tcPr>
+            <w:tcW w:w="5812" w:type="dxa"/>
+            <w:vAlign w:val="center"/>
+          </w:tcPr>
+          <w:p>
+            <w:pPr>
+              <w:spacing w:line="360" w:lineRule="auto"/>
+              <w:jc w:val="both"/>
+              <w:rPr>
+                <w:rFonts w:ascii="Arial" w:hAnsi="Arial" w:cs="Arial"/>
+                <w:sz w:val="24"/>
+                <w:szCs w:val="24"/>
+                <w:lang w:val="es-MX"/>
+              </w:rPr>
+            </w:pPr>
+            <w:r>
+              <w:rPr>
+                <w:rFonts w:ascii="Arial" w:hAnsi="Arial" w:cs="Arial"/>
+                <w:sz w:val="24"/>
+                <w:szCs w:val="24"/>
+                <w:lang w:val="es-MX"/>
+              </w:rPr>
+              <w:t>Aprobado (defecto B-DEF-03 corregido)</w:t>
+            </w:r>
+          </w:p>
+        </w:tc>
+      </w:tr>
+      <w:tr>
+        <w:tc>
+          <w:tcPr>
+            <w:tcW w:w="1413" w:type="dxa"/>
+            <w:vAlign w:val="center"/>
+          </w:tcPr>
+          <w:p>
+            <w:pPr>
+              <w:spacing w:line="360" w:lineRule="auto"/>
+              <w:jc w:val="both"/>
+              <w:rPr>
+                <w:rFonts w:ascii="Arial" w:hAnsi="Arial" w:cs="Arial"/>
+                <w:sz w:val="24"/>
+                <w:szCs w:val="24"/>
+              </w:rPr>
+            </w:pPr>
+            <w:r>
+              <w:rPr>
+                <w:rFonts w:ascii="Arial" w:hAnsi="Arial" w:cs="Arial"/>
+                <w:sz w:val="24"/>
+                <w:szCs w:val="24"/>
+              </w:rPr>
+              <w:t>TC-04</w:t>
+            </w:r>
+          </w:p>
+        </w:tc>
+        <w:tc>
+          <w:tcPr>
+            <w:tcW w:w="5812" w:type="dxa"/>
+            <w:vAlign w:val="center"/>
+          </w:tcPr>
+          <w:p>
+            <w:pPr>
+              <w:spacing w:line="360" w:lineRule="auto"/>
+              <w:jc w:val="both"/>
+              <w:rPr>
+                <w:rFonts w:ascii="Arial" w:hAnsi="Arial" w:cs="Arial"/>
+                <w:sz w:val="24"/>
+                <w:szCs w:val="24"/>
+                <w:lang w:val="es-MX"/>
+              </w:rPr>
+            </w:pPr>
+            <w:r>
+              <w:rPr>
+                <w:rFonts w:ascii="Arial" w:hAnsi="Arial" w:cs="Arial"/>
+                <w:sz w:val="24"/>
+                <w:szCs w:val="24"/>
+                <w:lang w:val="es-MX"/>
+              </w:rPr>
+              <w:t>Aprobado (defecto B-DEF-02 corregido)</w:t>
+            </w:r>
+          </w:p>
+        </w:tc>
+      </w:tr>
+      <w:tr>
+        <w:tc>
+          <w:tcPr>
+            <w:tcW w:w="1413" w:type="dxa"/>
+            <w:vAlign w:val="center"/>
+          </w:tcPr>
+          <w:p>
+            <w:pPr>
+              <w:spacing w:line="360" w:lineRule="auto"/>
+              <w:jc w:val="both"/>
+              <w:rPr>
+                <w:rFonts w:ascii="Arial" w:hAnsi="Arial" w:cs="Arial"/>
+                <w:sz w:val="24"/>
+                <w:szCs w:val="24"/>
+              </w:rPr>
+            </w:pPr>
+            <w:r>
+              <w:rPr>
+                <w:rFonts w:ascii="Arial" w:hAnsi="Arial" w:cs="Arial"/>
+                <w:sz w:val="24"/>
+                <w:szCs w:val="24"/>
+              </w:rPr>
+              <w:t>TC-05</w:t>
+            </w:r>
+          </w:p>
+        </w:tc>
+        <w:tc>
+          <w:tcPr>
+            <w:tcW w:w="5812" w:type="dxa"/>
+            <w:vAlign w:val="center"/>
+          </w:tcPr>
+          <w:p>
+            <w:pPr>
+              <w:spacing w:line="360" w:lineRule="auto"/>
+              <w:jc w:val="both"/>
+              <w:rPr>
+                <w:rFonts w:ascii="Arial" w:hAnsi="Arial" w:cs="Arial"/>
+                <w:sz w:val="24"/>
+                <w:szCs w:val="24"/>
+                <w:lang w:val="es-MX"/>
+              </w:rPr>
+            </w:pPr>
+            <w:r>
+              <w:rPr>
+                <w:rFonts w:ascii="Arial" w:hAnsi="Arial" w:cs="Arial"/>
+                <w:sz w:val="24"/>
+                <w:szCs w:val="24"/>
+                <w:lang w:val="es-MX"/>
+              </w:rPr>
+              <w:t>Aprobado (defecto B-DEF-04 corregido)</w:t>
+            </w:r>
+          </w:p>
+        </w:tc>
+      </w:tr>
+      <w:tr>
+        <w:tc>
+          <w:tcPr>
+            <w:tcW w:w="1413" w:type="dxa"/>
+            <w:vAlign w:val="center"/>
+          </w:tcPr>
+          <w:p>
+            <w:pPr>
+              <w:spacing w:line="360" w:lineRule="auto"/>
+              <w:jc w:val="both"/>
+              <w:rPr>
+                <w:rFonts w:ascii="Arial" w:hAnsi="Arial" w:cs="Arial"/>
+                <w:sz w:val="24"/>
+                <w:szCs w:val="24"/>
+              </w:rPr>
+            </w:pPr>
+            <w:r>
+              <w:rPr>
+                <w:rFonts w:ascii="Arial" w:hAnsi="Arial" w:cs="Arial"/>
+                <w:sz w:val="24"/>
+                <w:szCs w:val="24"/>
+              </w:rPr>
+              <w:t>TC-06</w:t>
+            </w:r>
+          </w:p>
+        </w:tc>
+        <w:tc>
+          <w:tcPr>
+            <w:tcW w:w="5812" w:type="dxa"/>
+            <w:vAlign w:val="center"/>
+          </w:tcPr>
+          <w:p>
+            <w:pPr>
+              <w:spacing w:line="360" w:lineRule="auto"/>
+              <w:jc w:val="both"/>
+              <w:rPr>
+                <w:rFonts w:ascii="Arial" w:hAnsi="Arial" w:cs="Arial"/>
+                <w:sz w:val="24"/>
+                <w:szCs w:val="24"/>
+              </w:rPr>
+            </w:pPr>
+            <w:proofErr w:type="spellStart"/>
+            <w:r>
+              <w:rPr>
+                <w:rFonts w:ascii="Arial" w:hAnsi="Arial" w:cs="Arial"/>
+                <w:sz w:val="24"/>
+                <w:szCs w:val="24"/>
+              </w:rPr>
+              <w:t>Aprobado</w:t>
+            </w:r>
+            <w:proofErr w:type="spellEnd"/>
+          </w:p>
+        </w:tc>
+      </w:tr>
+      <w:tr>
+        <w:tc>
+          <w:tcPr>
+            <w:tcW w:w="1413" w:type="dxa"/>
+            <w:vAlign w:val="center"/>
+          </w:tcPr>
+          <w:p>
+            <w:pPr>
+              <w:spacing w:line="360" w:lineRule="auto"/>
+              <w:jc w:val="both"/>
+              <w:rPr>
+                <w:rFonts w:ascii="Arial" w:hAnsi="Arial" w:cs="Arial"/>
+                <w:sz w:val="24"/>
+                <w:szCs w:val="24"/>
+              </w:rPr>
+            </w:pPr>
+            <w:r>
+              <w:rPr>
+                <w:rFonts w:ascii="Arial" w:hAnsi="Arial" w:cs="Arial"/>
+                <w:sz w:val="24"/>
+                <w:szCs w:val="24"/>
+              </w:rPr>
+              <w:t>TC-07</w:t>
+            </w:r>
+          </w:p>
+        </w:tc>
+        <w:tc>
+          <w:tcPr>
+            <w:tcW w:w="5812" w:type="dxa"/>
+            <w:vAlign w:val="center"/>
+          </w:tcPr>
+          <w:p>
+            <w:pPr>
+              <w:spacing w:line="360" w:lineRule="auto"/>
+              <w:jc w:val="both"/>
+              <w:rPr>
+                <w:rFonts w:ascii="Arial" w:hAnsi="Arial" w:cs="Arial"/>
+                <w:sz w:val="24"/>
+                <w:szCs w:val="24"/>
+                <w:lang w:val="es-MX"/>
+              </w:rPr>
+            </w:pPr>
+            <w:r>
+              <w:rPr>
+                <w:rFonts w:ascii="Arial" w:hAnsi="Arial" w:cs="Arial"/>
+                <w:sz w:val="24"/>
+                <w:szCs w:val="24"/>
+                <w:lang w:val="es-MX"/>
+              </w:rPr>
+              <w:t>Aprobado (defecto C-DEF-01 corregido)</w:t>
+            </w:r>
+          </w:p>
+        </w:tc>
+      </w:tr>
+      <w:tr>
+        <w:tc>
+          <w:tcPr>
+            <w:tcW w:w="1413" w:type="dxa"/>
+            <w:vAlign w:val="center"/>
+          </w:tcPr>
+          <w:p>
+            <w:pPr>
+              <w:spacing w:line="360" w:lineRule="auto"/>
+              <w:jc w:val="both"/>
+              <w:rPr>
+                <w:rFonts w:ascii="Arial" w:hAnsi="Arial" w:cs="Arial"/>
+                <w:sz w:val="24"/>
+                <w:szCs w:val="24"/>
+              </w:rPr>
+            </w:pPr>
+            <w:r>
+              <w:rPr>
+                <w:rFonts w:ascii="Arial" w:hAnsi="Arial" w:cs="Arial"/>
+                <w:sz w:val="24"/>
+                <w:szCs w:val="24"/>
+              </w:rPr>
+              <w:t>TC-08</w:t>
+            </w:r>
+          </w:p>
+        </w:tc>
+        <w:tc>
+          <w:tcPr>
+            <w:tcW w:w="5812" w:type="dxa"/>
+            <w:vAlign w:val="center"/>
+          </w:tcPr>
+          <w:p>
+            <w:pPr>
+              <w:spacing w:line="360" w:lineRule="auto"/>
+              <w:jc w:val="both"/>
+              <w:rPr>
+                <w:rFonts w:ascii="Arial" w:hAnsi="Arial" w:cs="Arial"/>
+                <w:sz w:val="24"/>
+                <w:szCs w:val="24"/>
+              </w:rPr>
+            </w:pPr>
+            <w:proofErr w:type="spellStart"/>
+            <w:r>
+              <w:rPr>
+                <w:rFonts w:ascii="Arial" w:hAnsi="Arial" w:cs="Arial"/>
+                <w:sz w:val="24"/>
+                <w:szCs w:val="24"/>
+              </w:rPr>
+              <w:t>Aprobado</w:t>
+            </w:r>
+            <w:proofErr w:type="spellEnd"/>
+          </w:p>
+        </w:tc>
+      </w:tr>
+      <w:tr>
+        <w:tc>
+          <w:tcPr>
+            <w:tcW w:w="1413" w:type="dxa"/>
+            <w:vAlign w:val="center"/>
+          </w:tcPr>
+          <w:p>
+            <w:pPr>
+              <w:spacing w:line="360" w:lineRule="auto"/>
+              <w:jc w:val="both"/>
+              <w:rPr>
+                <w:rFonts w:ascii="Arial" w:hAnsi="Arial" w:cs="Arial"/>
+                <w:sz w:val="24"/>
+                <w:szCs w:val="24"/>
+              </w:rPr>
+            </w:pPr>
+            <w:r>
+              <w:rPr>
+                <w:rFonts w:ascii="Arial" w:hAnsi="Arial" w:cs="Arial"/>
+                <w:sz w:val="24"/>
+                <w:szCs w:val="24"/>
+              </w:rPr>
+              <w:t>TC-09</w:t>
+            </w:r>
+          </w:p>
+        </w:tc>
+        <w:tc>
+          <w:tcPr>
+            <w:tcW w:w="5812" w:type="dxa"/>
+            <w:vAlign w:val="center"/>
+          </w:tcPr>
+          <w:p>
+            <w:pPr>
+              <w:spacing w:line="360" w:lineRule="auto"/>
+              <w:jc w:val="both"/>
+              <w:rPr>
+                <w:rFonts w:ascii="Arial" w:hAnsi="Arial" w:cs="Arial"/>
+                <w:sz w:val="24"/>
+                <w:szCs w:val="24"/>
+              </w:rPr>
+            </w:pPr>
+            <w:proofErr w:type="spellStart"/>
+            <w:r>
+              <w:rPr>
+                <w:rFonts w:ascii="Arial" w:hAnsi="Arial" w:cs="Arial"/>
+                <w:sz w:val="24"/>
+                <w:szCs w:val="24"/>
+              </w:rPr>
+              <w:t>Aprobado</w:t>
+            </w:r>
+            <w:proofErr w:type="spellEnd"/>
+          </w:p>
+        </w:tc>
+      </w:tr>
+      <w:tr>
+        <w:tc>
+          <w:tcPr>
+            <w:tcW w:w="1413" w:type="dxa"/>
+            <w:vAlign w:val="center"/>
+          </w:tcPr>
+          <w:p>
+            <w:pPr>
+              <w:spacing w:line="360" w:lineRule="auto"/>
+              <w:jc w:val="both"/>
+              <w:rPr>
+                <w:rFonts w:ascii="Arial" w:hAnsi="Arial" w:cs="Arial"/>
+                <w:sz w:val="24"/>
+                <w:szCs w:val="24"/>
+              </w:rPr>
+            </w:pPr>
+            <w:r>
+              <w:rPr>
+                <w:rFonts w:ascii="Arial" w:hAnsi="Arial" w:cs="Arial"/>
+                <w:sz w:val="24"/>
+                <w:szCs w:val="24"/>
+              </w:rPr>
+              <w:t>TC-10</w:t>
+            </w:r>
+          </w:p>
+        </w:tc>
+        <w:tc>
+          <w:tcPr>
+            <w:tcW w:w="5812" w:type="dxa"/>
+            <w:vAlign w:val="center"/>
+          </w:tcPr>
+          <w:p>
+            <w:pPr>
+              <w:spacing w:line="360" w:lineRule="auto"/>
+              <w:jc w:val="both"/>
+              <w:rPr>
+                <w:rFonts w:ascii="Arial" w:hAnsi="Arial" w:cs="Arial"/>
+                <w:sz w:val="24"/>
+                <w:szCs w:val="24"/>
+              </w:rPr>
+            </w:pPr>
+            <w:proofErr w:type="spellStart"/>
+            <w:r>
+              <w:rPr>
+                <w:rFonts w:ascii="Arial" w:hAnsi="Arial" w:cs="Arial"/>
+                <w:sz w:val="24"/>
+                <w:szCs w:val="24"/>
+              </w:rPr>
+              <w:t>Aprobado</w:t>
+            </w:r>
+            <w:proofErr w:type="spellEnd"/>
+          </w:p>
+        </w:tc>
+      </w:tr>
+      <w:tr>
+        <w:tc>
+          <w:tcPr>
+            <w:tcW w:w="1413" w:type="dxa"/>
+            <w:vAlign w:val="center"/>
+          </w:tcPr>
+          <w:p>
+            <w:pPr>
+              <w:spacing w:line="360" w:lineRule="auto"/>
+              <w:jc w:val="both"/>
+              <w:rPr>
+                <w:rFonts w:ascii="Arial" w:hAnsi="Arial" w:cs="Arial"/>
+                <w:sz w:val="24"/>
+                <w:szCs w:val="24"/>
+              </w:rPr>
+            </w:pPr>
+            <w:r>
+              <w:rPr>
+                <w:rFonts w:ascii="Arial" w:hAnsi="Arial" w:cs="Arial"/>
+                <w:sz w:val="24"/>
+                <w:szCs w:val="24"/>
+              </w:rPr>
+              <w:t>TC-11</w:t>
+            </w:r>
+          </w:p>
+        </w:tc>
+        <w:tc>
+          <w:tcPr>
+            <w:tcW w:w="5812" w:type="dxa"/>
+            <w:vAlign w:val="center"/>
+          </w:tcPr>
+          <w:p>
+            <w:pPr>
+              <w:spacing w:line="360" w:lineRule="auto"/>
+              <w:jc w:val="both"/>
+              <w:rPr>
+                <w:rFonts w:ascii="Arial" w:hAnsi="Arial" w:cs="Arial"/>
+                <w:sz w:val="24"/>
+                <w:szCs w:val="24"/>
+              </w:rPr>
+            </w:pPr>
+            <w:proofErr w:type="spellStart"/>
+            <w:r>
+              <w:rPr>
+                <w:rFonts w:ascii="Arial" w:hAnsi="Arial" w:cs="Arial"/>
+                <w:sz w:val="24"/>
+                <w:szCs w:val="24"/>
+              </w:rPr>
+              <w:t>Aprobado</w:t>
+            </w:r>
+            <w:proofErr w:type="spellEnd"/>
+          </w:p>
+        </w:tc>
+      </w:tr>
+      <w:tr>
+        <w:tc>
+          <w:tcPr>
+            <w:tcW w:w="1413" w:type="dxa"/>
+            <w:vAlign w:val="center"/>
+          </w:tcPr>
+          <w:p>
+            <w:pPr>
+              <w:spacing w:line="360" w:lineRule="auto"/>
+              <w:jc w:val="both"/>
+              <w:rPr>
+                <w:rFonts w:ascii="Arial" w:hAnsi="Arial" w:cs="Arial"/>
+                <w:sz w:val="24"/>
+                <w:szCs w:val="24"/>
+              </w:rPr>
+            </w:pPr>
+            <w:r>
+              <w:rPr>
+                <w:rFonts w:ascii="Arial" w:hAnsi="Arial" w:cs="Arial"/>
+                <w:sz w:val="24"/>
+                <w:szCs w:val="24"/>
+              </w:rPr>
+              <w:t>TC-12</w:t>
+            </w:r>
+          </w:p>
+        </w:tc>
+        <w:tc>
+          <w:tcPr>
+            <w:tcW w:w="5812" w:type="dxa"/>
+            <w:vAlign w:val="center"/>
+          </w:tcPr>
+          <w:p>
+            <w:pPr>
+              <w:spacing w:line="360" w:lineRule="auto"/>
+              <w:jc w:val="both"/>
+              <w:rPr>
+                <w:rFonts w:ascii="Arial" w:hAnsi="Arial" w:cs="Arial"/>
+                <w:sz w:val="24"/>
+                <w:szCs w:val="24"/>
+              </w:rPr>
+            </w:pPr>
+            <w:proofErr w:type="spellStart"/>
+            <w:r>
+              <w:rPr>
+                <w:rFonts w:ascii="Arial" w:hAnsi="Arial" w:cs="Arial"/>
+                <w:sz w:val="24"/>
+                <w:szCs w:val="24"/>
+              </w:rPr>
+              <w:t>Aprobado</w:t>
+            </w:r>
+            <w:proofErr w:type="spellEnd"/>
+          </w:p>
+        </w:tc>
+      </w:tr>
+    </w:tbl>
+    <w:p>
+      <w:pPr>
+        <w:pStyle w:val="apa7"/>
+      </w:pPr>
+      <w:r>
+        <w:t>De los 12 casos planificados, los 12 obtuvieron veredicto (ninguno quedó bloqueado o no ejecutado). No hubo fallos pendientes al cierre de la campaña: los 5 defectos detectados durante el ciclo TDD (B-DEF-01 a 04 y C-DEF-01) fueron corregidos y verificados mediante regresión, ejecutada dos veces en estado limpio (ver evidencias/</w:t>
+      </w:r>
+      <w:proofErr w:type="spellStart"/>
+      <w:r>
+        <w:t>regresion</w:t>
+      </w:r>
+      <w:proofErr w:type="spellEnd"/>
+      <w:r>
+        <w:t>-suite-final/).</w:t>
+      </w:r>
+    </w:p>
+    <w:p>
+      <w:pPr>
+        <w:pStyle w:val="Ttulo2"/>
+      </w:pPr>
+      <w:r>
+        <w:t>Indicadores</w:t>
+      </w:r>
+    </w:p>
+    <w:p>
+      <w:pPr>
+        <w:pStyle w:val="Prrafodelista"/>
+        <w:numPr>
+          <w:ilvl w:val="0"/>
+          <w:numId w:val="4"/>
+        </w:numPr>
+        <w:spacing w:line="360" w:lineRule="auto"/>
+        <w:jc w:val="both"/>
+        <w:rPr>
+          <w:rFonts w:ascii="Arial" w:hAnsi="Arial" w:cs="Arial"/>
+        </w:rPr>
+      </w:pPr>
+      <w:r>
+        <w:rPr>
+          <w:rFonts w:ascii="Arial" w:hAnsi="Arial" w:cs="Arial"/>
+          <w:b/>
+          <w:bCs/>
+        </w:rPr>
+        <w:t>Tasa de aprobación</w:t>
+      </w:r>
+      <w:r>
+        <w:rPr>
+          <w:rFonts w:ascii="Arial" w:hAnsi="Arial" w:cs="Arial"/>
+        </w:rPr>
+        <w:t xml:space="preserve"> = aprobados / (aprobados + fallidos) × 100 = 12 / 12 × 100 = </w:t>
+      </w:r>
+      <w:r>
+        <w:rPr>
+          <w:rFonts w:ascii="Arial" w:hAnsi="Arial" w:cs="Arial"/>
+          <w:b/>
+          <w:bCs/>
+        </w:rPr>
+        <w:t>100 %</w:t>
+      </w:r>
+    </w:p>
+    <w:p>
+      <w:pPr>
+        <w:pStyle w:val="Prrafodelista"/>
+        <w:numPr>
+          <w:ilvl w:val="0"/>
+          <w:numId w:val="4"/>
+        </w:numPr>
+        <w:spacing w:line="360" w:lineRule="auto"/>
+        <w:jc w:val="both"/>
+        <w:rPr>
+          <w:rFonts w:ascii="Arial" w:hAnsi="Arial" w:cs="Arial"/>
+        </w:rPr>
+      </w:pPr>
+      <w:r>
+        <w:rPr>
+          <w:rFonts w:ascii="Arial" w:hAnsi="Arial" w:cs="Arial"/>
+          <w:b/>
+          <w:bCs/>
+        </w:rPr>
+        <w:t>Avance</w:t>
+      </w:r>
+      <w:r>
+        <w:rPr>
+          <w:rFonts w:ascii="Arial" w:hAnsi="Arial" w:cs="Arial"/>
+        </w:rPr>
+        <w:t xml:space="preserve"> = (aprobados + fallidos) / planificados × 100 = 12 / 12 × 100 = </w:t>
+      </w:r>
+      <w:r>
+        <w:rPr>
+          <w:rFonts w:ascii="Arial" w:hAnsi="Arial" w:cs="Arial"/>
+          <w:b/>
+          <w:bCs/>
+        </w:rPr>
+        <w:t>100 %</w:t>
+      </w:r>
+    </w:p>
+    <w:p>
+      <w:pPr>
+        <w:pStyle w:val="Prrafodelista"/>
+        <w:numPr>
+          <w:ilvl w:val="0"/>
+          <w:numId w:val="4"/>
+        </w:numPr>
+        <w:spacing w:line="360" w:lineRule="auto"/>
+        <w:jc w:val="both"/>
+        <w:rPr>
+          <w:rFonts w:ascii="Arial" w:hAnsi="Arial" w:cs="Arial"/>
+        </w:rPr>
+      </w:pPr>
+      <w:r>
+        <w:rPr>
+          <w:rFonts w:ascii="Arial" w:hAnsi="Arial" w:cs="Arial"/>
+          <w:b/>
+          <w:bCs/>
+        </w:rPr>
+        <w:t>Cobertura de requisitos</w:t>
+      </w:r>
+      <w:r>
+        <w:rPr>
+          <w:rFonts w:ascii="Arial" w:hAnsi="Arial" w:cs="Arial"/>
+        </w:rPr>
+        <w:t xml:space="preserve"> = requisitos con al menos una prueba válida / requisitos definidos × 100 = 7 / 7 × 100 = </w:t>
+      </w:r>
+      <w:r>
+        <w:rPr>
+          <w:rFonts w:ascii="Arial" w:hAnsi="Arial" w:cs="Arial"/>
+          <w:b/>
+          <w:bCs/>
+        </w:rPr>
+        <w:t>100 %</w:t>
+      </w:r>
+      <w:r>
+        <w:rPr>
+          <w:rFonts w:ascii="Arial" w:hAnsi="Arial" w:cs="Arial"/>
+        </w:rPr>
+        <w:t xml:space="preserve"> (SEC-01 a SEC-07, cada uno con al menos un caso asociado; ver matriz_trazabilidad.csv)</w:t>
+      </w:r>
+    </w:p>
+    <w:p>
+      <w:pPr>
+        <w:pStyle w:val="apa7"/>
+      </w:pPr>
+      <w:r>
+        <w:t xml:space="preserve">Esta tasa de 100 % refleja el estado final </w:t>
+      </w:r>
+      <w:r>
+        <w:rPr>
+          <w:b/>
+          <w:bCs/>
+        </w:rPr>
+        <w:t>después</w:t>
+      </w:r>
+      <w:r>
+        <w:t xml:space="preserve"> de corregir los 5 defectos encontrados durante el proceso TDD — no significa que el sistema nunca falló, sino que </w:t>
+      </w:r>
+      <w:r>
+        <w:lastRenderedPageBreak/>
+        <w:t xml:space="preserve">todos los fallos detectados fueron tratados y </w:t>
+      </w:r>
+      <w:proofErr w:type="spellStart"/>
+      <w:r>
+        <w:t>re-verificados</w:t>
+      </w:r>
+      <w:proofErr w:type="spellEnd"/>
+      <w:r>
+        <w:t>. El riesgo residual T6 (sin límite de intentos de token) queda fuera de esta cobertura porque no corresponde a un requisito SEC definido en Fase A; se trata como limitación en el punto de decisión de liberación.</w:t>
+      </w:r>
+    </w:p>
+    <w:p>
+      <w:pPr>
+        <w:pStyle w:val="Ttulo2"/>
+      </w:pPr>
+      <w:r>
+        <w:t>Registro de hallazgos</w:t>
+      </w:r>
+    </w:p>
+    <w:p>
+      <w:pPr>
+        <w:pStyle w:val="apa7"/>
+      </w:pPr>
+      <w:r>
+        <w:t>Se confirmaron 5 hallazgos durante la campaña, todos reales (defectos del producto, no fallos de la propia prueba) y todos corregidos y verificados por regresión. No se registraron falsos positivos ni resultados no concluyentes.</w:t>
+      </w:r>
+    </w:p>
+    <w:tbl>
+      <w:tblPr>
+        <w:tblStyle w:val="Tablaconcuadrcula"/>
+        <w:tblW w:w="11340" w:type="dxa"/>
+        <w:tblInd w:w="-1139" w:type="dxa"/>
+        <w:tblLayout w:type="fixed"/>
+        <w:tblLook w:val="04A0" w:firstRow="1" w:lastRow="0" w:firstColumn="1" w:lastColumn="0" w:noHBand="0" w:noVBand="1"/>
+      </w:tblPr>
+      <w:tblGrid>
+        <w:gridCol w:w="708"/>
+        <w:gridCol w:w="1231"/>
+        <w:gridCol w:w="1605"/>
+        <w:gridCol w:w="1276"/>
+        <w:gridCol w:w="1559"/>
+        <w:gridCol w:w="1134"/>
+        <w:gridCol w:w="1418"/>
+        <w:gridCol w:w="2409"/>
+      </w:tblGrid>
+      <w:tr>
+        <w:tc>
+          <w:tcPr>
+            <w:tcW w:w="708" w:type="dxa"/>
+            <w:vAlign w:val="center"/>
+          </w:tcPr>
+          <w:p>
+            <w:pPr>
+              <w:spacing w:line="360" w:lineRule="auto"/>
+              <w:jc w:val="both"/>
+              <w:rPr>
+                <w:rFonts w:ascii="Arial" w:hAnsi="Arial" w:cs="Arial"/>
+                <w:b/>
+                <w:bCs/>
+                <w:sz w:val="24"/>
+                <w:szCs w:val="24"/>
+              </w:rPr>
+            </w:pPr>
+            <w:r>
+              <w:rPr>
+                <w:rFonts w:ascii="Arial" w:hAnsi="Arial" w:cs="Arial"/>
+                <w:b/>
+                <w:bCs/>
+                <w:sz w:val="24"/>
+                <w:szCs w:val="24"/>
+              </w:rPr>
+              <w:t>ID</w:t>
+            </w:r>
+          </w:p>
+        </w:tc>
+        <w:tc>
+          <w:tcPr>
+            <w:tcW w:w="1231" w:type="dxa"/>
+            <w:vAlign w:val="center"/>
+          </w:tcPr>
+          <w:p>
+            <w:pPr>
+              <w:spacing w:line="360" w:lineRule="auto"/>
+              <w:jc w:val="both"/>
+              <w:rPr>
+                <w:rFonts w:ascii="Arial" w:hAnsi="Arial" w:cs="Arial"/>
+                <w:b/>
+                <w:bCs/>
+                <w:sz w:val="24"/>
+                <w:szCs w:val="24"/>
+              </w:rPr>
+            </w:pPr>
+            <w:proofErr w:type="spellStart"/>
+            <w:r>
+              <w:rPr>
+                <w:rFonts w:ascii="Arial" w:hAnsi="Arial" w:cs="Arial"/>
+                <w:b/>
+                <w:bCs/>
+                <w:sz w:val="24"/>
+                <w:szCs w:val="24"/>
+              </w:rPr>
+              <w:t>Requisito</w:t>
+            </w:r>
+            <w:proofErr w:type="spellEnd"/>
+          </w:p>
+        </w:tc>
+        <w:tc>
+          <w:tcPr>
+            <w:tcW w:w="1605" w:type="dxa"/>
+            <w:vAlign w:val="center"/>
+          </w:tcPr>
+          <w:p>
+            <w:pPr>
+              <w:spacing w:line="360" w:lineRule="auto"/>
+              <w:jc w:val="both"/>
+              <w:rPr>
+                <w:rFonts w:ascii="Arial" w:hAnsi="Arial" w:cs="Arial"/>
+                <w:b/>
+                <w:bCs/>
+                <w:sz w:val="24"/>
+                <w:szCs w:val="24"/>
+              </w:rPr>
+            </w:pPr>
+            <w:r>
+              <w:rPr>
+                <w:rFonts w:ascii="Arial" w:hAnsi="Arial" w:cs="Arial"/>
+                <w:b/>
+                <w:bCs/>
+                <w:sz w:val="24"/>
+                <w:szCs w:val="24"/>
+              </w:rPr>
+              <w:t xml:space="preserve">Pasos de </w:t>
+            </w:r>
+            <w:proofErr w:type="spellStart"/>
+            <w:r>
+              <w:rPr>
+                <w:rFonts w:ascii="Arial" w:hAnsi="Arial" w:cs="Arial"/>
+                <w:b/>
+                <w:bCs/>
+                <w:sz w:val="24"/>
+                <w:szCs w:val="24"/>
+              </w:rPr>
+              <w:t>reproducción</w:t>
+            </w:r>
+            <w:proofErr w:type="spellEnd"/>
+          </w:p>
+        </w:tc>
+        <w:tc>
+          <w:tcPr>
+            <w:tcW w:w="1276" w:type="dxa"/>
+            <w:vAlign w:val="center"/>
+          </w:tcPr>
+          <w:p>
+            <w:pPr>
+              <w:spacing w:line="360" w:lineRule="auto"/>
+              <w:jc w:val="both"/>
+              <w:rPr>
+                <w:rFonts w:ascii="Arial" w:hAnsi="Arial" w:cs="Arial"/>
+                <w:b/>
+                <w:bCs/>
+                <w:sz w:val="24"/>
+                <w:szCs w:val="24"/>
+              </w:rPr>
+            </w:pPr>
+            <w:proofErr w:type="spellStart"/>
+            <w:r>
+              <w:rPr>
+                <w:rFonts w:ascii="Arial" w:hAnsi="Arial" w:cs="Arial"/>
+                <w:b/>
+                <w:bCs/>
+                <w:sz w:val="24"/>
+                <w:szCs w:val="24"/>
+              </w:rPr>
+              <w:t>Esperado</w:t>
+            </w:r>
+            <w:proofErr w:type="spellEnd"/>
+          </w:p>
+        </w:tc>
+        <w:tc>
+          <w:tcPr>
+            <w:tcW w:w="1559" w:type="dxa"/>
+            <w:vAlign w:val="center"/>
+          </w:tcPr>
+          <w:p>
+            <w:pPr>
+              <w:spacing w:line="360" w:lineRule="auto"/>
+              <w:jc w:val="both"/>
+              <w:rPr>
+                <w:rFonts w:ascii="Arial" w:hAnsi="Arial" w:cs="Arial"/>
+                <w:b/>
+                <w:bCs/>
+                <w:sz w:val="24"/>
+                <w:szCs w:val="24"/>
+              </w:rPr>
+            </w:pPr>
+            <w:proofErr w:type="spellStart"/>
+            <w:r>
+              <w:rPr>
+                <w:rFonts w:ascii="Arial" w:hAnsi="Arial" w:cs="Arial"/>
+                <w:b/>
+                <w:bCs/>
+                <w:sz w:val="24"/>
+                <w:szCs w:val="24"/>
+              </w:rPr>
+              <w:t>Observado</w:t>
+            </w:r>
+            <w:proofErr w:type="spellEnd"/>
+            <w:r>
+              <w:rPr>
+                <w:rFonts w:ascii="Arial" w:hAnsi="Arial" w:cs="Arial"/>
+                <w:b/>
+                <w:bCs/>
+                <w:sz w:val="24"/>
+                <w:szCs w:val="24"/>
+              </w:rPr>
+              <w:t xml:space="preserve"> (antes de </w:t>
+            </w:r>
+            <w:proofErr w:type="spellStart"/>
+            <w:r>
+              <w:rPr>
+                <w:rFonts w:ascii="Arial" w:hAnsi="Arial" w:cs="Arial"/>
+                <w:b/>
+                <w:bCs/>
+                <w:sz w:val="24"/>
+                <w:szCs w:val="24"/>
+              </w:rPr>
+              <w:t>corregir</w:t>
+            </w:r>
+            <w:proofErr w:type="spellEnd"/>
+            <w:r>
+              <w:rPr>
+                <w:rFonts w:ascii="Arial" w:hAnsi="Arial" w:cs="Arial"/>
+                <w:b/>
+                <w:bCs/>
+                <w:sz w:val="24"/>
+                <w:szCs w:val="24"/>
+              </w:rPr>
+              <w:t>)</w:t>
+            </w:r>
+          </w:p>
+        </w:tc>
+        <w:tc>
+          <w:tcPr>
+            <w:tcW w:w="1134" w:type="dxa"/>
+            <w:vAlign w:val="center"/>
+          </w:tcPr>
+          <w:p>
+            <w:pPr>
+              <w:spacing w:line="360" w:lineRule="auto"/>
+              <w:jc w:val="both"/>
+              <w:rPr>
+                <w:rFonts w:ascii="Arial" w:hAnsi="Arial" w:cs="Arial"/>
+                <w:b/>
+                <w:bCs/>
+                <w:sz w:val="24"/>
+                <w:szCs w:val="24"/>
+              </w:rPr>
+            </w:pPr>
+            <w:r>
+              <w:rPr>
+                <w:rFonts w:ascii="Arial" w:hAnsi="Arial" w:cs="Arial"/>
+                <w:b/>
+                <w:bCs/>
+                <w:sz w:val="24"/>
+                <w:szCs w:val="24"/>
+              </w:rPr>
+              <w:t>Impacto</w:t>
+            </w:r>
+          </w:p>
+        </w:tc>
+        <w:tc>
+          <w:tcPr>
+            <w:tcW w:w="1418" w:type="dxa"/>
+            <w:vAlign w:val="center"/>
+          </w:tcPr>
+          <w:p>
+            <w:pPr>
+              <w:spacing w:line="360" w:lineRule="auto"/>
+              <w:jc w:val="both"/>
+              <w:rPr>
+                <w:rFonts w:ascii="Arial" w:hAnsi="Arial" w:cs="Arial"/>
+                <w:b/>
+                <w:bCs/>
+                <w:sz w:val="24"/>
+                <w:szCs w:val="24"/>
+              </w:rPr>
+            </w:pPr>
+            <w:proofErr w:type="spellStart"/>
+            <w:r>
+              <w:rPr>
+                <w:rFonts w:ascii="Arial" w:hAnsi="Arial" w:cs="Arial"/>
+                <w:b/>
+                <w:bCs/>
+                <w:sz w:val="24"/>
+                <w:szCs w:val="24"/>
+              </w:rPr>
+              <w:t>Corrección</w:t>
+            </w:r>
+            <w:proofErr w:type="spellEnd"/>
+          </w:p>
+        </w:tc>
+        <w:tc>
+          <w:tcPr>
+            <w:tcW w:w="2409" w:type="dxa"/>
+            <w:vAlign w:val="center"/>
+          </w:tcPr>
+          <w:p>
+            <w:pPr>
+              <w:spacing w:line="360" w:lineRule="auto"/>
+              <w:jc w:val="both"/>
+              <w:rPr>
+                <w:rFonts w:ascii="Arial" w:hAnsi="Arial" w:cs="Arial"/>
+                <w:b/>
+                <w:bCs/>
+                <w:sz w:val="24"/>
+                <w:szCs w:val="24"/>
+              </w:rPr>
+            </w:pPr>
+            <w:proofErr w:type="spellStart"/>
+            <w:r>
+              <w:rPr>
+                <w:rFonts w:ascii="Arial" w:hAnsi="Arial" w:cs="Arial"/>
+                <w:b/>
+                <w:bCs/>
+                <w:sz w:val="24"/>
+                <w:szCs w:val="24"/>
+              </w:rPr>
+              <w:t>Evidencia</w:t>
+            </w:r>
+            <w:proofErr w:type="spellEnd"/>
+          </w:p>
+        </w:tc>
+      </w:tr>
+      <w:tr>
+        <w:tc>
+          <w:tcPr>
+            <w:tcW w:w="708" w:type="dxa"/>
+            <w:vAlign w:val="center"/>
+          </w:tcPr>
+          <w:p>
+            <w:pPr>
+              <w:spacing w:line="360" w:lineRule="auto"/>
+              <w:jc w:val="both"/>
+              <w:rPr>
+                <w:rFonts w:ascii="Arial" w:hAnsi="Arial" w:cs="Arial"/>
+                <w:b/>
+                <w:bCs/>
+                <w:sz w:val="24"/>
+                <w:szCs w:val="24"/>
+              </w:rPr>
+            </w:pPr>
+            <w:r>
+              <w:rPr>
+                <w:rFonts w:ascii="Arial" w:hAnsi="Arial" w:cs="Arial"/>
+                <w:sz w:val="24"/>
+                <w:szCs w:val="24"/>
+              </w:rPr>
+              <w:t>H-01</w:t>
+            </w:r>
+          </w:p>
+        </w:tc>
+        <w:tc>
+          <w:tcPr>
+            <w:tcW w:w="1231" w:type="dxa"/>
+            <w:vAlign w:val="center"/>
+          </w:tcPr>
+          <w:p>
+            <w:pPr>
+              <w:spacing w:line="360" w:lineRule="auto"/>
+              <w:jc w:val="both"/>
+              <w:rPr>
+                <w:rFonts w:ascii="Arial" w:hAnsi="Arial" w:cs="Arial"/>
+                <w:b/>
+                <w:bCs/>
+                <w:sz w:val="24"/>
+                <w:szCs w:val="24"/>
+              </w:rPr>
+            </w:pPr>
+            <w:r>
+              <w:rPr>
+                <w:rFonts w:ascii="Arial" w:hAnsi="Arial" w:cs="Arial"/>
+                <w:sz w:val="24"/>
+                <w:szCs w:val="24"/>
+              </w:rPr>
+              <w:t>SEC-01</w:t>
+            </w:r>
+          </w:p>
+        </w:tc>
+        <w:tc>
+          <w:tcPr>
+            <w:tcW w:w="1605" w:type="dxa"/>
+            <w:vAlign w:val="center"/>
+          </w:tcPr>
+          <w:p>
+            <w:pPr>
+              <w:spacing w:line="360" w:lineRule="auto"/>
+              <w:jc w:val="both"/>
+              <w:rPr>
+                <w:rFonts w:ascii="Arial" w:hAnsi="Arial" w:cs="Arial"/>
+                <w:b/>
+                <w:bCs/>
+                <w:sz w:val="24"/>
+                <w:szCs w:val="24"/>
+                <w:lang w:val="es-MX"/>
+              </w:rPr>
+            </w:pPr>
+            <w:r>
+              <w:rPr>
+                <w:rFonts w:ascii="Arial" w:hAnsi="Arial" w:cs="Arial"/>
+                <w:sz w:val="24"/>
+                <w:szCs w:val="24"/>
+                <w:lang w:val="es-MX"/>
+              </w:rPr>
+              <w:t xml:space="preserve">GET /expedientes/202 con Bearer </w:t>
+            </w:r>
+            <w:proofErr w:type="spellStart"/>
+            <w:r>
+              <w:rPr>
+                <w:rFonts w:ascii="Arial" w:hAnsi="Arial" w:cs="Arial"/>
+                <w:sz w:val="24"/>
+                <w:szCs w:val="24"/>
+                <w:lang w:val="es-MX"/>
+              </w:rPr>
+              <w:t>lab-ana</w:t>
+            </w:r>
+            <w:proofErr w:type="spellEnd"/>
+            <w:r>
+              <w:rPr>
+                <w:rFonts w:ascii="Arial" w:hAnsi="Arial" w:cs="Arial"/>
+                <w:sz w:val="24"/>
+                <w:szCs w:val="24"/>
+                <w:lang w:val="es-MX"/>
+              </w:rPr>
+              <w:t xml:space="preserve"> (Ana intenta leer el expediente de Luis).</w:t>
+            </w:r>
+          </w:p>
+        </w:tc>
+        <w:tc>
+          <w:tcPr>
+            <w:tcW w:w="1276" w:type="dxa"/>
+            <w:vAlign w:val="center"/>
+          </w:tcPr>
+          <w:p>
+            <w:pPr>
+              <w:spacing w:line="360" w:lineRule="auto"/>
+              <w:jc w:val="both"/>
+              <w:rPr>
+                <w:rFonts w:ascii="Arial" w:hAnsi="Arial" w:cs="Arial"/>
+                <w:b/>
+                <w:bCs/>
+                <w:sz w:val="24"/>
+                <w:szCs w:val="24"/>
+              </w:rPr>
+            </w:pPr>
+            <w:r>
+              <w:rPr>
+                <w:rFonts w:ascii="Arial" w:hAnsi="Arial" w:cs="Arial"/>
+                <w:sz w:val="24"/>
+                <w:szCs w:val="24"/>
+              </w:rPr>
+              <w:t>403, sin datos de Luis.</w:t>
+            </w:r>
+          </w:p>
+        </w:tc>
+        <w:tc>
+          <w:tcPr>
+            <w:tcW w:w="1559" w:type="dxa"/>
+            <w:vAlign w:val="center"/>
+          </w:tcPr>
+          <w:p>
+            <w:pPr>
+              <w:spacing w:line="360" w:lineRule="auto"/>
+              <w:jc w:val="both"/>
+              <w:rPr>
+                <w:rFonts w:ascii="Arial" w:hAnsi="Arial" w:cs="Arial"/>
+                <w:b/>
+                <w:bCs/>
+                <w:sz w:val="24"/>
+                <w:szCs w:val="24"/>
+                <w:lang w:val="es-MX"/>
+              </w:rPr>
+            </w:pPr>
+            <w:r>
+              <w:rPr>
+                <w:rFonts w:ascii="Arial" w:hAnsi="Arial" w:cs="Arial"/>
+                <w:sz w:val="24"/>
+                <w:szCs w:val="24"/>
+                <w:lang w:val="es-MX"/>
+              </w:rPr>
+              <w:t>200; el expediente ajeno se exponía completo.</w:t>
+            </w:r>
+          </w:p>
+        </w:tc>
+        <w:tc>
+          <w:tcPr>
+            <w:tcW w:w="1134" w:type="dxa"/>
+            <w:vAlign w:val="center"/>
+          </w:tcPr>
+          <w:p>
+            <w:pPr>
+              <w:spacing w:line="360" w:lineRule="auto"/>
+              <w:jc w:val="both"/>
+              <w:rPr>
+                <w:rFonts w:ascii="Arial" w:hAnsi="Arial" w:cs="Arial"/>
+                <w:b/>
+                <w:bCs/>
+                <w:sz w:val="24"/>
+                <w:szCs w:val="24"/>
+                <w:lang w:val="es-MX"/>
+              </w:rPr>
+            </w:pPr>
+            <w:r>
+              <w:rPr>
+                <w:rFonts w:ascii="Arial" w:hAnsi="Arial" w:cs="Arial"/>
+                <w:sz w:val="24"/>
+                <w:szCs w:val="24"/>
+                <w:lang w:val="es-MX"/>
+              </w:rPr>
+              <w:t>Alto — cualquier estudiante podía ver notas y datos de otro cambiando el identificador en la URL.</w:t>
+            </w:r>
+          </w:p>
+        </w:tc>
+        <w:tc>
+          <w:tcPr>
+            <w:tcW w:w="1418" w:type="dxa"/>
+            <w:vAlign w:val="center"/>
+          </w:tcPr>
+          <w:p>
+            <w:pPr>
+              <w:spacing w:line="360" w:lineRule="auto"/>
+              <w:jc w:val="both"/>
+              <w:rPr>
+                <w:rFonts w:ascii="Arial" w:hAnsi="Arial" w:cs="Arial"/>
+                <w:b/>
+                <w:bCs/>
+                <w:sz w:val="24"/>
+                <w:szCs w:val="24"/>
+                <w:lang w:val="es-MX"/>
+              </w:rPr>
+            </w:pPr>
+            <w:r>
+              <w:rPr>
+                <w:rFonts w:ascii="Arial" w:hAnsi="Arial" w:cs="Arial"/>
+                <w:sz w:val="24"/>
+                <w:szCs w:val="24"/>
+                <w:lang w:val="es-MX"/>
+              </w:rPr>
+              <w:t xml:space="preserve">Se agregó comparación explícita estudiante-propietario en </w:t>
+            </w:r>
+            <w:proofErr w:type="spellStart"/>
+            <w:r>
+              <w:rPr>
+                <w:rFonts w:ascii="Arial" w:hAnsi="Arial" w:cs="Arial"/>
+                <w:sz w:val="24"/>
+                <w:szCs w:val="24"/>
+                <w:lang w:val="es-MX"/>
+              </w:rPr>
+              <w:t>leer_</w:t>
+            </w:r>
+            <w:proofErr w:type="gramStart"/>
+            <w:r>
+              <w:rPr>
+                <w:rFonts w:ascii="Arial" w:hAnsi="Arial" w:cs="Arial"/>
+                <w:sz w:val="24"/>
+                <w:szCs w:val="24"/>
+                <w:lang w:val="es-MX"/>
+              </w:rPr>
+              <w:t>expediente</w:t>
+            </w:r>
+            <w:proofErr w:type="spellEnd"/>
+            <w:r>
+              <w:rPr>
+                <w:rFonts w:ascii="Arial" w:hAnsi="Arial" w:cs="Arial"/>
+                <w:sz w:val="24"/>
+                <w:szCs w:val="24"/>
+                <w:lang w:val="es-MX"/>
+              </w:rPr>
+              <w:t>(</w:t>
+            </w:r>
+            <w:proofErr w:type="gramEnd"/>
+            <w:r>
+              <w:rPr>
+                <w:rFonts w:ascii="Arial" w:hAnsi="Arial" w:cs="Arial"/>
+                <w:sz w:val="24"/>
+                <w:szCs w:val="24"/>
+                <w:lang w:val="es-MX"/>
+              </w:rPr>
+              <w:t>).</w:t>
+            </w:r>
+          </w:p>
+        </w:tc>
+        <w:tc>
+          <w:tcPr>
+            <w:tcW w:w="2409" w:type="dxa"/>
+            <w:vAlign w:val="center"/>
+          </w:tcPr>
+          <w:p>
+            <w:pPr>
+              <w:spacing w:line="360" w:lineRule="auto"/>
+              <w:jc w:val="both"/>
+              <w:rPr>
+                <w:rFonts w:ascii="Arial" w:hAnsi="Arial" w:cs="Arial"/>
+                <w:b/>
+                <w:bCs/>
+                <w:sz w:val="24"/>
+                <w:szCs w:val="24"/>
+                <w:lang w:val="es-MX"/>
+              </w:rPr>
+            </w:pPr>
+            <w:r>
+              <w:rPr>
+                <w:rFonts w:ascii="Arial" w:hAnsi="Arial" w:cs="Arial"/>
+                <w:sz w:val="24"/>
+                <w:szCs w:val="24"/>
+                <w:lang w:val="es-MX"/>
+              </w:rPr>
+              <w:t>evidencias/tc-02-acceso-horizontal-tdd/</w:t>
+            </w:r>
+          </w:p>
+        </w:tc>
+      </w:tr>
+      <w:tr>
+        <w:tc>
+          <w:tcPr>
+            <w:tcW w:w="708" w:type="dxa"/>
+            <w:vAlign w:val="center"/>
+          </w:tcPr>
+          <w:p>
+            <w:pPr>
+              <w:spacing w:line="360" w:lineRule="auto"/>
+              <w:jc w:val="both"/>
+              <w:rPr>
+                <w:rFonts w:ascii="Arial" w:hAnsi="Arial" w:cs="Arial"/>
+                <w:b/>
+                <w:bCs/>
+                <w:sz w:val="24"/>
+                <w:szCs w:val="24"/>
+              </w:rPr>
+            </w:pPr>
+            <w:r>
+              <w:rPr>
+                <w:rFonts w:ascii="Arial" w:hAnsi="Arial" w:cs="Arial"/>
+                <w:sz w:val="24"/>
+                <w:szCs w:val="24"/>
+              </w:rPr>
+              <w:t>H-02</w:t>
+            </w:r>
+          </w:p>
+        </w:tc>
+        <w:tc>
+          <w:tcPr>
+            <w:tcW w:w="1231" w:type="dxa"/>
+            <w:vAlign w:val="center"/>
+          </w:tcPr>
+          <w:p>
+            <w:pPr>
+              <w:spacing w:line="360" w:lineRule="auto"/>
+              <w:jc w:val="both"/>
+              <w:rPr>
+                <w:rFonts w:ascii="Arial" w:hAnsi="Arial" w:cs="Arial"/>
+                <w:b/>
+                <w:bCs/>
+                <w:sz w:val="24"/>
+                <w:szCs w:val="24"/>
+              </w:rPr>
+            </w:pPr>
+            <w:r>
+              <w:rPr>
+                <w:rFonts w:ascii="Arial" w:hAnsi="Arial" w:cs="Arial"/>
+                <w:sz w:val="24"/>
+                <w:szCs w:val="24"/>
+              </w:rPr>
+              <w:t>SEC-03</w:t>
+            </w:r>
+          </w:p>
+        </w:tc>
+        <w:tc>
+          <w:tcPr>
+            <w:tcW w:w="1605" w:type="dxa"/>
+            <w:vAlign w:val="center"/>
+          </w:tcPr>
+          <w:p>
+            <w:pPr>
+              <w:spacing w:line="360" w:lineRule="auto"/>
+              <w:jc w:val="both"/>
+              <w:rPr>
+                <w:rFonts w:ascii="Arial" w:hAnsi="Arial" w:cs="Arial"/>
+                <w:b/>
+                <w:bCs/>
+                <w:sz w:val="24"/>
+                <w:szCs w:val="24"/>
+                <w:lang w:val="es-MX"/>
+              </w:rPr>
+            </w:pPr>
+            <w:r>
+              <w:rPr>
+                <w:rFonts w:ascii="Arial" w:hAnsi="Arial" w:cs="Arial"/>
+                <w:sz w:val="24"/>
+                <w:szCs w:val="24"/>
+                <w:lang w:val="es-MX"/>
+              </w:rPr>
+              <w:t xml:space="preserve">Revocar sesión </w:t>
+            </w:r>
+            <w:proofErr w:type="spellStart"/>
+            <w:r>
+              <w:rPr>
+                <w:rFonts w:ascii="Arial" w:hAnsi="Arial" w:cs="Arial"/>
+                <w:sz w:val="24"/>
+                <w:szCs w:val="24"/>
+                <w:lang w:val="es-MX"/>
+              </w:rPr>
+              <w:t>lab-ana</w:t>
+            </w:r>
+            <w:proofErr w:type="spellEnd"/>
+            <w:r>
+              <w:rPr>
+                <w:rFonts w:ascii="Arial" w:hAnsi="Arial" w:cs="Arial"/>
+                <w:sz w:val="24"/>
+                <w:szCs w:val="24"/>
+                <w:lang w:val="es-MX"/>
+              </w:rPr>
+              <w:t>; luego GET /expedientes</w:t>
+            </w:r>
+            <w:r>
+              <w:rPr>
+                <w:rFonts w:ascii="Arial" w:hAnsi="Arial" w:cs="Arial"/>
+                <w:sz w:val="24"/>
+                <w:szCs w:val="24"/>
+                <w:lang w:val="es-MX"/>
+              </w:rPr>
+              <w:lastRenderedPageBreak/>
+              <w:t>/101 con el mismo token.</w:t>
+            </w:r>
+          </w:p>
+        </w:tc>
+        <w:tc>
+          <w:tcPr>
+            <w:tcW w:w="1276" w:type="dxa"/>
+            <w:vAlign w:val="center"/>
+          </w:tcPr>
+          <w:p>
+            <w:pPr>
+              <w:spacing w:line="360" w:lineRule="auto"/>
+              <w:jc w:val="both"/>
+              <w:rPr>
+                <w:rFonts w:ascii="Arial" w:hAnsi="Arial" w:cs="Arial"/>
+                <w:b/>
+                <w:bCs/>
+                <w:sz w:val="24"/>
+                <w:szCs w:val="24"/>
+              </w:rPr>
+            </w:pPr>
+            <w:r>
+              <w:rPr>
+                <w:rFonts w:ascii="Arial" w:hAnsi="Arial" w:cs="Arial"/>
+                <w:sz w:val="24"/>
+                <w:szCs w:val="24"/>
+              </w:rPr>
+              <w:lastRenderedPageBreak/>
+              <w:t xml:space="preserve">401 </w:t>
+            </w:r>
+            <w:proofErr w:type="spellStart"/>
+            <w:r>
+              <w:rPr>
+                <w:rFonts w:ascii="Arial" w:hAnsi="Arial" w:cs="Arial"/>
+                <w:sz w:val="24"/>
+                <w:szCs w:val="24"/>
+              </w:rPr>
+              <w:t>tras</w:t>
+            </w:r>
+            <w:proofErr w:type="spellEnd"/>
+            <w:r>
+              <w:rPr>
+                <w:rFonts w:ascii="Arial" w:hAnsi="Arial" w:cs="Arial"/>
+                <w:sz w:val="24"/>
+                <w:szCs w:val="24"/>
+              </w:rPr>
+              <w:t xml:space="preserve"> </w:t>
+            </w:r>
+            <w:proofErr w:type="spellStart"/>
+            <w:r>
+              <w:rPr>
+                <w:rFonts w:ascii="Arial" w:hAnsi="Arial" w:cs="Arial"/>
+                <w:sz w:val="24"/>
+                <w:szCs w:val="24"/>
+              </w:rPr>
+              <w:t>revocar</w:t>
+            </w:r>
+            <w:proofErr w:type="spellEnd"/>
+            <w:r>
+              <w:rPr>
+                <w:rFonts w:ascii="Arial" w:hAnsi="Arial" w:cs="Arial"/>
+                <w:sz w:val="24"/>
+                <w:szCs w:val="24"/>
+              </w:rPr>
+              <w:t>.</w:t>
+            </w:r>
+          </w:p>
+        </w:tc>
+        <w:tc>
+          <w:tcPr>
+            <w:tcW w:w="1559" w:type="dxa"/>
+            <w:vAlign w:val="center"/>
+          </w:tcPr>
+          <w:p>
+            <w:pPr>
+              <w:spacing w:line="360" w:lineRule="auto"/>
+              <w:jc w:val="both"/>
+              <w:rPr>
+                <w:rFonts w:ascii="Arial" w:hAnsi="Arial" w:cs="Arial"/>
+                <w:b/>
+                <w:bCs/>
+                <w:sz w:val="24"/>
+                <w:szCs w:val="24"/>
+                <w:lang w:val="es-MX"/>
+              </w:rPr>
+            </w:pPr>
+            <w:r>
+              <w:rPr>
+                <w:rFonts w:ascii="Arial" w:hAnsi="Arial" w:cs="Arial"/>
+                <w:sz w:val="24"/>
+                <w:szCs w:val="24"/>
+                <w:lang w:val="es-MX"/>
+              </w:rPr>
+              <w:t xml:space="preserve">200; la sesión revocada seguía </w:t>
+            </w:r>
+            <w:r>
+              <w:rPr>
+                <w:rFonts w:ascii="Arial" w:hAnsi="Arial" w:cs="Arial"/>
+                <w:sz w:val="24"/>
+                <w:szCs w:val="24"/>
+                <w:lang w:val="es-MX"/>
+              </w:rPr>
+              <w:lastRenderedPageBreak/>
+              <w:t>dando acceso.</w:t>
+            </w:r>
+          </w:p>
+        </w:tc>
+        <w:tc>
+          <w:tcPr>
+            <w:tcW w:w="1134" w:type="dxa"/>
+            <w:vAlign w:val="center"/>
+          </w:tcPr>
+          <w:p>
+            <w:pPr>
+              <w:spacing w:line="360" w:lineRule="auto"/>
+              <w:jc w:val="both"/>
+              <w:rPr>
+                <w:rFonts w:ascii="Arial" w:hAnsi="Arial" w:cs="Arial"/>
+                <w:b/>
+                <w:bCs/>
+                <w:sz w:val="24"/>
+                <w:szCs w:val="24"/>
+                <w:lang w:val="es-MX"/>
+              </w:rPr>
+            </w:pPr>
+            <w:r>
+              <w:rPr>
+                <w:rFonts w:ascii="Arial" w:hAnsi="Arial" w:cs="Arial"/>
+                <w:sz w:val="24"/>
+                <w:szCs w:val="24"/>
+                <w:lang w:val="es-MX"/>
+              </w:rPr>
+              <w:lastRenderedPageBreak/>
+              <w:t xml:space="preserve">Alto — una sesión revocada por </w:t>
+            </w:r>
+            <w:r>
+              <w:rPr>
+                <w:rFonts w:ascii="Arial" w:hAnsi="Arial" w:cs="Arial"/>
+                <w:sz w:val="24"/>
+                <w:szCs w:val="24"/>
+                <w:lang w:val="es-MX"/>
+              </w:rPr>
+              <w:lastRenderedPageBreak/>
+              <w:t>seguridad seguía siendo válida indefinidamente.</w:t>
+            </w:r>
+          </w:p>
+        </w:tc>
+        <w:tc>
+          <w:tcPr>
+            <w:tcW w:w="1418" w:type="dxa"/>
+            <w:vAlign w:val="center"/>
+          </w:tcPr>
+          <w:p>
+            <w:pPr>
+              <w:spacing w:line="360" w:lineRule="auto"/>
+              <w:jc w:val="both"/>
+              <w:rPr>
+                <w:rFonts w:ascii="Arial" w:hAnsi="Arial" w:cs="Arial"/>
+                <w:b/>
+                <w:bCs/>
+                <w:sz w:val="24"/>
+                <w:szCs w:val="24"/>
+                <w:lang w:val="es-MX"/>
+              </w:rPr>
+            </w:pPr>
+            <w:proofErr w:type="gramStart"/>
+            <w:r>
+              <w:rPr>
+                <w:rFonts w:ascii="Arial" w:hAnsi="Arial" w:cs="Arial"/>
+                <w:sz w:val="24"/>
+                <w:szCs w:val="24"/>
+                <w:lang w:val="es-MX"/>
+              </w:rPr>
+              <w:lastRenderedPageBreak/>
+              <w:t>autenticar(</w:t>
+            </w:r>
+            <w:proofErr w:type="gramEnd"/>
+            <w:r>
+              <w:rPr>
+                <w:rFonts w:ascii="Arial" w:hAnsi="Arial" w:cs="Arial"/>
+                <w:sz w:val="24"/>
+                <w:szCs w:val="24"/>
+                <w:lang w:val="es-MX"/>
+              </w:rPr>
+              <w:t xml:space="preserve">) valida explícitamente el estado de </w:t>
+            </w:r>
+            <w:r>
+              <w:rPr>
+                <w:rFonts w:ascii="Arial" w:hAnsi="Arial" w:cs="Arial"/>
+                <w:sz w:val="24"/>
+                <w:szCs w:val="24"/>
+                <w:lang w:val="es-MX"/>
+              </w:rPr>
+              <w:lastRenderedPageBreak/>
+              <w:t>revocación.</w:t>
+            </w:r>
+          </w:p>
+        </w:tc>
+        <w:tc>
+          <w:tcPr>
+            <w:tcW w:w="2409" w:type="dxa"/>
+            <w:vAlign w:val="center"/>
+          </w:tcPr>
+          <w:p>
+            <w:pPr>
+              <w:spacing w:line="360" w:lineRule="auto"/>
+              <w:jc w:val="both"/>
+              <w:rPr>
+                <w:rFonts w:ascii="Arial" w:hAnsi="Arial" w:cs="Arial"/>
+                <w:b/>
+                <w:bCs/>
+                <w:sz w:val="24"/>
+                <w:szCs w:val="24"/>
+                <w:lang w:val="es-MX"/>
+              </w:rPr>
+            </w:pPr>
+            <w:r>
+              <w:rPr>
+                <w:rFonts w:ascii="Arial" w:hAnsi="Arial" w:cs="Arial"/>
+                <w:sz w:val="24"/>
+                <w:szCs w:val="24"/>
+                <w:lang w:val="es-MX"/>
+              </w:rPr>
+              <w:lastRenderedPageBreak/>
+              <w:t>evidencias/tc-04-sesion-revocada-tdd/, manual-api-postman/03-04</w:t>
+            </w:r>
+          </w:p>
+        </w:tc>
+      </w:tr>
+      <w:tr>
+        <w:tc>
+          <w:tcPr>
+            <w:tcW w:w="708" w:type="dxa"/>
+            <w:vAlign w:val="center"/>
+          </w:tcPr>
+          <w:p>
+            <w:pPr>
+              <w:spacing w:line="360" w:lineRule="auto"/>
+              <w:jc w:val="both"/>
+              <w:rPr>
+                <w:rFonts w:ascii="Arial" w:hAnsi="Arial" w:cs="Arial"/>
+                <w:b/>
+                <w:bCs/>
+                <w:sz w:val="24"/>
+                <w:szCs w:val="24"/>
+              </w:rPr>
+            </w:pPr>
+            <w:r>
+              <w:rPr>
+                <w:rFonts w:ascii="Arial" w:hAnsi="Arial" w:cs="Arial"/>
+                <w:sz w:val="24"/>
+                <w:szCs w:val="24"/>
+              </w:rPr>
+              <w:t>H-03</w:t>
+            </w:r>
+          </w:p>
+        </w:tc>
+        <w:tc>
+          <w:tcPr>
+            <w:tcW w:w="1231" w:type="dxa"/>
+            <w:vAlign w:val="center"/>
+          </w:tcPr>
+          <w:p>
+            <w:pPr>
+              <w:spacing w:line="360" w:lineRule="auto"/>
+              <w:jc w:val="both"/>
+              <w:rPr>
+                <w:rFonts w:ascii="Arial" w:hAnsi="Arial" w:cs="Arial"/>
+                <w:b/>
+                <w:bCs/>
+                <w:sz w:val="24"/>
+                <w:szCs w:val="24"/>
+              </w:rPr>
+            </w:pPr>
+            <w:r>
+              <w:rPr>
+                <w:rFonts w:ascii="Arial" w:hAnsi="Arial" w:cs="Arial"/>
+                <w:sz w:val="24"/>
+                <w:szCs w:val="24"/>
+              </w:rPr>
+              <w:t>SEC-02</w:t>
+            </w:r>
+          </w:p>
+        </w:tc>
+        <w:tc>
+          <w:tcPr>
+            <w:tcW w:w="1605" w:type="dxa"/>
+            <w:vAlign w:val="center"/>
+          </w:tcPr>
+          <w:p>
+            <w:pPr>
+              <w:spacing w:line="360" w:lineRule="auto"/>
+              <w:jc w:val="both"/>
+              <w:rPr>
+                <w:rFonts w:ascii="Arial" w:hAnsi="Arial" w:cs="Arial"/>
+                <w:b/>
+                <w:bCs/>
+                <w:sz w:val="24"/>
+                <w:szCs w:val="24"/>
+                <w:lang w:val="es-MX"/>
+              </w:rPr>
+            </w:pPr>
+            <w:r>
+              <w:rPr>
+                <w:rFonts w:ascii="Arial" w:hAnsi="Arial" w:cs="Arial"/>
+                <w:sz w:val="24"/>
+                <w:szCs w:val="24"/>
+                <w:lang w:val="es-MX"/>
+              </w:rPr>
+              <w:t xml:space="preserve">POST /expedientes/202/nota {“nota”:85} con Bearer </w:t>
+            </w:r>
+            <w:proofErr w:type="spellStart"/>
+            <w:r>
+              <w:rPr>
+                <w:rFonts w:ascii="Arial" w:hAnsi="Arial" w:cs="Arial"/>
+                <w:sz w:val="24"/>
+                <w:szCs w:val="24"/>
+                <w:lang w:val="es-MX"/>
+              </w:rPr>
+              <w:t>lab-maria</w:t>
+            </w:r>
+            <w:proofErr w:type="spellEnd"/>
+            <w:r>
+              <w:rPr>
+                <w:rFonts w:ascii="Arial" w:hAnsi="Arial" w:cs="Arial"/>
+                <w:sz w:val="24"/>
+                <w:szCs w:val="24"/>
+                <w:lang w:val="es-MX"/>
+              </w:rPr>
+              <w:t xml:space="preserve"> (docente de Central) sobre expediente de Pacífico.</w:t>
+            </w:r>
+          </w:p>
+        </w:tc>
+        <w:tc>
+          <w:tcPr>
+            <w:tcW w:w="1276" w:type="dxa"/>
+            <w:vAlign w:val="center"/>
+          </w:tcPr>
+          <w:p>
+            <w:pPr>
+              <w:spacing w:line="360" w:lineRule="auto"/>
+              <w:jc w:val="both"/>
+              <w:rPr>
+                <w:rFonts w:ascii="Arial" w:hAnsi="Arial" w:cs="Arial"/>
+                <w:b/>
+                <w:bCs/>
+                <w:sz w:val="24"/>
+                <w:szCs w:val="24"/>
+              </w:rPr>
+            </w:pPr>
+            <w:r>
+              <w:rPr>
+                <w:rFonts w:ascii="Arial" w:hAnsi="Arial" w:cs="Arial"/>
+                <w:sz w:val="24"/>
+                <w:szCs w:val="24"/>
+              </w:rPr>
+              <w:t xml:space="preserve">403, nota se </w:t>
+            </w:r>
+            <w:proofErr w:type="spellStart"/>
+            <w:r>
+              <w:rPr>
+                <w:rFonts w:ascii="Arial" w:hAnsi="Arial" w:cs="Arial"/>
+                <w:sz w:val="24"/>
+                <w:szCs w:val="24"/>
+              </w:rPr>
+              <w:t>mantiene</w:t>
+            </w:r>
+            <w:proofErr w:type="spellEnd"/>
+            <w:r>
+              <w:rPr>
+                <w:rFonts w:ascii="Arial" w:hAnsi="Arial" w:cs="Arial"/>
+                <w:sz w:val="24"/>
+                <w:szCs w:val="24"/>
+              </w:rPr>
+              <w:t xml:space="preserve"> </w:t>
+            </w:r>
+            <w:proofErr w:type="spellStart"/>
+            <w:r>
+              <w:rPr>
+                <w:rFonts w:ascii="Arial" w:hAnsi="Arial" w:cs="Arial"/>
+                <w:sz w:val="24"/>
+                <w:szCs w:val="24"/>
+              </w:rPr>
+              <w:t>en</w:t>
+            </w:r>
+            <w:proofErr w:type="spellEnd"/>
+            <w:r>
+              <w:rPr>
+                <w:rFonts w:ascii="Arial" w:hAnsi="Arial" w:cs="Arial"/>
+                <w:sz w:val="24"/>
+                <w:szCs w:val="24"/>
+              </w:rPr>
+              <w:t xml:space="preserve"> 91.</w:t>
+            </w:r>
+          </w:p>
+        </w:tc>
+        <w:tc>
+          <w:tcPr>
+            <w:tcW w:w="1559" w:type="dxa"/>
+            <w:vAlign w:val="center"/>
+          </w:tcPr>
+          <w:p>
+            <w:pPr>
+              <w:spacing w:line="360" w:lineRule="auto"/>
+              <w:jc w:val="both"/>
+              <w:rPr>
+                <w:rFonts w:ascii="Arial" w:hAnsi="Arial" w:cs="Arial"/>
+                <w:b/>
+                <w:bCs/>
+                <w:sz w:val="24"/>
+                <w:szCs w:val="24"/>
+                <w:lang w:val="es-MX"/>
+              </w:rPr>
+            </w:pPr>
+            <w:r>
+              <w:rPr>
+                <w:rFonts w:ascii="Arial" w:hAnsi="Arial" w:cs="Arial"/>
+                <w:sz w:val="24"/>
+                <w:szCs w:val="24"/>
+                <w:lang w:val="es-MX"/>
+              </w:rPr>
+              <w:t>200; la nota se modificó indebidamente.</w:t>
+            </w:r>
+          </w:p>
+        </w:tc>
+        <w:tc>
+          <w:tcPr>
+            <w:tcW w:w="1134" w:type="dxa"/>
+            <w:vAlign w:val="center"/>
+          </w:tcPr>
+          <w:p>
+            <w:pPr>
+              <w:spacing w:line="360" w:lineRule="auto"/>
+              <w:jc w:val="both"/>
+              <w:rPr>
+                <w:rFonts w:ascii="Arial" w:hAnsi="Arial" w:cs="Arial"/>
+                <w:b/>
+                <w:bCs/>
+                <w:sz w:val="24"/>
+                <w:szCs w:val="24"/>
+                <w:lang w:val="es-MX"/>
+              </w:rPr>
+            </w:pPr>
+            <w:r>
+              <w:rPr>
+                <w:rFonts w:ascii="Arial" w:hAnsi="Arial" w:cs="Arial"/>
+                <w:sz w:val="24"/>
+                <w:szCs w:val="24"/>
+                <w:lang w:val="es-MX"/>
+              </w:rPr>
+              <w:t>Alto — un docente podía alterar calificaciones de estudiantes de otra sede.</w:t>
+            </w:r>
+          </w:p>
+        </w:tc>
+        <w:tc>
+          <w:tcPr>
+            <w:tcW w:w="1418" w:type="dxa"/>
+            <w:vAlign w:val="center"/>
+          </w:tcPr>
+          <w:p>
+            <w:pPr>
+              <w:spacing w:line="360" w:lineRule="auto"/>
+              <w:jc w:val="both"/>
+              <w:rPr>
+                <w:rFonts w:ascii="Arial" w:hAnsi="Arial" w:cs="Arial"/>
+                <w:b/>
+                <w:bCs/>
+                <w:sz w:val="24"/>
+                <w:szCs w:val="24"/>
+                <w:lang w:val="es-MX"/>
+              </w:rPr>
+            </w:pPr>
+            <w:proofErr w:type="spellStart"/>
+            <w:r>
+              <w:rPr>
+                <w:rFonts w:ascii="Arial" w:hAnsi="Arial" w:cs="Arial"/>
+                <w:sz w:val="24"/>
+                <w:szCs w:val="24"/>
+                <w:lang w:val="es-MX"/>
+              </w:rPr>
+              <w:t>actualizar_</w:t>
+            </w:r>
+            <w:proofErr w:type="gramStart"/>
+            <w:r>
+              <w:rPr>
+                <w:rFonts w:ascii="Arial" w:hAnsi="Arial" w:cs="Arial"/>
+                <w:sz w:val="24"/>
+                <w:szCs w:val="24"/>
+                <w:lang w:val="es-MX"/>
+              </w:rPr>
+              <w:t>nota</w:t>
+            </w:r>
+            <w:proofErr w:type="spellEnd"/>
+            <w:r>
+              <w:rPr>
+                <w:rFonts w:ascii="Arial" w:hAnsi="Arial" w:cs="Arial"/>
+                <w:sz w:val="24"/>
+                <w:szCs w:val="24"/>
+                <w:lang w:val="es-MX"/>
+              </w:rPr>
+              <w:t>(</w:t>
+            </w:r>
+            <w:proofErr w:type="gramEnd"/>
+            <w:r>
+              <w:rPr>
+                <w:rFonts w:ascii="Arial" w:hAnsi="Arial" w:cs="Arial"/>
+                <w:sz w:val="24"/>
+                <w:szCs w:val="24"/>
+                <w:lang w:val="es-MX"/>
+              </w:rPr>
+              <w:t>) compara la sede del docente contra la del expediente.</w:t>
+            </w:r>
+          </w:p>
+        </w:tc>
+        <w:tc>
+          <w:tcPr>
+            <w:tcW w:w="2409" w:type="dxa"/>
+            <w:vAlign w:val="center"/>
+          </w:tcPr>
+          <w:p>
+            <w:pPr>
+              <w:spacing w:line="360" w:lineRule="auto"/>
+              <w:jc w:val="both"/>
+              <w:rPr>
+                <w:rFonts w:ascii="Arial" w:hAnsi="Arial" w:cs="Arial"/>
+                <w:b/>
+                <w:bCs/>
+                <w:sz w:val="24"/>
+                <w:szCs w:val="24"/>
+                <w:lang w:val="es-MX"/>
+              </w:rPr>
+            </w:pPr>
+            <w:r>
+              <w:rPr>
+                <w:rFonts w:ascii="Arial" w:hAnsi="Arial" w:cs="Arial"/>
+                <w:sz w:val="24"/>
+                <w:szCs w:val="24"/>
+                <w:lang w:val="es-MX"/>
+              </w:rPr>
+              <w:t>evidencias/tc-03-modificacion-entre-sedes-tdd/, manual-api-postman/01</w:t>
+            </w:r>
+          </w:p>
+        </w:tc>
+      </w:tr>
+      <w:tr>
+        <w:tc>
+          <w:tcPr>
+            <w:tcW w:w="708" w:type="dxa"/>
+            <w:vAlign w:val="center"/>
+          </w:tcPr>
+          <w:p>
+            <w:pPr>
+              <w:spacing w:line="360" w:lineRule="auto"/>
+              <w:jc w:val="both"/>
+              <w:rPr>
+                <w:rFonts w:ascii="Arial" w:hAnsi="Arial" w:cs="Arial"/>
+                <w:b/>
+                <w:bCs/>
+                <w:sz w:val="24"/>
+                <w:szCs w:val="24"/>
+              </w:rPr>
+            </w:pPr>
+            <w:r>
+              <w:rPr>
+                <w:rFonts w:ascii="Arial" w:hAnsi="Arial" w:cs="Arial"/>
+                <w:sz w:val="24"/>
+                <w:szCs w:val="24"/>
+              </w:rPr>
+              <w:t>H-04</w:t>
+            </w:r>
+          </w:p>
+        </w:tc>
+        <w:tc>
+          <w:tcPr>
+            <w:tcW w:w="1231" w:type="dxa"/>
+            <w:vAlign w:val="center"/>
+          </w:tcPr>
+          <w:p>
+            <w:pPr>
+              <w:spacing w:line="360" w:lineRule="auto"/>
+              <w:jc w:val="both"/>
+              <w:rPr>
+                <w:rFonts w:ascii="Arial" w:hAnsi="Arial" w:cs="Arial"/>
+                <w:b/>
+                <w:bCs/>
+                <w:sz w:val="24"/>
+                <w:szCs w:val="24"/>
+              </w:rPr>
+            </w:pPr>
+            <w:r>
+              <w:rPr>
+                <w:rFonts w:ascii="Arial" w:hAnsi="Arial" w:cs="Arial"/>
+                <w:sz w:val="24"/>
+                <w:szCs w:val="24"/>
+              </w:rPr>
+              <w:t>SEC-04</w:t>
+            </w:r>
+          </w:p>
+        </w:tc>
+        <w:tc>
+          <w:tcPr>
+            <w:tcW w:w="1605" w:type="dxa"/>
+            <w:vAlign w:val="center"/>
+          </w:tcPr>
+          <w:p>
+            <w:pPr>
+              <w:spacing w:line="360" w:lineRule="auto"/>
+              <w:jc w:val="both"/>
+              <w:rPr>
+                <w:rFonts w:ascii="Arial" w:hAnsi="Arial" w:cs="Arial"/>
+                <w:b/>
+                <w:bCs/>
+                <w:sz w:val="24"/>
+                <w:szCs w:val="24"/>
+                <w:lang w:val="es-MX"/>
+              </w:rPr>
+            </w:pPr>
+            <w:r>
+              <w:rPr>
+                <w:rFonts w:ascii="Arial" w:hAnsi="Arial" w:cs="Arial"/>
+                <w:sz w:val="24"/>
+                <w:szCs w:val="24"/>
+                <w:lang w:val="es-MX"/>
+              </w:rPr>
+              <w:t>POST /expedientes/101/nota {“nota</w:t>
+            </w:r>
+            <w:proofErr w:type="gramStart"/>
+            <w:r>
+              <w:rPr>
+                <w:rFonts w:ascii="Arial" w:hAnsi="Arial" w:cs="Arial"/>
+                <w:sz w:val="24"/>
+                <w:szCs w:val="24"/>
+                <w:lang w:val="es-MX"/>
+              </w:rPr>
+              <w:t>”:-</w:t>
+            </w:r>
+            <w:proofErr w:type="gramEnd"/>
+            <w:r>
+              <w:rPr>
+                <w:rFonts w:ascii="Arial" w:hAnsi="Arial" w:cs="Arial"/>
+                <w:sz w:val="24"/>
+                <w:szCs w:val="24"/>
+                <w:lang w:val="es-MX"/>
+              </w:rPr>
+              <w:t xml:space="preserve">1} con Bearer </w:t>
+            </w:r>
+            <w:proofErr w:type="spellStart"/>
+            <w:r>
+              <w:rPr>
+                <w:rFonts w:ascii="Arial" w:hAnsi="Arial" w:cs="Arial"/>
+                <w:sz w:val="24"/>
+                <w:szCs w:val="24"/>
+                <w:lang w:val="es-MX"/>
+              </w:rPr>
+              <w:t>lab-maria</w:t>
+            </w:r>
+            <w:proofErr w:type="spellEnd"/>
+            <w:r>
+              <w:rPr>
+                <w:rFonts w:ascii="Arial" w:hAnsi="Arial" w:cs="Arial"/>
+                <w:sz w:val="24"/>
+                <w:szCs w:val="24"/>
+                <w:lang w:val="es-MX"/>
+              </w:rPr>
+              <w:t>.</w:t>
+            </w:r>
+          </w:p>
+        </w:tc>
+        <w:tc>
+          <w:tcPr>
+            <w:tcW w:w="1276" w:type="dxa"/>
+            <w:vAlign w:val="center"/>
+          </w:tcPr>
+          <w:p>
+            <w:pPr>
+              <w:spacing w:line="360" w:lineRule="auto"/>
+              <w:jc w:val="both"/>
+              <w:rPr>
+                <w:rFonts w:ascii="Arial" w:hAnsi="Arial" w:cs="Arial"/>
+                <w:b/>
+                <w:bCs/>
+                <w:sz w:val="24"/>
+                <w:szCs w:val="24"/>
+              </w:rPr>
+            </w:pPr>
+            <w:r>
+              <w:rPr>
+                <w:rFonts w:ascii="Arial" w:hAnsi="Arial" w:cs="Arial"/>
+                <w:sz w:val="24"/>
+                <w:szCs w:val="24"/>
+              </w:rPr>
+              <w:t xml:space="preserve">400, nota se </w:t>
+            </w:r>
+            <w:proofErr w:type="spellStart"/>
+            <w:r>
+              <w:rPr>
+                <w:rFonts w:ascii="Arial" w:hAnsi="Arial" w:cs="Arial"/>
+                <w:sz w:val="24"/>
+                <w:szCs w:val="24"/>
+              </w:rPr>
+              <w:t>mantiene</w:t>
+            </w:r>
+            <w:proofErr w:type="spellEnd"/>
+            <w:r>
+              <w:rPr>
+                <w:rFonts w:ascii="Arial" w:hAnsi="Arial" w:cs="Arial"/>
+                <w:sz w:val="24"/>
+                <w:szCs w:val="24"/>
+              </w:rPr>
+              <w:t xml:space="preserve"> </w:t>
+            </w:r>
+            <w:proofErr w:type="spellStart"/>
+            <w:r>
+              <w:rPr>
+                <w:rFonts w:ascii="Arial" w:hAnsi="Arial" w:cs="Arial"/>
+                <w:sz w:val="24"/>
+                <w:szCs w:val="24"/>
+              </w:rPr>
+              <w:t>en</w:t>
+            </w:r>
+            <w:proofErr w:type="spellEnd"/>
+            <w:r>
+              <w:rPr>
+                <w:rFonts w:ascii="Arial" w:hAnsi="Arial" w:cs="Arial"/>
+                <w:sz w:val="24"/>
+                <w:szCs w:val="24"/>
+              </w:rPr>
+              <w:t xml:space="preserve"> 82.</w:t>
+            </w:r>
+          </w:p>
+        </w:tc>
+        <w:tc>
+          <w:tcPr>
+            <w:tcW w:w="1559" w:type="dxa"/>
+            <w:vAlign w:val="center"/>
+          </w:tcPr>
+          <w:p>
+            <w:pPr>
+              <w:spacing w:line="360" w:lineRule="auto"/>
+              <w:jc w:val="both"/>
+              <w:rPr>
+                <w:rFonts w:ascii="Arial" w:hAnsi="Arial" w:cs="Arial"/>
+                <w:b/>
+                <w:bCs/>
+                <w:sz w:val="24"/>
+                <w:szCs w:val="24"/>
+                <w:lang w:val="es-MX"/>
+              </w:rPr>
+            </w:pPr>
+            <w:r>
+              <w:rPr>
+                <w:rFonts w:ascii="Arial" w:hAnsi="Arial" w:cs="Arial"/>
+                <w:sz w:val="24"/>
+                <w:szCs w:val="24"/>
+                <w:lang w:val="es-MX"/>
+              </w:rPr>
+              <w:t>200; se aceptó el valor fuera de rango.</w:t>
+            </w:r>
+          </w:p>
+        </w:tc>
+        <w:tc>
+          <w:tcPr>
+            <w:tcW w:w="1134" w:type="dxa"/>
+            <w:vAlign w:val="center"/>
+          </w:tcPr>
+          <w:p>
+            <w:pPr>
+              <w:spacing w:line="360" w:lineRule="auto"/>
+              <w:jc w:val="both"/>
+              <w:rPr>
+                <w:rFonts w:ascii="Arial" w:hAnsi="Arial" w:cs="Arial"/>
+                <w:b/>
+                <w:bCs/>
+                <w:sz w:val="24"/>
+                <w:szCs w:val="24"/>
+                <w:lang w:val="es-MX"/>
+              </w:rPr>
+            </w:pPr>
+            <w:r>
+              <w:rPr>
+                <w:rFonts w:ascii="Arial" w:hAnsi="Arial" w:cs="Arial"/>
+                <w:sz w:val="24"/>
+                <w:szCs w:val="24"/>
+                <w:lang w:val="es-MX"/>
+              </w:rPr>
+              <w:t>Medio — datos académicos inválidos podían persistirse.</w:t>
+            </w:r>
+          </w:p>
+        </w:tc>
+        <w:tc>
+          <w:tcPr>
+            <w:tcW w:w="1418" w:type="dxa"/>
+            <w:vAlign w:val="center"/>
+          </w:tcPr>
+          <w:p>
+            <w:pPr>
+              <w:spacing w:line="360" w:lineRule="auto"/>
+              <w:jc w:val="both"/>
+              <w:rPr>
+                <w:rFonts w:ascii="Arial" w:hAnsi="Arial" w:cs="Arial"/>
+                <w:b/>
+                <w:bCs/>
+                <w:sz w:val="24"/>
+                <w:szCs w:val="24"/>
+                <w:lang w:val="es-MX"/>
+              </w:rPr>
+            </w:pPr>
+            <w:proofErr w:type="spellStart"/>
+            <w:r>
+              <w:rPr>
+                <w:rFonts w:ascii="Arial" w:hAnsi="Arial" w:cs="Arial"/>
+                <w:sz w:val="24"/>
+                <w:szCs w:val="24"/>
+                <w:lang w:val="es-MX"/>
+              </w:rPr>
+              <w:t>actualizar_</w:t>
+            </w:r>
+            <w:proofErr w:type="gramStart"/>
+            <w:r>
+              <w:rPr>
+                <w:rFonts w:ascii="Arial" w:hAnsi="Arial" w:cs="Arial"/>
+                <w:sz w:val="24"/>
+                <w:szCs w:val="24"/>
+                <w:lang w:val="es-MX"/>
+              </w:rPr>
+              <w:t>nota</w:t>
+            </w:r>
+            <w:proofErr w:type="spellEnd"/>
+            <w:r>
+              <w:rPr>
+                <w:rFonts w:ascii="Arial" w:hAnsi="Arial" w:cs="Arial"/>
+                <w:sz w:val="24"/>
+                <w:szCs w:val="24"/>
+                <w:lang w:val="es-MX"/>
+              </w:rPr>
+              <w:t>(</w:t>
+            </w:r>
+            <w:proofErr w:type="gramEnd"/>
+            <w:r>
+              <w:rPr>
+                <w:rFonts w:ascii="Arial" w:hAnsi="Arial" w:cs="Arial"/>
+                <w:sz w:val="24"/>
+                <w:szCs w:val="24"/>
+                <w:lang w:val="es-MX"/>
+              </w:rPr>
+              <w:t>) valida tipo y rango 0-100.</w:t>
+            </w:r>
+          </w:p>
+        </w:tc>
+        <w:tc>
+          <w:tcPr>
+            <w:tcW w:w="2409" w:type="dxa"/>
+            <w:vAlign w:val="center"/>
+          </w:tcPr>
+          <w:p>
+            <w:pPr>
+              <w:spacing w:line="360" w:lineRule="auto"/>
+              <w:jc w:val="both"/>
+              <w:rPr>
+                <w:rFonts w:ascii="Arial" w:hAnsi="Arial" w:cs="Arial"/>
+                <w:b/>
+                <w:bCs/>
+                <w:sz w:val="24"/>
+                <w:szCs w:val="24"/>
+                <w:lang w:val="es-MX"/>
+              </w:rPr>
+            </w:pPr>
+            <w:r>
+              <w:rPr>
+                <w:rFonts w:ascii="Arial" w:hAnsi="Arial" w:cs="Arial"/>
+                <w:sz w:val="24"/>
+                <w:szCs w:val="24"/>
+                <w:lang w:val="es-MX"/>
+              </w:rPr>
+              <w:t>evidencias/tc-05-nota-fuera-rango/, manual-api-postman/02</w:t>
+            </w:r>
+          </w:p>
+        </w:tc>
+      </w:tr>
+      <w:tr>
+        <w:tc>
+          <w:tcPr>
+            <w:tcW w:w="708" w:type="dxa"/>
+            <w:vAlign w:val="center"/>
+          </w:tcPr>
+          <w:p>
+            <w:pPr>
+              <w:spacing w:line="360" w:lineRule="auto"/>
+              <w:jc w:val="both"/>
+              <w:rPr>
+                <w:rFonts w:ascii="Arial" w:hAnsi="Arial" w:cs="Arial"/>
+                <w:b/>
+                <w:bCs/>
+                <w:sz w:val="24"/>
+                <w:szCs w:val="24"/>
+              </w:rPr>
+            </w:pPr>
+            <w:r>
+              <w:rPr>
+                <w:rFonts w:ascii="Arial" w:hAnsi="Arial" w:cs="Arial"/>
+                <w:sz w:val="24"/>
+                <w:szCs w:val="24"/>
+              </w:rPr>
+              <w:t>H-05</w:t>
+            </w:r>
+          </w:p>
+        </w:tc>
+        <w:tc>
+          <w:tcPr>
+            <w:tcW w:w="1231" w:type="dxa"/>
+            <w:vAlign w:val="center"/>
+          </w:tcPr>
+          <w:p>
+            <w:pPr>
+              <w:spacing w:line="360" w:lineRule="auto"/>
+              <w:jc w:val="both"/>
+              <w:rPr>
+                <w:rFonts w:ascii="Arial" w:hAnsi="Arial" w:cs="Arial"/>
+                <w:b/>
+                <w:bCs/>
+                <w:sz w:val="24"/>
+                <w:szCs w:val="24"/>
+              </w:rPr>
+            </w:pPr>
+            <w:r>
+              <w:rPr>
+                <w:rFonts w:ascii="Arial" w:hAnsi="Arial" w:cs="Arial"/>
+                <w:sz w:val="24"/>
+                <w:szCs w:val="24"/>
+              </w:rPr>
+              <w:t>SEC-06</w:t>
+            </w:r>
+          </w:p>
+        </w:tc>
+        <w:tc>
+          <w:tcPr>
+            <w:tcW w:w="1605" w:type="dxa"/>
+            <w:vAlign w:val="center"/>
+          </w:tcPr>
+          <w:p>
+            <w:pPr>
+              <w:spacing w:line="360" w:lineRule="auto"/>
+              <w:jc w:val="both"/>
+              <w:rPr>
+                <w:rFonts w:ascii="Arial" w:hAnsi="Arial" w:cs="Arial"/>
+                <w:b/>
+                <w:bCs/>
+                <w:sz w:val="24"/>
+                <w:szCs w:val="24"/>
+                <w:lang w:val="es-MX"/>
+              </w:rPr>
+            </w:pPr>
+            <w:r>
+              <w:rPr>
+                <w:rFonts w:ascii="Arial" w:hAnsi="Arial" w:cs="Arial"/>
+                <w:sz w:val="24"/>
+                <w:szCs w:val="24"/>
+                <w:lang w:val="es-MX"/>
+              </w:rPr>
+              <w:t xml:space="preserve">Leer expediente 101 (acción autorizada); inspeccionar </w:t>
+            </w:r>
+            <w:r>
+              <w:rPr>
+                <w:rFonts w:ascii="Arial" w:hAnsi="Arial" w:cs="Arial"/>
+                <w:sz w:val="24"/>
+                <w:szCs w:val="24"/>
+                <w:lang w:val="es-MX"/>
+              </w:rPr>
+              <w:lastRenderedPageBreak/>
+              <w:t>la última entrada de la bitácora.</w:t>
+            </w:r>
+          </w:p>
+        </w:tc>
+        <w:tc>
+          <w:tcPr>
+            <w:tcW w:w="1276" w:type="dxa"/>
+            <w:vAlign w:val="center"/>
+          </w:tcPr>
+          <w:p>
+            <w:pPr>
+              <w:spacing w:line="360" w:lineRule="auto"/>
+              <w:jc w:val="both"/>
+              <w:rPr>
+                <w:rFonts w:ascii="Arial" w:hAnsi="Arial" w:cs="Arial"/>
+                <w:b/>
+                <w:bCs/>
+                <w:sz w:val="24"/>
+                <w:szCs w:val="24"/>
+                <w:lang w:val="es-MX"/>
+              </w:rPr>
+            </w:pPr>
+            <w:r>
+              <w:rPr>
+                <w:rFonts w:ascii="Arial" w:hAnsi="Arial" w:cs="Arial"/>
+                <w:sz w:val="24"/>
+                <w:szCs w:val="24"/>
+                <w:lang w:val="es-MX"/>
+              </w:rPr>
+              <w:lastRenderedPageBreak/>
+              <w:t xml:space="preserve">Entrada con actor y </w:t>
+            </w:r>
+            <w:proofErr w:type="spellStart"/>
+            <w:r>
+              <w:rPr>
+                <w:rFonts w:ascii="Arial" w:hAnsi="Arial" w:cs="Arial"/>
+                <w:sz w:val="24"/>
+                <w:szCs w:val="24"/>
+                <w:lang w:val="es-MX"/>
+              </w:rPr>
+              <w:t>timestam</w:t>
+            </w:r>
+            <w:r>
+              <w:rPr>
+                <w:rFonts w:ascii="Arial" w:hAnsi="Arial" w:cs="Arial"/>
+                <w:sz w:val="24"/>
+                <w:szCs w:val="24"/>
+                <w:lang w:val="es-MX"/>
+              </w:rPr>
+              <w:lastRenderedPageBreak/>
+              <w:t>p</w:t>
+            </w:r>
+            <w:proofErr w:type="spellEnd"/>
+            <w:r>
+              <w:rPr>
+                <w:rFonts w:ascii="Arial" w:hAnsi="Arial" w:cs="Arial"/>
+                <w:sz w:val="24"/>
+                <w:szCs w:val="24"/>
+                <w:lang w:val="es-MX"/>
+              </w:rPr>
+              <w:t>, sin token.</w:t>
+            </w:r>
+          </w:p>
+        </w:tc>
+        <w:tc>
+          <w:tcPr>
+            <w:tcW w:w="1559" w:type="dxa"/>
+            <w:vAlign w:val="center"/>
+          </w:tcPr>
+          <w:p>
+            <w:pPr>
+              <w:spacing w:line="360" w:lineRule="auto"/>
+              <w:jc w:val="both"/>
+              <w:rPr>
+                <w:rFonts w:ascii="Arial" w:hAnsi="Arial" w:cs="Arial"/>
+                <w:b/>
+                <w:bCs/>
+                <w:sz w:val="24"/>
+                <w:szCs w:val="24"/>
+                <w:lang w:val="es-MX"/>
+              </w:rPr>
+            </w:pPr>
+            <w:r>
+              <w:rPr>
+                <w:rFonts w:ascii="Arial" w:hAnsi="Arial" w:cs="Arial"/>
+                <w:sz w:val="24"/>
+                <w:szCs w:val="24"/>
+                <w:lang w:val="es-MX"/>
+              </w:rPr>
+              <w:lastRenderedPageBreak/>
+              <w:t xml:space="preserve">Error al faltar el actor; además el token se </w:t>
+            </w:r>
+            <w:r>
+              <w:rPr>
+                <w:rFonts w:ascii="Arial" w:hAnsi="Arial" w:cs="Arial"/>
+                <w:sz w:val="24"/>
+                <w:szCs w:val="24"/>
+                <w:lang w:val="es-MX"/>
+              </w:rPr>
+              <w:lastRenderedPageBreak/>
+              <w:t>guardaba en texto claro.</w:t>
+            </w:r>
+          </w:p>
+        </w:tc>
+        <w:tc>
+          <w:tcPr>
+            <w:tcW w:w="1134" w:type="dxa"/>
+            <w:vAlign w:val="center"/>
+          </w:tcPr>
+          <w:p>
+            <w:pPr>
+              <w:spacing w:line="360" w:lineRule="auto"/>
+              <w:jc w:val="both"/>
+              <w:rPr>
+                <w:rFonts w:ascii="Arial" w:hAnsi="Arial" w:cs="Arial"/>
+                <w:b/>
+                <w:bCs/>
+                <w:sz w:val="24"/>
+                <w:szCs w:val="24"/>
+                <w:lang w:val="es-MX"/>
+              </w:rPr>
+            </w:pPr>
+            <w:r>
+              <w:rPr>
+                <w:rFonts w:ascii="Arial" w:hAnsi="Arial" w:cs="Arial"/>
+                <w:sz w:val="24"/>
+                <w:szCs w:val="24"/>
+                <w:lang w:val="es-MX"/>
+              </w:rPr>
+              <w:lastRenderedPageBreak/>
+              <w:t xml:space="preserve">Alto — exposición de credenciales de </w:t>
+            </w:r>
+            <w:r>
+              <w:rPr>
+                <w:rFonts w:ascii="Arial" w:hAnsi="Arial" w:cs="Arial"/>
+                <w:sz w:val="24"/>
+                <w:szCs w:val="24"/>
+                <w:lang w:val="es-MX"/>
+              </w:rPr>
+              <w:lastRenderedPageBreak/>
+              <w:t>sesión en los logs, riesgo de secuestro de sesión.</w:t>
+            </w:r>
+          </w:p>
+        </w:tc>
+        <w:tc>
+          <w:tcPr>
+            <w:tcW w:w="1418" w:type="dxa"/>
+            <w:vAlign w:val="center"/>
+          </w:tcPr>
+          <w:p>
+            <w:pPr>
+              <w:spacing w:line="360" w:lineRule="auto"/>
+              <w:jc w:val="both"/>
+              <w:rPr>
+                <w:rFonts w:ascii="Arial" w:hAnsi="Arial" w:cs="Arial"/>
+                <w:b/>
+                <w:bCs/>
+                <w:sz w:val="24"/>
+                <w:szCs w:val="24"/>
+                <w:lang w:val="es-MX"/>
+              </w:rPr>
+            </w:pPr>
+            <w:proofErr w:type="spellStart"/>
+            <w:r>
+              <w:rPr>
+                <w:rFonts w:ascii="Arial" w:hAnsi="Arial" w:cs="Arial"/>
+                <w:sz w:val="24"/>
+                <w:szCs w:val="24"/>
+                <w:lang w:val="es-MX"/>
+              </w:rPr>
+              <w:lastRenderedPageBreak/>
+              <w:t>registrar_</w:t>
+            </w:r>
+            <w:proofErr w:type="gramStart"/>
+            <w:r>
+              <w:rPr>
+                <w:rFonts w:ascii="Arial" w:hAnsi="Arial" w:cs="Arial"/>
+                <w:sz w:val="24"/>
+                <w:szCs w:val="24"/>
+                <w:lang w:val="es-MX"/>
+              </w:rPr>
+              <w:t>auditoria</w:t>
+            </w:r>
+            <w:proofErr w:type="spellEnd"/>
+            <w:r>
+              <w:rPr>
+                <w:rFonts w:ascii="Arial" w:hAnsi="Arial" w:cs="Arial"/>
+                <w:sz w:val="24"/>
+                <w:szCs w:val="24"/>
+                <w:lang w:val="es-MX"/>
+              </w:rPr>
+              <w:t>(</w:t>
+            </w:r>
+            <w:proofErr w:type="gramEnd"/>
+            <w:r>
+              <w:rPr>
+                <w:rFonts w:ascii="Arial" w:hAnsi="Arial" w:cs="Arial"/>
+                <w:sz w:val="24"/>
+                <w:szCs w:val="24"/>
+                <w:lang w:val="es-MX"/>
+              </w:rPr>
+              <w:t>) registra actor/</w:t>
+            </w:r>
+            <w:proofErr w:type="spellStart"/>
+            <w:r>
+              <w:rPr>
+                <w:rFonts w:ascii="Arial" w:hAnsi="Arial" w:cs="Arial"/>
+                <w:sz w:val="24"/>
+                <w:szCs w:val="24"/>
+                <w:lang w:val="es-MX"/>
+              </w:rPr>
+              <w:t>timestamp</w:t>
+            </w:r>
+            <w:proofErr w:type="spellEnd"/>
+            <w:r>
+              <w:rPr>
+                <w:rFonts w:ascii="Arial" w:hAnsi="Arial" w:cs="Arial"/>
+                <w:sz w:val="24"/>
+                <w:szCs w:val="24"/>
+                <w:lang w:val="es-MX"/>
+              </w:rPr>
+              <w:t xml:space="preserve"> y </w:t>
+            </w:r>
+            <w:r>
+              <w:rPr>
+                <w:rFonts w:ascii="Arial" w:hAnsi="Arial" w:cs="Arial"/>
+                <w:sz w:val="24"/>
+                <w:szCs w:val="24"/>
+                <w:lang w:val="es-MX"/>
+              </w:rPr>
+              <w:lastRenderedPageBreak/>
+              <w:t>deja de guardar el token.</w:t>
+            </w:r>
+          </w:p>
+        </w:tc>
+        <w:tc>
+          <w:tcPr>
+            <w:tcW w:w="2409" w:type="dxa"/>
+            <w:vAlign w:val="center"/>
+          </w:tcPr>
+          <w:p>
+            <w:pPr>
+              <w:spacing w:line="360" w:lineRule="auto"/>
+              <w:jc w:val="both"/>
+              <w:rPr>
+                <w:rFonts w:ascii="Arial" w:hAnsi="Arial" w:cs="Arial"/>
+                <w:b/>
+                <w:bCs/>
+                <w:sz w:val="24"/>
+                <w:szCs w:val="24"/>
+                <w:lang w:val="es-MX"/>
+              </w:rPr>
+            </w:pPr>
+            <w:r>
+              <w:rPr>
+                <w:rFonts w:ascii="Arial" w:hAnsi="Arial" w:cs="Arial"/>
+                <w:sz w:val="24"/>
+                <w:szCs w:val="24"/>
+                <w:lang w:val="es-MX"/>
+              </w:rPr>
+              <w:lastRenderedPageBreak/>
+              <w:t>evidencias/tc-07-auditoria-segura-tdd/</w:t>
+            </w:r>
+          </w:p>
+        </w:tc>
+      </w:tr>
+    </w:tbl>
+    <w:p>
+      <w:pPr>
+        <w:spacing w:line="360" w:lineRule="auto"/>
+        <w:jc w:val="both"/>
+        <w:rPr>
+          <w:rFonts w:ascii="Arial" w:hAnsi="Arial" w:cs="Arial"/>
+          <w:b/>
+          <w:bCs/>
+        </w:rPr>
+      </w:pPr>
+    </w:p>
+    <w:p>
+      <w:pPr>
+        <w:spacing w:line="360" w:lineRule="auto"/>
+        <w:jc w:val="both"/>
+        <w:rPr>
+          <w:rFonts w:ascii="Arial" w:hAnsi="Arial" w:cs="Arial"/>
+        </w:rPr>
+      </w:pPr>
+      <w:r>
+        <w:rPr>
+          <w:rFonts w:ascii="Arial" w:hAnsi="Arial" w:cs="Arial"/>
+          <w:b/>
+          <w:bCs/>
+        </w:rPr>
+        <w:t xml:space="preserve">Riesgo residual (no es </w:t>
+      </w:r>
+      <w:proofErr w:type="gramStart"/>
+      <w:r>
+        <w:rPr>
+          <w:rFonts w:ascii="Arial" w:hAnsi="Arial" w:cs="Arial"/>
+          <w:b/>
+          <w:bCs/>
+        </w:rPr>
+        <w:t>un hallazgo a corregir</w:t>
+      </w:r>
+      <w:proofErr w:type="gramEnd"/>
+      <w:r>
+        <w:rPr>
+          <w:rFonts w:ascii="Arial" w:hAnsi="Arial" w:cs="Arial"/>
+          <w:b/>
+          <w:bCs/>
+        </w:rPr>
+        <w:t xml:space="preserve"> dentro del alcance):</w:t>
+      </w:r>
+      <w:r>
+        <w:rPr>
+          <w:rFonts w:ascii="Arial" w:hAnsi="Arial" w:cs="Arial"/>
+        </w:rPr>
+        <w:t xml:space="preserve"> T6 — no existe límite de intentos de autenticación con token, lo que permitiría intentos repetidos sin bloqueo. Se documenta como limitación conocida, no como defecto introducido por el equipo.</w:t>
+      </w:r>
+    </w:p>
+    <w:p>
+      <w:pPr>
+        <w:pStyle w:val="Ttulo2"/>
+        <w:jc w:val="center"/>
+      </w:pPr>
+      <w:r>
+        <w:t>Decisión de liberación y limitaciones</w:t>
+      </w:r>
+    </w:p>
+    <w:p>
+      <w:pPr>
+        <w:spacing w:line="360" w:lineRule="auto"/>
+        <w:jc w:val="both"/>
+        <w:rPr>
+          <w:rFonts w:ascii="Arial" w:hAnsi="Arial" w:cs="Arial"/>
+        </w:rPr>
+      </w:pPr>
+      <w:r>
+        <w:rPr>
+          <w:rFonts w:ascii="Arial" w:hAnsi="Arial" w:cs="Arial"/>
+          <w:b/>
+          <w:bCs/>
+        </w:rPr>
+        <w:t>Defectos abiertos:</w:t>
+      </w:r>
+      <w:r>
+        <w:rPr>
+          <w:rFonts w:ascii="Arial" w:hAnsi="Arial" w:cs="Arial"/>
+        </w:rPr>
+        <w:t xml:space="preserve"> ninguno de los 12 casos planificados quedó con fallo pendiente al cierre de la campaña.</w:t>
+      </w:r>
+    </w:p>
+    <w:p>
+      <w:pPr>
+        <w:spacing w:line="360" w:lineRule="auto"/>
+        <w:jc w:val="both"/>
+        <w:rPr>
+          <w:rFonts w:ascii="Arial" w:hAnsi="Arial" w:cs="Arial"/>
+        </w:rPr>
+      </w:pPr>
+      <w:r>
+        <w:rPr>
+          <w:rFonts w:ascii="Arial" w:hAnsi="Arial" w:cs="Arial"/>
+          <w:b/>
+          <w:bCs/>
+        </w:rPr>
+        <w:t>Decisión:</w:t>
+      </w:r>
+      <w:r>
+        <w:rPr>
+          <w:rFonts w:ascii="Arial" w:hAnsi="Arial" w:cs="Arial"/>
+        </w:rPr>
+        <w:t xml:space="preserve"> </w:t>
+      </w:r>
+      <w:r>
+        <w:rPr>
+          <w:rFonts w:ascii="Arial" w:hAnsi="Arial" w:cs="Arial"/>
+          <w:i/>
+          <w:iCs/>
+        </w:rPr>
+        <w:t>Liberar con condiciones.</w:t>
+      </w:r>
+      <w:r>
+        <w:rPr>
+          <w:rFonts w:ascii="Arial" w:hAnsi="Arial" w:cs="Arial"/>
+        </w:rPr>
+        <w:t xml:space="preserve"> Los 5 defectos confirmados (3 de severidad alta: acceso horizontal, sesión revocada e integridad entre sedes) fueron corregidos y verificados mediante regresión en dos ejecuciones limpias. No se encontró ningún fallo crítico de autorización abierto al momento de esta decisión. Como advierte el propio enunciado, una tasa de aprobación alta no autoriza por sí sola la liberación — en este caso la decisión se apoya en que los defectos de mayor severidad fueron efectivamente cerrados y verificados, no solo en el porcentaje.</w:t>
+      </w:r>
+    </w:p>
+    <w:p>
+      <w:pPr>
+        <w:spacing w:line="360" w:lineRule="auto"/>
+        <w:jc w:val="both"/>
+        <w:rPr>
+          <w:rFonts w:ascii="Arial" w:hAnsi="Arial" w:cs="Arial"/>
+        </w:rPr>
+      </w:pPr>
+      <w:r>
+        <w:rPr>
+          <w:rFonts w:ascii="Arial" w:hAnsi="Arial" w:cs="Arial"/>
+          <w:b/>
+          <w:bCs/>
+        </w:rPr>
+        <w:t>Condición de la liberación:</w:t>
+      </w:r>
+      <w:r>
+        <w:rPr>
+          <w:rFonts w:ascii="Arial" w:hAnsi="Arial" w:cs="Arial"/>
+        </w:rPr>
+        <w:t xml:space="preserve"> atender el riesgo residual T6 (sin límite de intentos de token) en una siguiente iteración antes de cualquier escenario de uso con datos reales; no bloquea la liberación del laboratorio en su alcance académico actual.</w:t>
+      </w:r>
+    </w:p>
+    <w:p>
+      <w:pPr>
+        <w:spacing w:line="360" w:lineRule="auto"/>
+        <w:jc w:val="both"/>
+        <w:rPr>
+          <w:rFonts w:ascii="Arial" w:hAnsi="Arial" w:cs="Arial"/>
+        </w:rPr>
+      </w:pPr>
+      <w:r>
+        <w:rPr>
+          <w:rFonts w:ascii="Arial" w:hAnsi="Arial" w:cs="Arial"/>
+          <w:b/>
+          <w:bCs/>
+        </w:rPr>
+        <w:t>Limitaciones del estudio:</w:t>
+      </w:r>
+      <w:r>
+        <w:rPr>
+          <w:rFonts w:ascii="Arial" w:hAnsi="Arial" w:cs="Arial"/>
+        </w:rPr>
+        <w:t xml:space="preserve"> la campaña se limitó a los 12 casos definidos sobre un laboratorio local con datos sintéticos; no se ejecutaron herramientas SAST/DAST automatizadas adicionales a la revisión estática manual; la evaluación de usabilidad </w:t>
+      </w:r>
+      <w:r>
+        <w:rPr>
+          <w:rFonts w:ascii="Arial" w:hAnsi="Arial" w:cs="Arial"/>
+        </w:rPr>
+        <w:lastRenderedPageBreak/>
+        <w:t>(Fase E) fue una autoevaluación del propio autor del código por limitación de tiempo del equipo, no una prueba ciega con un tercero.</w:t>
+      </w:r>
+    </w:p>
+    <w:p>
+      <w:pPr>
+        <w:spacing w:line="360" w:lineRule="auto"/>
+        <w:jc w:val="both"/>
+        <w:rPr>
+          <w:rFonts w:ascii="Arial" w:hAnsi="Arial" w:cs="Arial"/>
+        </w:rPr>
+      </w:pPr>
+      <w:r>
+        <w:rPr>
+          <w:rFonts w:ascii="Arial" w:hAnsi="Arial" w:cs="Arial"/>
+          <w:b/>
+          <w:bCs/>
+        </w:rPr>
+        <w:t>Responsable de la decisión hipotética:</w:t>
+      </w:r>
+      <w:r>
+        <w:rPr>
+          <w:rFonts w:ascii="Arial" w:hAnsi="Arial" w:cs="Arial"/>
+        </w:rPr>
+        <w:t xml:space="preserve"> el equipo (Iván Barboza Blanco e Ian Angulo Matamoros), bajo revisión del docente como entidad evaluadora del laboratorio.</w:t>
+      </w:r>
     </w:p>
     <w:p>
       <w:pPr>
@@ -16989,21 +19926,13 @@
     </w:p>
     <w:p>
       <w:pPr>
-        <w:spacing w:after="100" w:line="360" w:lineRule="auto"/>
-        <w:jc w:val="both"/>
-        <w:rPr>
-          <w:rFonts w:ascii="Arial" w:hAnsi="Arial" w:cs="Arial"/>
-        </w:rPr>
-      </w:pPr>
-    </w:p>
-    <w:p>
-      <w:pPr>
         <w:pStyle w:val="Ttulo1"/>
         <w:rPr>
           <w:rFonts w:cs="Arial"/>
         </w:rPr>
       </w:pPr>
       <w:r>
+        <w:lastRenderedPageBreak/>
         <w:t>Anexos</w:t>
       </w:r>
     </w:p>
@@ -17020,16 +19949,9 @@
     </w:p>
     <w:p>
       <w:pPr>
-        <w:spacing w:line="360" w:lineRule="auto"/>
-        <w:jc w:val="both"/>
-        <w:rPr>
-          <w:rFonts w:ascii="Arial" w:hAnsi="Arial" w:cs="Arial"/>
-        </w:rPr>
+        <w:pStyle w:val="apa7"/>
       </w:pPr>
       <w:r>
-        <w:rPr>
-          <w:rFonts w:ascii="Arial" w:hAnsi="Arial" w:cs="Arial"/>
-        </w:rPr>
         <w:t>Este anexo incorpora la estructura narrativa de cada caso sin sustituir las secciones anteriores del documento. Los resultados y estados actualizados permanecen también en el Registro de gestión QA por caso.</w:t>
       </w:r>
     </w:p>
@@ -17538,7 +20460,6 @@
         <w:pStyle w:val="Ttulo2"/>
       </w:pPr>
       <w:r>
-        <w:lastRenderedPageBreak/>
         <w:t>TC-02 — Acceso horizontal indebido de estudiante</w:t>
       </w:r>
     </w:p>
@@ -17647,6 +20568,7 @@
                 <w:b/>
                 <w:bCs/>
               </w:rPr>
+              <w:lastRenderedPageBreak/>
               <w:t>Objetivo</w:t>
             </w:r>
           </w:p>
@@ -18297,7 +21219,6 @@
                 <w:b/>
                 <w:bCs/>
               </w:rPr>
-              <w:lastRenderedPageBreak/>
               <w:t>Datos / pasos</w:t>
             </w:r>
           </w:p>
@@ -18384,6 +21305,7 @@
                 <w:b/>
                 <w:bCs/>
               </w:rPr>
+              <w:lastRenderedPageBreak/>
               <w:t>Oráculo</w:t>
             </w:r>
           </w:p>
@@ -18984,14 +21906,7 @@
               <w:rPr>
                 <w:rFonts w:ascii="Arial" w:hAnsi="Arial" w:cs="Arial"/>
               </w:rPr>
-              <w:t xml:space="preserve">: 200 al revocar y 401 en la lectura posterior, sin datos. Confirmado también por Postman </w:t>
-            </w:r>
-            <w:r>
-              <w:rPr>
-                <w:rFonts w:ascii="Arial" w:hAnsi="Arial" w:cs="Arial"/>
-              </w:rPr>
-              <w:lastRenderedPageBreak/>
-              <w:t>(revocación y lectura denegada). Evidencia: evidencias/tc-04-sesion-revocada-tdd/, evidencias/manual-api-postman/03-tc04-revocacion-200.png y 04-tc04-lectura-401.png.</w:t>
+              <w:t>: 200 al revocar y 401 en la lectura posterior, sin datos. Confirmado también por Postman (revocación y lectura denegada). Evidencia: evidencias/tc-04-sesion-revocada-tdd/, evidencias/manual-api-postman/03-tc04-revocacion-200.png y 04-tc04-lectura-401.png.</w:t>
             </w:r>
           </w:p>
         </w:tc>
@@ -19698,7 +22613,6 @@
                 <w:b/>
                 <w:bCs/>
               </w:rPr>
-              <w:lastRenderedPageBreak/>
               <w:t>Objetivo</w:t>
             </w:r>
           </w:p>
@@ -19771,6 +22685,7 @@
                 <w:b/>
                 <w:bCs/>
               </w:rPr>
+              <w:lastRenderedPageBreak/>
               <w:t>Precondiciones</w:t>
             </w:r>
           </w:p>
@@ -20437,7 +23352,6 @@
                 <w:b/>
                 <w:bCs/>
               </w:rPr>
-              <w:lastRenderedPageBreak/>
               <w:t>Observado</w:t>
             </w:r>
           </w:p>
@@ -20507,7 +23421,14 @@
               <w:rPr>
                 <w:rFonts w:ascii="Arial" w:hAnsi="Arial" w:cs="Arial"/>
               </w:rPr>
-              <w:t xml:space="preserve"> sin token; regresión de 11 pruebas aprobada tras el </w:t>
+              <w:t xml:space="preserve"> </w:t>
+            </w:r>
+            <w:r>
+              <w:rPr>
+                <w:rFonts w:ascii="Arial" w:hAnsi="Arial" w:cs="Arial"/>
+              </w:rPr>
+              <w:lastRenderedPageBreak/>
+              <w:t xml:space="preserve">sin token; regresión de 11 pruebas aprobada tras el </w:t>
             </w:r>
             <w:proofErr w:type="spellStart"/>
             <w:r>
@@ -20552,6 +23473,7 @@
                 <w:b/>
                 <w:bCs/>
               </w:rPr>
+              <w:lastRenderedPageBreak/>
               <w:t>Resultado</w:t>
             </w:r>
           </w:p>
@@ -21082,7 +24004,6 @@
         <w:pStyle w:val="Ttulo2"/>
       </w:pPr>
       <w:r>
-        <w:lastRenderedPageBreak/>
         <w:t>TC-09 — Lectura autorizada por docente de su sede</w:t>
       </w:r>
     </w:p>
@@ -21191,6 +24112,7 @@
                 <w:b/>
                 <w:bCs/>
               </w:rPr>
+              <w:lastRenderedPageBreak/>
               <w:t>Objetivo</w:t>
             </w:r>
           </w:p>
@@ -21821,7 +24743,6 @@
                 <w:b/>
                 <w:bCs/>
               </w:rPr>
-              <w:lastRenderedPageBreak/>
               <w:t>Datos / pasos</w:t>
             </w:r>
           </w:p>
@@ -21908,6 +24829,7 @@
                 <w:b/>
                 <w:bCs/>
               </w:rPr>
+              <w:lastRenderedPageBreak/>
               <w:t>Oráculo</w:t>
             </w:r>
           </w:p>
@@ -22566,7 +25488,6 @@
                 <w:b/>
                 <w:bCs/>
               </w:rPr>
-              <w:lastRenderedPageBreak/>
               <w:t>Resultado</w:t>
             </w:r>
           </w:p>
@@ -22605,6 +25526,7 @@
         <w:pStyle w:val="Ttulo2"/>
       </w:pPr>
       <w:r>
+        <w:lastRenderedPageBreak/>
         <w:t>TC-12 — Límite superior inválido de nota</w:t>
       </w:r>
     </w:p>
@@ -23280,14 +26202,7 @@
         <w:rPr>
           <w:rFonts w:ascii="Arial" w:hAnsi="Arial" w:cs="Arial"/>
         </w:rPr>
-        <w:t xml:space="preserve"> dos ejecuciones limpias y las ejecuciones aisladas de TC-09, TC-11 y TC-12 finalizaron correctamente. La suite final ejecutó 14 pruebas: 12 unitarias y 2 de </w:t>
-      </w:r>
-      <w:r>
-        <w:rPr>
-          <w:rFonts w:ascii="Arial" w:hAnsi="Arial" w:cs="Arial"/>
-        </w:rPr>
-        <w:lastRenderedPageBreak/>
-        <w:t xml:space="preserve">integración HTTP, sin fallos. Evidencias: evidencias/tc-09-docente-misma-sede, tc-11-limite-inferior-valido, tc-12-limite-superior-invalido y </w:t>
+        <w:t xml:space="preserve"> dos ejecuciones limpias y las ejecuciones aisladas de TC-09, TC-11 y TC-12 finalizaron correctamente. La suite final ejecutó 14 pruebas: 12 unitarias y 2 de integración HTTP, sin fallos. Evidencias: evidencias/tc-09-docente-misma-sede, tc-11-limite-inferior-valido, tc-12-limite-superior-invalido y </w:t>
       </w:r>
       <w:proofErr w:type="spellStart"/>
       <w:r>
@@ -23531,6 +26446,119 @@
     </w:lvl>
   </w:abstractNum>
   <w:abstractNum w:abstractNumId="1" w15:restartNumberingAfterBreak="0">
+    <w:nsid w:val="0FA97F44"/>
+    <w:multiLevelType w:val="hybridMultilevel"/>
+    <w:tmpl w:val="4F82981E"/>
+    <w:lvl w:ilvl="0" w:tplc="080A0001">
+      <w:start w:val="1"/>
+      <w:numFmt w:val="bullet"/>
+      <w:lvlText w:val=""/>
+      <w:lvlJc w:val="left"/>
+      <w:pPr>
+        <w:ind w:left="720" w:hanging="360"/>
+      </w:pPr>
+      <w:rPr>
+        <w:rFonts w:ascii="Symbol" w:hAnsi="Symbol" w:hint="default"/>
+      </w:rPr>
+    </w:lvl>
+    <w:lvl w:ilvl="1" w:tplc="080A0003" w:tentative="1">
+      <w:start w:val="1"/>
+      <w:numFmt w:val="bullet"/>
+      <w:lvlText w:val="o"/>
+      <w:lvlJc w:val="left"/>
+      <w:pPr>
+        <w:ind w:left="1440" w:hanging="360"/>
+      </w:pPr>
+      <w:rPr>
+        <w:rFonts w:ascii="Courier New" w:hAnsi="Courier New" w:cs="Courier New" w:hint="default"/>
+      </w:rPr>
+    </w:lvl>
+    <w:lvl w:ilvl="2" w:tplc="080A0005" w:tentative="1">
+      <w:start w:val="1"/>
+      <w:numFmt w:val="bullet"/>
+      <w:lvlText w:val=""/>
+      <w:lvlJc w:val="left"/>
+      <w:pPr>
+        <w:ind w:left="2160" w:hanging="360"/>
+      </w:pPr>
+      <w:rPr>
+        <w:rFonts w:ascii="Wingdings" w:hAnsi="Wingdings" w:hint="default"/>
+      </w:rPr>
+    </w:lvl>
+    <w:lvl w:ilvl="3" w:tplc="080A0001" w:tentative="1">
+      <w:start w:val="1"/>
+      <w:numFmt w:val="bullet"/>
+      <w:lvlText w:val=""/>
+      <w:lvlJc w:val="left"/>
+      <w:pPr>
+        <w:ind w:left="2880" w:hanging="360"/>
+      </w:pPr>
+      <w:rPr>
+        <w:rFonts w:ascii="Symbol" w:hAnsi="Symbol" w:hint="default"/>
+      </w:rPr>
+    </w:lvl>
+    <w:lvl w:ilvl="4" w:tplc="080A0003" w:tentative="1">
+      <w:start w:val="1"/>
+      <w:numFmt w:val="bullet"/>
+      <w:lvlText w:val="o"/>
+      <w:lvlJc w:val="left"/>
+      <w:pPr>
+        <w:ind w:left="3600" w:hanging="360"/>
+      </w:pPr>
+      <w:rPr>
+        <w:rFonts w:ascii="Courier New" w:hAnsi="Courier New" w:cs="Courier New" w:hint="default"/>
+      </w:rPr>
+    </w:lvl>
+    <w:lvl w:ilvl="5" w:tplc="080A0005" w:tentative="1">
+      <w:start w:val="1"/>
+      <w:numFmt w:val="bullet"/>
+      <w:lvlText w:val=""/>
+      <w:lvlJc w:val="left"/>
+      <w:pPr>
+        <w:ind w:left="4320" w:hanging="360"/>
+      </w:pPr>
+      <w:rPr>
+        <w:rFonts w:ascii="Wingdings" w:hAnsi="Wingdings" w:hint="default"/>
+      </w:rPr>
+    </w:lvl>
+    <w:lvl w:ilvl="6" w:tplc="080A0001" w:tentative="1">
+      <w:start w:val="1"/>
+      <w:numFmt w:val="bullet"/>
+      <w:lvlText w:val=""/>
+      <w:lvlJc w:val="left"/>
+      <w:pPr>
+        <w:ind w:left="5040" w:hanging="360"/>
+      </w:pPr>
+      <w:rPr>
+        <w:rFonts w:ascii="Symbol" w:hAnsi="Symbol" w:hint="default"/>
+      </w:rPr>
+    </w:lvl>
+    <w:lvl w:ilvl="7" w:tplc="080A0003" w:tentative="1">
+      <w:start w:val="1"/>
+      <w:numFmt w:val="bullet"/>
+      <w:lvlText w:val="o"/>
+      <w:lvlJc w:val="left"/>
+      <w:pPr>
+        <w:ind w:left="5760" w:hanging="360"/>
+      </w:pPr>
+      <w:rPr>
+        <w:rFonts w:ascii="Courier New" w:hAnsi="Courier New" w:cs="Courier New" w:hint="default"/>
+      </w:rPr>
+    </w:lvl>
+    <w:lvl w:ilvl="8" w:tplc="080A0005" w:tentative="1">
+      <w:start w:val="1"/>
+      <w:numFmt w:val="bullet"/>
+      <w:lvlText w:val=""/>
+      <w:lvlJc w:val="left"/>
+      <w:pPr>
+        <w:ind w:left="6480" w:hanging="360"/>
+      </w:pPr>
+      <w:rPr>
+        <w:rFonts w:ascii="Wingdings" w:hAnsi="Wingdings" w:hint="default"/>
+      </w:rPr>
+    </w:lvl>
+  </w:abstractNum>
+  <w:abstractNum w:abstractNumId="2" w15:restartNumberingAfterBreak="0">
     <w:nsid w:val="1F577B81"/>
     <w:multiLevelType w:val="hybridMultilevel"/>
     <w:tmpl w:val="920A1ABC"/>
@@ -23643,10 +26671,166 @@
       </w:rPr>
     </w:lvl>
   </w:abstractNum>
+  <w:abstractNum w:abstractNumId="3" w15:restartNumberingAfterBreak="0">
+    <w:nsid w:val="36AB76A1"/>
+    <w:multiLevelType w:val="multilevel"/>
+    <w:tmpl w:val="2D7E8B0A"/>
+    <w:lvl w:ilvl="0">
+      <w:start w:val="1"/>
+      <w:numFmt w:val="bullet"/>
+      <w:lvlText w:val=""/>
+      <w:lvlJc w:val="left"/>
+      <w:pPr>
+        <w:tabs>
+          <w:tab w:val="num" w:pos="720"/>
+        </w:tabs>
+        <w:ind w:left="720" w:hanging="360"/>
+      </w:pPr>
+      <w:rPr>
+        <w:rFonts w:ascii="Arial" w:hAnsi="Arial" w:cs="Arial" w:hint="default"/>
+        <w:sz w:val="24"/>
+        <w:szCs w:val="24"/>
+      </w:rPr>
+    </w:lvl>
+    <w:lvl w:ilvl="1" w:tentative="1">
+      <w:start w:val="1"/>
+      <w:numFmt w:val="bullet"/>
+      <w:lvlText w:val="o"/>
+      <w:lvlJc w:val="left"/>
+      <w:pPr>
+        <w:tabs>
+          <w:tab w:val="num" w:pos="1440"/>
+        </w:tabs>
+        <w:ind w:left="1440" w:hanging="360"/>
+      </w:pPr>
+      <w:rPr>
+        <w:rFonts w:ascii="Courier New" w:hAnsi="Courier New" w:hint="default"/>
+        <w:sz w:val="20"/>
+      </w:rPr>
+    </w:lvl>
+    <w:lvl w:ilvl="2" w:tentative="1">
+      <w:start w:val="1"/>
+      <w:numFmt w:val="bullet"/>
+      <w:lvlText w:val=""/>
+      <w:lvlJc w:val="left"/>
+      <w:pPr>
+        <w:tabs>
+          <w:tab w:val="num" w:pos="2160"/>
+        </w:tabs>
+        <w:ind w:left="2160" w:hanging="360"/>
+      </w:pPr>
+      <w:rPr>
+        <w:rFonts w:ascii="Wingdings" w:hAnsi="Wingdings" w:hint="default"/>
+        <w:sz w:val="20"/>
+      </w:rPr>
+    </w:lvl>
+    <w:lvl w:ilvl="3" w:tentative="1">
+      <w:start w:val="1"/>
+      <w:numFmt w:val="bullet"/>
+      <w:lvlText w:val=""/>
+      <w:lvlJc w:val="left"/>
+      <w:pPr>
+        <w:tabs>
+          <w:tab w:val="num" w:pos="2880"/>
+        </w:tabs>
+        <w:ind w:left="2880" w:hanging="360"/>
+      </w:pPr>
+      <w:rPr>
+        <w:rFonts w:ascii="Wingdings" w:hAnsi="Wingdings" w:hint="default"/>
+        <w:sz w:val="20"/>
+      </w:rPr>
+    </w:lvl>
+    <w:lvl w:ilvl="4" w:tentative="1">
+      <w:start w:val="1"/>
+      <w:numFmt w:val="bullet"/>
+      <w:lvlText w:val=""/>
+      <w:lvlJc w:val="left"/>
+      <w:pPr>
+        <w:tabs>
+          <w:tab w:val="num" w:pos="3600"/>
+        </w:tabs>
+        <w:ind w:left="3600" w:hanging="360"/>
+      </w:pPr>
+      <w:rPr>
+        <w:rFonts w:ascii="Wingdings" w:hAnsi="Wingdings" w:hint="default"/>
+        <w:sz w:val="20"/>
+      </w:rPr>
+    </w:lvl>
+    <w:lvl w:ilvl="5" w:tentative="1">
+      <w:start w:val="1"/>
+      <w:numFmt w:val="bullet"/>
+      <w:lvlText w:val=""/>
+      <w:lvlJc w:val="left"/>
+      <w:pPr>
+        <w:tabs>
+          <w:tab w:val="num" w:pos="4320"/>
+        </w:tabs>
+        <w:ind w:left="4320" w:hanging="360"/>
+      </w:pPr>
+      <w:rPr>
+        <w:rFonts w:ascii="Wingdings" w:hAnsi="Wingdings" w:hint="default"/>
+        <w:sz w:val="20"/>
+      </w:rPr>
+    </w:lvl>
+    <w:lvl w:ilvl="6" w:tentative="1">
+      <w:start w:val="1"/>
+      <w:numFmt w:val="bullet"/>
+      <w:lvlText w:val=""/>
+      <w:lvlJc w:val="left"/>
+      <w:pPr>
+        <w:tabs>
+          <w:tab w:val="num" w:pos="5040"/>
+        </w:tabs>
+        <w:ind w:left="5040" w:hanging="360"/>
+      </w:pPr>
+      <w:rPr>
+        <w:rFonts w:ascii="Wingdings" w:hAnsi="Wingdings" w:hint="default"/>
+        <w:sz w:val="20"/>
+      </w:rPr>
+    </w:lvl>
+    <w:lvl w:ilvl="7" w:tentative="1">
+      <w:start w:val="1"/>
+      <w:numFmt w:val="bullet"/>
+      <w:lvlText w:val=""/>
+      <w:lvlJc w:val="left"/>
+      <w:pPr>
+        <w:tabs>
+          <w:tab w:val="num" w:pos="5760"/>
+        </w:tabs>
+        <w:ind w:left="5760" w:hanging="360"/>
+      </w:pPr>
+      <w:rPr>
+        <w:rFonts w:ascii="Wingdings" w:hAnsi="Wingdings" w:hint="default"/>
+        <w:sz w:val="20"/>
+      </w:rPr>
+    </w:lvl>
+    <w:lvl w:ilvl="8" w:tentative="1">
+      <w:start w:val="1"/>
+      <w:numFmt w:val="bullet"/>
+      <w:lvlText w:val=""/>
+      <w:lvlJc w:val="left"/>
+      <w:pPr>
+        <w:tabs>
+          <w:tab w:val="num" w:pos="6480"/>
+        </w:tabs>
+        <w:ind w:left="6480" w:hanging="360"/>
+      </w:pPr>
+      <w:rPr>
+        <w:rFonts w:ascii="Wingdings" w:hAnsi="Wingdings" w:hint="default"/>
+        <w:sz w:val="20"/>
+      </w:rPr>
+    </w:lvl>
+  </w:abstractNum>
   <w:num w:numId="1" w16cid:durableId="1106073851">
     <w:abstractNumId w:val="0"/>
   </w:num>
   <w:num w:numId="2" w16cid:durableId="2118938865">
+    <w:abstractNumId w:val="2"/>
+  </w:num>
+  <w:num w:numId="3" w16cid:durableId="1681544867">
+    <w:abstractNumId w:val="3"/>
+  </w:num>
+  <w:num w:numId="4" w16cid:durableId="42100399">
     <w:abstractNumId w:val="1"/>
   </w:num>
 </w:numbering>
@@ -24253,7 +27437,6 @@
   <w:style w:type="character" w:default="1" w:styleId="Fuentedeprrafopredeter">
     <w:name w:val="Default Paragraph Font"/>
     <w:uiPriority w:val="1"/>
-    <w:semiHidden/>
     <w:unhideWhenUsed/>
   </w:style>
   <w:style w:type="table" w:default="1" w:styleId="Tablanormal">

</xml_diff>

<commit_message>
docs: add Fase E to informe, README python requirement, remove temp files
</commit_message>
<xml_diff>
--- a/docs/informe_seguridad.docx
+++ b/docs/informe_seguridad.docx
@@ -14391,7 +14391,21 @@
         <w:rPr>
           <w:lang w:val="en-US"/>
         </w:rPr>
-        <w:t xml:space="preserve"> = "."; python -m </w:t>
+        <w:t xml:space="preserve"> </w:t>
+      </w:r>
+      <w:proofErr w:type="gramStart"/>
+      <w:r>
+        <w:rPr>
+          <w:lang w:val="en-US"/>
+        </w:rPr>
+        <w:t>= "."</w:t>
+      </w:r>
+      <w:proofErr w:type="gramEnd"/>
+      <w:r>
+        <w:rPr>
+          <w:lang w:val="en-US"/>
+        </w:rPr>
+        <w:t xml:space="preserve">; python -m </w:t>
       </w:r>
       <w:proofErr w:type="spellStart"/>
       <w:r>
@@ -14408,6 +14422,7 @@
         <w:t xml:space="preserve"> discover -s tests -v; Remove-Item </w:t>
       </w:r>
       <w:proofErr w:type="spellStart"/>
+      <w:proofErr w:type="gramStart"/>
       <w:r>
         <w:rPr>
           <w:lang w:val="en-US"/>
@@ -14415,6 +14430,7 @@
         <w:t>Env:PYTHONPATH</w:t>
       </w:r>
       <w:proofErr w:type="spellEnd"/>
+      <w:proofErr w:type="gramEnd"/>
       <w:r>
         <w:rPr>
           <w:lang w:val="en-US"/>
@@ -15283,25 +15299,14 @@
                 <w:szCs w:val="24"/>
               </w:rPr>
             </w:pPr>
-            <w:proofErr w:type="spellStart"/>
-            <w:r>
-              <w:rPr>
-                <w:rFonts w:ascii="Arial" w:hAnsi="Arial" w:cs="Arial"/>
-                <w:b/>
-                <w:sz w:val="24"/>
-                <w:szCs w:val="24"/>
-              </w:rPr>
-              <w:t>Prueba</w:t>
-            </w:r>
-            <w:proofErr w:type="spellEnd"/>
-            <w:r>
-              <w:rPr>
-                <w:rFonts w:ascii="Arial" w:hAnsi="Arial" w:cs="Arial"/>
-                <w:b/>
-                <w:sz w:val="24"/>
-                <w:szCs w:val="24"/>
-              </w:rPr>
-              <w:t xml:space="preserve"> manual</w:t>
+            <w:r>
+              <w:rPr>
+                <w:rFonts w:ascii="Arial" w:hAnsi="Arial" w:cs="Arial"/>
+                <w:b/>
+                <w:sz w:val="24"/>
+                <w:szCs w:val="24"/>
+              </w:rPr>
+              <w:t>Prueba manual</w:t>
             </w:r>
           </w:p>
         </w:tc>
@@ -16826,9 +16831,3008 @@
     </w:p>
     <w:p>
       <w:pPr>
+        <w:pStyle w:val="Ttulo1"/>
+      </w:pPr>
+      <w:r>
+        <w:lastRenderedPageBreak/>
+        <w:t>Fase D — Acta de inspección</w:t>
+      </w:r>
+    </w:p>
+    <w:tbl>
+      <w:tblPr>
+        <w:tblStyle w:val="Tablaconcuadrcula"/>
+        <w:tblW w:w="0" w:type="auto"/>
+        <w:tblLook w:val="04A0" w:firstRow="1" w:lastRow="0" w:firstColumn="1" w:lastColumn="0" w:noHBand="0" w:noVBand="1"/>
+      </w:tblPr>
+      <w:tblGrid>
+        <w:gridCol w:w="4675"/>
+        <w:gridCol w:w="4675"/>
+      </w:tblGrid>
+      <w:tr>
+        <w:tc>
+          <w:tcPr>
+            <w:tcW w:w="4675" w:type="dxa"/>
+            <w:vAlign w:val="center"/>
+          </w:tcPr>
+          <w:p>
+            <w:pPr>
+              <w:pStyle w:val="apa7"/>
+              <w:ind w:firstLine="0"/>
+              <w:rPr>
+                <w:sz w:val="24"/>
+                <w:szCs w:val="24"/>
+              </w:rPr>
+            </w:pPr>
+            <w:r>
+              <w:rPr>
+                <w:rFonts w:cs="Arial"/>
+                <w:b/>
+                <w:bCs/>
+                <w:sz w:val="24"/>
+                <w:szCs w:val="24"/>
+              </w:rPr>
+              <w:t>Campo</w:t>
+            </w:r>
+          </w:p>
+        </w:tc>
+        <w:tc>
+          <w:tcPr>
+            <w:tcW w:w="4675" w:type="dxa"/>
+            <w:vAlign w:val="center"/>
+          </w:tcPr>
+          <w:p>
+            <w:pPr>
+              <w:pStyle w:val="apa7"/>
+              <w:ind w:firstLine="0"/>
+              <w:rPr>
+                <w:sz w:val="24"/>
+                <w:szCs w:val="24"/>
+              </w:rPr>
+            </w:pPr>
+            <w:proofErr w:type="spellStart"/>
+            <w:r>
+              <w:rPr>
+                <w:rFonts w:cs="Arial"/>
+                <w:b/>
+                <w:bCs/>
+                <w:sz w:val="24"/>
+                <w:szCs w:val="24"/>
+              </w:rPr>
+              <w:t>Contenido</w:t>
+            </w:r>
+            <w:proofErr w:type="spellEnd"/>
+          </w:p>
+        </w:tc>
+      </w:tr>
+      <w:tr>
+        <w:tc>
+          <w:tcPr>
+            <w:tcW w:w="4675" w:type="dxa"/>
+            <w:vAlign w:val="center"/>
+          </w:tcPr>
+          <w:p>
+            <w:pPr>
+              <w:pStyle w:val="apa7"/>
+              <w:ind w:firstLine="0"/>
+              <w:rPr>
+                <w:sz w:val="24"/>
+                <w:szCs w:val="24"/>
+              </w:rPr>
+            </w:pPr>
+            <w:r>
+              <w:rPr>
+                <w:rFonts w:cs="Arial"/>
+                <w:sz w:val="24"/>
+                <w:szCs w:val="24"/>
+              </w:rPr>
+              <w:t>Revisor</w:t>
+            </w:r>
+          </w:p>
+        </w:tc>
+        <w:tc>
+          <w:tcPr>
+            <w:tcW w:w="4675" w:type="dxa"/>
+            <w:vAlign w:val="center"/>
+          </w:tcPr>
+          <w:p>
+            <w:pPr>
+              <w:pStyle w:val="apa7"/>
+              <w:ind w:firstLine="0"/>
+              <w:rPr>
+                <w:sz w:val="24"/>
+                <w:szCs w:val="24"/>
+                <w:lang w:val="es-MX"/>
+              </w:rPr>
+            </w:pPr>
+            <w:r>
+              <w:rPr>
+                <w:rFonts w:cs="Arial"/>
+                <w:sz w:val="24"/>
+                <w:szCs w:val="24"/>
+                <w:lang w:val="es-MX"/>
+              </w:rPr>
+              <w:t>Iván Barboza Blanco (no autor del código inspeccionado)</w:t>
+            </w:r>
+          </w:p>
+        </w:tc>
+      </w:tr>
+      <w:tr>
+        <w:tc>
+          <w:tcPr>
+            <w:tcW w:w="4675" w:type="dxa"/>
+            <w:vAlign w:val="center"/>
+          </w:tcPr>
+          <w:p>
+            <w:pPr>
+              <w:pStyle w:val="apa7"/>
+              <w:ind w:firstLine="0"/>
+              <w:rPr>
+                <w:sz w:val="24"/>
+                <w:szCs w:val="24"/>
+              </w:rPr>
+            </w:pPr>
+            <w:proofErr w:type="spellStart"/>
+            <w:r>
+              <w:rPr>
+                <w:rFonts w:cs="Arial"/>
+                <w:sz w:val="24"/>
+                <w:szCs w:val="24"/>
+              </w:rPr>
+              <w:t>Fecha</w:t>
+            </w:r>
+            <w:proofErr w:type="spellEnd"/>
+          </w:p>
+        </w:tc>
+        <w:tc>
+          <w:tcPr>
+            <w:tcW w:w="4675" w:type="dxa"/>
+            <w:vAlign w:val="center"/>
+          </w:tcPr>
+          <w:p>
+            <w:pPr>
+              <w:pStyle w:val="apa7"/>
+              <w:ind w:firstLine="0"/>
+              <w:rPr>
+                <w:sz w:val="24"/>
+                <w:szCs w:val="24"/>
+              </w:rPr>
+            </w:pPr>
+            <w:r>
+              <w:rPr>
+                <w:rFonts w:cs="Arial"/>
+                <w:sz w:val="24"/>
+                <w:szCs w:val="24"/>
+              </w:rPr>
+              <w:t xml:space="preserve">30 de </w:t>
+            </w:r>
+            <w:proofErr w:type="spellStart"/>
+            <w:r>
+              <w:rPr>
+                <w:rFonts w:cs="Arial"/>
+                <w:sz w:val="24"/>
+                <w:szCs w:val="24"/>
+              </w:rPr>
+              <w:t>octubre</w:t>
+            </w:r>
+            <w:proofErr w:type="spellEnd"/>
+            <w:r>
+              <w:rPr>
+                <w:rFonts w:cs="Arial"/>
+                <w:sz w:val="24"/>
+                <w:szCs w:val="24"/>
+              </w:rPr>
+              <w:t xml:space="preserve"> de 2026</w:t>
+            </w:r>
+          </w:p>
+        </w:tc>
+      </w:tr>
+      <w:tr>
+        <w:tc>
+          <w:tcPr>
+            <w:tcW w:w="4675" w:type="dxa"/>
+            <w:vAlign w:val="center"/>
+          </w:tcPr>
+          <w:p>
+            <w:pPr>
+              <w:pStyle w:val="apa7"/>
+              <w:ind w:firstLine="0"/>
+              <w:rPr>
+                <w:sz w:val="24"/>
+                <w:szCs w:val="24"/>
+              </w:rPr>
+            </w:pPr>
+            <w:proofErr w:type="spellStart"/>
+            <w:r>
+              <w:rPr>
+                <w:rFonts w:cs="Arial"/>
+                <w:sz w:val="24"/>
+                <w:szCs w:val="24"/>
+              </w:rPr>
+              <w:t>Versión</w:t>
+            </w:r>
+            <w:proofErr w:type="spellEnd"/>
+            <w:r>
+              <w:rPr>
+                <w:rFonts w:cs="Arial"/>
+                <w:sz w:val="24"/>
+                <w:szCs w:val="24"/>
+              </w:rPr>
+              <w:t xml:space="preserve"> </w:t>
+            </w:r>
+            <w:proofErr w:type="spellStart"/>
+            <w:r>
+              <w:rPr>
+                <w:rFonts w:cs="Arial"/>
+                <w:sz w:val="24"/>
+                <w:szCs w:val="24"/>
+              </w:rPr>
+              <w:t>inspeccionada</w:t>
+            </w:r>
+            <w:proofErr w:type="spellEnd"/>
+          </w:p>
+        </w:tc>
+        <w:tc>
+          <w:tcPr>
+            <w:tcW w:w="4675" w:type="dxa"/>
+            <w:vAlign w:val="center"/>
+          </w:tcPr>
+          <w:p>
+            <w:pPr>
+              <w:pStyle w:val="apa7"/>
+              <w:ind w:firstLine="0"/>
+              <w:rPr>
+                <w:sz w:val="24"/>
+                <w:szCs w:val="24"/>
+                <w:lang w:val="es-MX"/>
+              </w:rPr>
+            </w:pPr>
+            <w:proofErr w:type="spellStart"/>
+            <w:r>
+              <w:rPr>
+                <w:rFonts w:cs="Arial"/>
+                <w:sz w:val="24"/>
+                <w:szCs w:val="24"/>
+                <w:lang w:val="es-MX"/>
+              </w:rPr>
+              <w:t>Commit</w:t>
+            </w:r>
+            <w:proofErr w:type="spellEnd"/>
+            <w:r>
+              <w:rPr>
+                <w:rFonts w:cs="Arial"/>
+                <w:sz w:val="24"/>
+                <w:szCs w:val="24"/>
+                <w:lang w:val="es-MX"/>
+              </w:rPr>
+              <w:t xml:space="preserve"> 840087b; código del laboratorio en el estado introducido por e319934</w:t>
+            </w:r>
+          </w:p>
+        </w:tc>
+      </w:tr>
+      <w:tr>
+        <w:tc>
+          <w:tcPr>
+            <w:tcW w:w="4675" w:type="dxa"/>
+            <w:vAlign w:val="center"/>
+          </w:tcPr>
+          <w:p>
+            <w:pPr>
+              <w:pStyle w:val="apa7"/>
+              <w:ind w:firstLine="0"/>
+              <w:rPr>
+                <w:sz w:val="24"/>
+                <w:szCs w:val="24"/>
+              </w:rPr>
+            </w:pPr>
+            <w:proofErr w:type="spellStart"/>
+            <w:r>
+              <w:rPr>
+                <w:rFonts w:cs="Arial"/>
+                <w:sz w:val="24"/>
+                <w:szCs w:val="24"/>
+              </w:rPr>
+              <w:t>Objetos</w:t>
+            </w:r>
+            <w:proofErr w:type="spellEnd"/>
+            <w:r>
+              <w:rPr>
+                <w:rFonts w:cs="Arial"/>
+                <w:sz w:val="24"/>
+                <w:szCs w:val="24"/>
+              </w:rPr>
+              <w:t xml:space="preserve"> </w:t>
+            </w:r>
+            <w:proofErr w:type="spellStart"/>
+            <w:r>
+              <w:rPr>
+                <w:rFonts w:cs="Arial"/>
+                <w:sz w:val="24"/>
+                <w:szCs w:val="24"/>
+              </w:rPr>
+              <w:t>inspeccionados</w:t>
+            </w:r>
+            <w:proofErr w:type="spellEnd"/>
+          </w:p>
+        </w:tc>
+        <w:tc>
+          <w:tcPr>
+            <w:tcW w:w="4675" w:type="dxa"/>
+            <w:vAlign w:val="center"/>
+          </w:tcPr>
+          <w:p>
+            <w:pPr>
+              <w:pStyle w:val="apa7"/>
+              <w:ind w:firstLine="0"/>
+              <w:rPr>
+                <w:sz w:val="24"/>
+                <w:szCs w:val="24"/>
+                <w:lang w:val="es-MX"/>
+              </w:rPr>
+            </w:pPr>
+            <w:r>
+              <w:rPr>
+                <w:rFonts w:cs="Arial"/>
+                <w:sz w:val="24"/>
+                <w:szCs w:val="24"/>
+                <w:lang w:val="es-MX"/>
+              </w:rPr>
+              <w:t xml:space="preserve">Política de acceso completa (autenticar, </w:t>
+            </w:r>
+            <w:proofErr w:type="spellStart"/>
+            <w:r>
+              <w:rPr>
+                <w:rFonts w:cs="Arial"/>
+                <w:sz w:val="24"/>
+                <w:szCs w:val="24"/>
+                <w:lang w:val="es-MX"/>
+              </w:rPr>
+              <w:t>leer_expediente</w:t>
+            </w:r>
+            <w:proofErr w:type="spellEnd"/>
+            <w:r>
+              <w:rPr>
+                <w:rFonts w:cs="Arial"/>
+                <w:sz w:val="24"/>
+                <w:szCs w:val="24"/>
+                <w:lang w:val="es-MX"/>
+              </w:rPr>
+              <w:t xml:space="preserve">, </w:t>
+            </w:r>
+            <w:proofErr w:type="spellStart"/>
+            <w:r>
+              <w:rPr>
+                <w:rFonts w:cs="Arial"/>
+                <w:sz w:val="24"/>
+                <w:szCs w:val="24"/>
+                <w:lang w:val="es-MX"/>
+              </w:rPr>
+              <w:t>actualizar_nota</w:t>
+            </w:r>
+            <w:proofErr w:type="spellEnd"/>
+            <w:r>
+              <w:rPr>
+                <w:rFonts w:cs="Arial"/>
+                <w:sz w:val="24"/>
+                <w:szCs w:val="24"/>
+                <w:lang w:val="es-MX"/>
+              </w:rPr>
+              <w:t xml:space="preserve">, </w:t>
+            </w:r>
+            <w:proofErr w:type="spellStart"/>
+            <w:r>
+              <w:rPr>
+                <w:rFonts w:cs="Arial"/>
+                <w:sz w:val="24"/>
+                <w:szCs w:val="24"/>
+                <w:lang w:val="es-MX"/>
+              </w:rPr>
+              <w:t>revocar_sesion</w:t>
+            </w:r>
+            <w:proofErr w:type="spellEnd"/>
+            <w:r>
+              <w:rPr>
+                <w:rFonts w:cs="Arial"/>
+                <w:sz w:val="24"/>
+                <w:szCs w:val="24"/>
+                <w:lang w:val="es-MX"/>
+              </w:rPr>
+              <w:t xml:space="preserve"> en </w:t>
+            </w:r>
+            <w:proofErr w:type="spellStart"/>
+            <w:r>
+              <w:rPr>
+                <w:rFonts w:cs="Arial"/>
+                <w:sz w:val="24"/>
+                <w:szCs w:val="24"/>
+                <w:lang w:val="es-MX"/>
+              </w:rPr>
+              <w:t>src</w:t>
+            </w:r>
+            <w:proofErr w:type="spellEnd"/>
+            <w:r>
+              <w:rPr>
+                <w:rFonts w:cs="Arial"/>
+                <w:sz w:val="24"/>
+                <w:szCs w:val="24"/>
+                <w:lang w:val="es-MX"/>
+              </w:rPr>
+              <w:t>/lab.py) y dos casos de prueba: TC-08 y TC-10</w:t>
+            </w:r>
+          </w:p>
+        </w:tc>
+      </w:tr>
+      <w:tr>
+        <w:tc>
+          <w:tcPr>
+            <w:tcW w:w="4675" w:type="dxa"/>
+            <w:vAlign w:val="center"/>
+          </w:tcPr>
+          <w:p>
+            <w:pPr>
+              <w:pStyle w:val="apa7"/>
+              <w:ind w:firstLine="0"/>
+              <w:rPr>
+                <w:sz w:val="24"/>
+                <w:szCs w:val="24"/>
+              </w:rPr>
+            </w:pPr>
+            <w:proofErr w:type="spellStart"/>
+            <w:r>
+              <w:rPr>
+                <w:rFonts w:cs="Arial"/>
+                <w:sz w:val="24"/>
+                <w:szCs w:val="24"/>
+              </w:rPr>
+              <w:t>Método</w:t>
+            </w:r>
+            <w:proofErr w:type="spellEnd"/>
+          </w:p>
+        </w:tc>
+        <w:tc>
+          <w:tcPr>
+            <w:tcW w:w="4675" w:type="dxa"/>
+            <w:vAlign w:val="center"/>
+          </w:tcPr>
+          <w:p>
+            <w:pPr>
+              <w:pStyle w:val="apa7"/>
+              <w:ind w:firstLine="0"/>
+              <w:rPr>
+                <w:sz w:val="24"/>
+                <w:szCs w:val="24"/>
+                <w:lang w:val="es-MX"/>
+              </w:rPr>
+            </w:pPr>
+            <w:r>
+              <w:rPr>
+                <w:rFonts w:cs="Arial"/>
+                <w:sz w:val="24"/>
+                <w:szCs w:val="24"/>
+                <w:lang w:val="es-MX"/>
+              </w:rPr>
+              <w:t>Lectura estática contra la lista de comprobación de la unidad (identidades y permisos; datos y validación; errores, sesión y registros; prueba y mantenibilidad), con verificación ejecutada de cada hipótesis</w:t>
+            </w:r>
+          </w:p>
+        </w:tc>
+      </w:tr>
+    </w:tbl>
+    <w:p>
+      <w:pPr>
+        <w:pStyle w:val="apa7"/>
+        <w:ind w:firstLine="0"/>
+      </w:pPr>
+    </w:p>
+    <w:tbl>
+      <w:tblPr>
+        <w:tblStyle w:val="Tablaconcuadrcula"/>
+        <w:tblW w:w="0" w:type="auto"/>
+        <w:tblLook w:val="04A0" w:firstRow="1" w:lastRow="0" w:firstColumn="1" w:lastColumn="0" w:noHBand="0" w:noVBand="1"/>
+      </w:tblPr>
+      <w:tblGrid>
+        <w:gridCol w:w="443"/>
+        <w:gridCol w:w="4072"/>
+        <w:gridCol w:w="1202"/>
+        <w:gridCol w:w="1276"/>
+        <w:gridCol w:w="2357"/>
+      </w:tblGrid>
+      <w:tr>
+        <w:tc>
+          <w:tcPr>
+            <w:tcW w:w="9350" w:type="dxa"/>
+            <w:gridSpan w:val="5"/>
+            <w:vAlign w:val="center"/>
+          </w:tcPr>
+          <w:p>
+            <w:pPr>
+              <w:spacing w:line="360" w:lineRule="auto"/>
+              <w:jc w:val="center"/>
+              <w:rPr>
+                <w:rFonts w:ascii="Arial" w:hAnsi="Arial" w:cs="Arial"/>
+                <w:b/>
+                <w:bCs/>
+                <w:sz w:val="24"/>
+                <w:szCs w:val="24"/>
+              </w:rPr>
+            </w:pPr>
+            <w:r>
+              <w:rPr>
+                <w:rFonts w:ascii="Arial" w:hAnsi="Arial" w:cs="Arial"/>
+                <w:b/>
+                <w:bCs/>
+                <w:sz w:val="24"/>
+                <w:szCs w:val="24"/>
+              </w:rPr>
+              <w:t>Observaciones</w:t>
+            </w:r>
+          </w:p>
+        </w:tc>
+      </w:tr>
+      <w:tr>
+        <w:tc>
+          <w:tcPr>
+            <w:tcW w:w="482" w:type="dxa"/>
+            <w:vAlign w:val="center"/>
+          </w:tcPr>
+          <w:p>
+            <w:pPr>
+              <w:rPr>
+                <w:rFonts w:ascii="Arial" w:hAnsi="Arial" w:cs="Arial"/>
+              </w:rPr>
+            </w:pPr>
+            <w:r>
+              <w:rPr>
+                <w:rFonts w:ascii="Arial" w:hAnsi="Arial" w:cs="Arial"/>
+                <w:b/>
+                <w:bCs/>
+              </w:rPr>
+              <w:t>ID</w:t>
+            </w:r>
+          </w:p>
+        </w:tc>
+        <w:tc>
+          <w:tcPr>
+            <w:tcW w:w="4044" w:type="dxa"/>
+            <w:vAlign w:val="center"/>
+          </w:tcPr>
+          <w:p>
+            <w:pPr>
+              <w:spacing w:line="360" w:lineRule="auto"/>
+              <w:rPr>
+                <w:rFonts w:ascii="Arial" w:hAnsi="Arial" w:cs="Arial"/>
+                <w:sz w:val="24"/>
+                <w:szCs w:val="24"/>
+              </w:rPr>
+            </w:pPr>
+            <w:proofErr w:type="spellStart"/>
+            <w:r>
+              <w:rPr>
+                <w:rFonts w:ascii="Arial" w:hAnsi="Arial" w:cs="Arial"/>
+                <w:b/>
+                <w:bCs/>
+                <w:sz w:val="24"/>
+                <w:szCs w:val="24"/>
+              </w:rPr>
+              <w:t>Observación</w:t>
+            </w:r>
+            <w:proofErr w:type="spellEnd"/>
+          </w:p>
+        </w:tc>
+        <w:tc>
+          <w:tcPr>
+            <w:tcW w:w="1205" w:type="dxa"/>
+            <w:vAlign w:val="center"/>
+          </w:tcPr>
+          <w:p>
+            <w:pPr>
+              <w:spacing w:line="360" w:lineRule="auto"/>
+              <w:rPr>
+                <w:rFonts w:ascii="Arial" w:hAnsi="Arial" w:cs="Arial"/>
+                <w:sz w:val="24"/>
+                <w:szCs w:val="24"/>
+              </w:rPr>
+            </w:pPr>
+            <w:proofErr w:type="spellStart"/>
+            <w:r>
+              <w:rPr>
+                <w:rFonts w:ascii="Arial" w:hAnsi="Arial" w:cs="Arial"/>
+                <w:b/>
+                <w:bCs/>
+                <w:sz w:val="24"/>
+                <w:szCs w:val="24"/>
+              </w:rPr>
+              <w:t>Objeto</w:t>
+            </w:r>
+            <w:proofErr w:type="spellEnd"/>
+          </w:p>
+        </w:tc>
+        <w:tc>
+          <w:tcPr>
+            <w:tcW w:w="1277" w:type="dxa"/>
+            <w:vAlign w:val="center"/>
+          </w:tcPr>
+          <w:p>
+            <w:pPr>
+              <w:spacing w:line="360" w:lineRule="auto"/>
+              <w:rPr>
+                <w:rFonts w:ascii="Arial" w:hAnsi="Arial" w:cs="Arial"/>
+                <w:sz w:val="24"/>
+                <w:szCs w:val="24"/>
+              </w:rPr>
+            </w:pPr>
+            <w:proofErr w:type="spellStart"/>
+            <w:r>
+              <w:rPr>
+                <w:rFonts w:ascii="Arial" w:hAnsi="Arial" w:cs="Arial"/>
+                <w:b/>
+                <w:bCs/>
+                <w:sz w:val="24"/>
+                <w:szCs w:val="24"/>
+              </w:rPr>
+              <w:t>Severidad</w:t>
+            </w:r>
+            <w:proofErr w:type="spellEnd"/>
+          </w:p>
+        </w:tc>
+        <w:tc>
+          <w:tcPr>
+            <w:tcW w:w="2342" w:type="dxa"/>
+            <w:vAlign w:val="center"/>
+          </w:tcPr>
+          <w:p>
+            <w:pPr>
+              <w:spacing w:line="360" w:lineRule="auto"/>
+              <w:rPr>
+                <w:rFonts w:ascii="Arial" w:hAnsi="Arial" w:cs="Arial"/>
+                <w:sz w:val="24"/>
+                <w:szCs w:val="24"/>
+              </w:rPr>
+            </w:pPr>
+            <w:proofErr w:type="spellStart"/>
+            <w:r>
+              <w:rPr>
+                <w:rFonts w:ascii="Arial" w:hAnsi="Arial" w:cs="Arial"/>
+                <w:b/>
+                <w:bCs/>
+                <w:sz w:val="24"/>
+                <w:szCs w:val="24"/>
+              </w:rPr>
+              <w:t>Acción</w:t>
+            </w:r>
+            <w:proofErr w:type="spellEnd"/>
+          </w:p>
+        </w:tc>
+      </w:tr>
+      <w:tr>
+        <w:tc>
+          <w:tcPr>
+            <w:tcW w:w="482" w:type="dxa"/>
+            <w:vAlign w:val="center"/>
+          </w:tcPr>
+          <w:p>
+            <w:pPr>
+              <w:rPr>
+                <w:rFonts w:ascii="Arial" w:hAnsi="Arial" w:cs="Arial"/>
+              </w:rPr>
+            </w:pPr>
+            <w:r>
+              <w:rPr>
+                <w:rFonts w:ascii="Arial" w:hAnsi="Arial" w:cs="Arial"/>
+              </w:rPr>
+              <w:t>D-01</w:t>
+            </w:r>
+          </w:p>
+        </w:tc>
+        <w:tc>
+          <w:tcPr>
+            <w:tcW w:w="4044" w:type="dxa"/>
+            <w:vAlign w:val="center"/>
+          </w:tcPr>
+          <w:p>
+            <w:pPr>
+              <w:spacing w:line="360" w:lineRule="auto"/>
+              <w:rPr>
+                <w:rFonts w:ascii="Arial" w:hAnsi="Arial" w:cs="Arial"/>
+                <w:sz w:val="24"/>
+                <w:szCs w:val="24"/>
+                <w:lang w:val="es-MX"/>
+              </w:rPr>
+            </w:pPr>
+            <w:proofErr w:type="spellStart"/>
+            <w:r>
+              <w:rPr>
+                <w:rFonts w:ascii="Arial" w:hAnsi="Arial" w:cs="Arial"/>
+                <w:sz w:val="24"/>
+                <w:szCs w:val="24"/>
+                <w:lang w:val="es-MX"/>
+              </w:rPr>
+              <w:t>leer_</w:t>
+            </w:r>
+            <w:proofErr w:type="gramStart"/>
+            <w:r>
+              <w:rPr>
+                <w:rFonts w:ascii="Arial" w:hAnsi="Arial" w:cs="Arial"/>
+                <w:sz w:val="24"/>
+                <w:szCs w:val="24"/>
+                <w:lang w:val="es-MX"/>
+              </w:rPr>
+              <w:t>expediente</w:t>
+            </w:r>
+            <w:proofErr w:type="spellEnd"/>
+            <w:r>
+              <w:rPr>
+                <w:rFonts w:ascii="Arial" w:hAnsi="Arial" w:cs="Arial"/>
+                <w:sz w:val="24"/>
+                <w:szCs w:val="24"/>
+                <w:lang w:val="es-MX"/>
+              </w:rPr>
+              <w:t>(</w:t>
+            </w:r>
+            <w:proofErr w:type="gramEnd"/>
+            <w:r>
+              <w:rPr>
+                <w:rFonts w:ascii="Arial" w:hAnsi="Arial" w:cs="Arial"/>
+                <w:sz w:val="24"/>
+                <w:szCs w:val="24"/>
+                <w:lang w:val="es-MX"/>
+              </w:rPr>
+              <w:t xml:space="preserve">) evalúa la existencia del expediente (404) antes de la autorización (403). Verificado: </w:t>
+            </w:r>
+            <w:proofErr w:type="spellStart"/>
+            <w:r>
+              <w:rPr>
+                <w:rFonts w:ascii="Arial" w:hAnsi="Arial" w:cs="Arial"/>
+                <w:sz w:val="24"/>
+                <w:szCs w:val="24"/>
+                <w:lang w:val="es-MX"/>
+              </w:rPr>
+              <w:t>lab-ana</w:t>
+            </w:r>
+            <w:proofErr w:type="spellEnd"/>
+            <w:r>
+              <w:rPr>
+                <w:rFonts w:ascii="Arial" w:hAnsi="Arial" w:cs="Arial"/>
+                <w:sz w:val="24"/>
+                <w:szCs w:val="24"/>
+                <w:lang w:val="es-MX"/>
+              </w:rPr>
+              <w:t xml:space="preserve"> sobre 999 devuelve 404 y sobre 202 devuelve 403. La diferencia permite a un estudiante no autorizado deducir qué identificadores existen. El </w:t>
+            </w:r>
+            <w:r>
+              <w:rPr>
+                <w:rFonts w:ascii="Arial" w:hAnsi="Arial" w:cs="Arial"/>
+                <w:sz w:val="24"/>
+                <w:szCs w:val="24"/>
+                <w:lang w:val="es-MX"/>
+              </w:rPr>
+              <w:lastRenderedPageBreak/>
+              <w:t>cuerpo no filtra datos, pero el código de estado sí informa.</w:t>
+            </w:r>
+          </w:p>
+        </w:tc>
+        <w:tc>
+          <w:tcPr>
+            <w:tcW w:w="1205" w:type="dxa"/>
+            <w:vAlign w:val="center"/>
+          </w:tcPr>
+          <w:p>
+            <w:pPr>
+              <w:spacing w:line="360" w:lineRule="auto"/>
+              <w:rPr>
+                <w:rFonts w:ascii="Arial" w:hAnsi="Arial" w:cs="Arial"/>
+                <w:sz w:val="24"/>
+                <w:szCs w:val="24"/>
+              </w:rPr>
+            </w:pPr>
+            <w:r>
+              <w:rPr>
+                <w:rFonts w:ascii="Arial" w:hAnsi="Arial" w:cs="Arial"/>
+                <w:sz w:val="24"/>
+                <w:szCs w:val="24"/>
+              </w:rPr>
+              <w:lastRenderedPageBreak/>
+              <w:t xml:space="preserve">Política de </w:t>
+            </w:r>
+            <w:proofErr w:type="spellStart"/>
+            <w:r>
+              <w:rPr>
+                <w:rFonts w:ascii="Arial" w:hAnsi="Arial" w:cs="Arial"/>
+                <w:sz w:val="24"/>
+                <w:szCs w:val="24"/>
+              </w:rPr>
+              <w:t>acceso</w:t>
+            </w:r>
+            <w:proofErr w:type="spellEnd"/>
+          </w:p>
+        </w:tc>
+        <w:tc>
+          <w:tcPr>
+            <w:tcW w:w="1277" w:type="dxa"/>
+            <w:vAlign w:val="center"/>
+          </w:tcPr>
+          <w:p>
+            <w:pPr>
+              <w:spacing w:line="360" w:lineRule="auto"/>
+              <w:rPr>
+                <w:rFonts w:ascii="Arial" w:hAnsi="Arial" w:cs="Arial"/>
+                <w:sz w:val="24"/>
+                <w:szCs w:val="24"/>
+              </w:rPr>
+            </w:pPr>
+            <w:r>
+              <w:rPr>
+                <w:rFonts w:ascii="Arial" w:hAnsi="Arial" w:cs="Arial"/>
+                <w:sz w:val="24"/>
+                <w:szCs w:val="24"/>
+              </w:rPr>
+              <w:t>Media</w:t>
+            </w:r>
+          </w:p>
+        </w:tc>
+        <w:tc>
+          <w:tcPr>
+            <w:tcW w:w="2342" w:type="dxa"/>
+            <w:vAlign w:val="center"/>
+          </w:tcPr>
+          <w:p>
+            <w:pPr>
+              <w:spacing w:line="360" w:lineRule="auto"/>
+              <w:rPr>
+                <w:rFonts w:ascii="Arial" w:hAnsi="Arial" w:cs="Arial"/>
+                <w:sz w:val="24"/>
+                <w:szCs w:val="24"/>
+                <w:lang w:val="es-MX"/>
+              </w:rPr>
+            </w:pPr>
+            <w:r>
+              <w:rPr>
+                <w:rFonts w:ascii="Arial" w:hAnsi="Arial" w:cs="Arial"/>
+                <w:sz w:val="24"/>
+                <w:szCs w:val="24"/>
+                <w:lang w:val="es-MX"/>
+              </w:rPr>
+              <w:t>Pendiente de corrección: unificar la respuesta (403 en ambos casos, o 404 en ambos) para no distinguir «no existe» de «no autorizado».</w:t>
+            </w:r>
+          </w:p>
+        </w:tc>
+      </w:tr>
+      <w:tr>
+        <w:tc>
+          <w:tcPr>
+            <w:tcW w:w="482" w:type="dxa"/>
+            <w:vAlign w:val="center"/>
+          </w:tcPr>
+          <w:p>
+            <w:pPr>
+              <w:rPr>
+                <w:rFonts w:ascii="Arial" w:hAnsi="Arial" w:cs="Arial"/>
+              </w:rPr>
+            </w:pPr>
+            <w:r>
+              <w:rPr>
+                <w:rFonts w:ascii="Arial" w:hAnsi="Arial" w:cs="Arial"/>
+              </w:rPr>
+              <w:t>D-02</w:t>
+            </w:r>
+          </w:p>
+        </w:tc>
+        <w:tc>
+          <w:tcPr>
+            <w:tcW w:w="4044" w:type="dxa"/>
+            <w:vAlign w:val="center"/>
+          </w:tcPr>
+          <w:p>
+            <w:pPr>
+              <w:spacing w:line="360" w:lineRule="auto"/>
+              <w:rPr>
+                <w:rFonts w:ascii="Arial" w:hAnsi="Arial" w:cs="Arial"/>
+                <w:sz w:val="24"/>
+                <w:szCs w:val="24"/>
+                <w:lang w:val="es-MX"/>
+              </w:rPr>
+            </w:pPr>
+            <w:proofErr w:type="spellStart"/>
+            <w:r>
+              <w:rPr>
+                <w:rFonts w:ascii="Arial" w:hAnsi="Arial" w:cs="Arial"/>
+                <w:sz w:val="24"/>
+                <w:szCs w:val="24"/>
+                <w:lang w:val="es-MX"/>
+              </w:rPr>
+              <w:t>actualizar_</w:t>
+            </w:r>
+            <w:proofErr w:type="gramStart"/>
+            <w:r>
+              <w:rPr>
+                <w:rFonts w:ascii="Arial" w:hAnsi="Arial" w:cs="Arial"/>
+                <w:sz w:val="24"/>
+                <w:szCs w:val="24"/>
+                <w:lang w:val="es-MX"/>
+              </w:rPr>
+              <w:t>nota</w:t>
+            </w:r>
+            <w:proofErr w:type="spellEnd"/>
+            <w:r>
+              <w:rPr>
+                <w:rFonts w:ascii="Arial" w:hAnsi="Arial" w:cs="Arial"/>
+                <w:sz w:val="24"/>
+                <w:szCs w:val="24"/>
+                <w:lang w:val="es-MX"/>
+              </w:rPr>
+              <w:t>(</w:t>
+            </w:r>
+            <w:proofErr w:type="gramEnd"/>
+            <w:r>
+              <w:rPr>
+                <w:rFonts w:ascii="Arial" w:hAnsi="Arial" w:cs="Arial"/>
+                <w:sz w:val="24"/>
+                <w:szCs w:val="24"/>
+                <w:lang w:val="es-MX"/>
+              </w:rPr>
+              <w:t xml:space="preserve">) valida con </w:t>
+            </w:r>
+            <w:proofErr w:type="spellStart"/>
+            <w:proofErr w:type="gramStart"/>
+            <w:r>
+              <w:rPr>
+                <w:rFonts w:ascii="Arial" w:hAnsi="Arial" w:cs="Arial"/>
+                <w:sz w:val="24"/>
+                <w:szCs w:val="24"/>
+                <w:lang w:val="es-MX"/>
+              </w:rPr>
+              <w:t>isinstance</w:t>
+            </w:r>
+            <w:proofErr w:type="spellEnd"/>
+            <w:r>
+              <w:rPr>
+                <w:rFonts w:ascii="Arial" w:hAnsi="Arial" w:cs="Arial"/>
+                <w:sz w:val="24"/>
+                <w:szCs w:val="24"/>
+                <w:lang w:val="es-MX"/>
+              </w:rPr>
+              <w:t>(</w:t>
+            </w:r>
+            <w:proofErr w:type="gramEnd"/>
+            <w:r>
+              <w:rPr>
+                <w:rFonts w:ascii="Arial" w:hAnsi="Arial" w:cs="Arial"/>
+                <w:sz w:val="24"/>
+                <w:szCs w:val="24"/>
+                <w:lang w:val="es-MX"/>
+              </w:rPr>
+              <w:t>nota, (</w:t>
+            </w:r>
+            <w:proofErr w:type="spellStart"/>
+            <w:r>
+              <w:rPr>
+                <w:rFonts w:ascii="Arial" w:hAnsi="Arial" w:cs="Arial"/>
+                <w:sz w:val="24"/>
+                <w:szCs w:val="24"/>
+                <w:lang w:val="es-MX"/>
+              </w:rPr>
+              <w:t>int</w:t>
+            </w:r>
+            <w:proofErr w:type="spellEnd"/>
+            <w:r>
+              <w:rPr>
+                <w:rFonts w:ascii="Arial" w:hAnsi="Arial" w:cs="Arial"/>
+                <w:sz w:val="24"/>
+                <w:szCs w:val="24"/>
+                <w:lang w:val="es-MX"/>
+              </w:rPr>
+              <w:t xml:space="preserve">, </w:t>
+            </w:r>
+            <w:proofErr w:type="spellStart"/>
+            <w:r>
+              <w:rPr>
+                <w:rFonts w:ascii="Arial" w:hAnsi="Arial" w:cs="Arial"/>
+                <w:sz w:val="24"/>
+                <w:szCs w:val="24"/>
+                <w:lang w:val="es-MX"/>
+              </w:rPr>
+              <w:t>float</w:t>
+            </w:r>
+            <w:proofErr w:type="spellEnd"/>
+            <w:r>
+              <w:rPr>
+                <w:rFonts w:ascii="Arial" w:hAnsi="Arial" w:cs="Arial"/>
+                <w:sz w:val="24"/>
+                <w:szCs w:val="24"/>
+                <w:lang w:val="es-MX"/>
+              </w:rPr>
+              <w:t xml:space="preserve">)), y en Python </w:t>
+            </w:r>
+            <w:proofErr w:type="spellStart"/>
+            <w:r>
+              <w:rPr>
+                <w:rFonts w:ascii="Arial" w:hAnsi="Arial" w:cs="Arial"/>
+                <w:sz w:val="24"/>
+                <w:szCs w:val="24"/>
+                <w:lang w:val="es-MX"/>
+              </w:rPr>
+              <w:t>bool</w:t>
+            </w:r>
+            <w:proofErr w:type="spellEnd"/>
+            <w:r>
+              <w:rPr>
+                <w:rFonts w:ascii="Arial" w:hAnsi="Arial" w:cs="Arial"/>
+                <w:sz w:val="24"/>
+                <w:szCs w:val="24"/>
+                <w:lang w:val="es-MX"/>
+              </w:rPr>
+              <w:t xml:space="preserve"> es subclase de </w:t>
+            </w:r>
+            <w:proofErr w:type="spellStart"/>
+            <w:r>
+              <w:rPr>
+                <w:rFonts w:ascii="Arial" w:hAnsi="Arial" w:cs="Arial"/>
+                <w:sz w:val="24"/>
+                <w:szCs w:val="24"/>
+                <w:lang w:val="es-MX"/>
+              </w:rPr>
+              <w:t>int</w:t>
+            </w:r>
+            <w:proofErr w:type="spellEnd"/>
+            <w:r>
+              <w:rPr>
+                <w:rFonts w:ascii="Arial" w:hAnsi="Arial" w:cs="Arial"/>
+                <w:sz w:val="24"/>
+                <w:szCs w:val="24"/>
+                <w:lang w:val="es-MX"/>
+              </w:rPr>
+              <w:t>. Verificado: {"nota": true} devuelve 200 y persiste True como calificación. SEC-04 exige rechazar valores no numéricos con 400.</w:t>
+            </w:r>
+          </w:p>
+        </w:tc>
+        <w:tc>
+          <w:tcPr>
+            <w:tcW w:w="1205" w:type="dxa"/>
+            <w:vAlign w:val="center"/>
+          </w:tcPr>
+          <w:p>
+            <w:pPr>
+              <w:spacing w:line="360" w:lineRule="auto"/>
+              <w:rPr>
+                <w:rFonts w:ascii="Arial" w:hAnsi="Arial" w:cs="Arial"/>
+                <w:sz w:val="24"/>
+                <w:szCs w:val="24"/>
+              </w:rPr>
+            </w:pPr>
+            <w:r>
+              <w:rPr>
+                <w:rFonts w:ascii="Arial" w:hAnsi="Arial" w:cs="Arial"/>
+                <w:sz w:val="24"/>
+                <w:szCs w:val="24"/>
+              </w:rPr>
+              <w:t xml:space="preserve">Política de </w:t>
+            </w:r>
+            <w:proofErr w:type="spellStart"/>
+            <w:r>
+              <w:rPr>
+                <w:rFonts w:ascii="Arial" w:hAnsi="Arial" w:cs="Arial"/>
+                <w:sz w:val="24"/>
+                <w:szCs w:val="24"/>
+              </w:rPr>
+              <w:t>acceso</w:t>
+            </w:r>
+            <w:proofErr w:type="spellEnd"/>
+            <w:r>
+              <w:rPr>
+                <w:rFonts w:ascii="Arial" w:hAnsi="Arial" w:cs="Arial"/>
+                <w:sz w:val="24"/>
+                <w:szCs w:val="24"/>
+              </w:rPr>
+              <w:t xml:space="preserve"> / </w:t>
+            </w:r>
+            <w:proofErr w:type="spellStart"/>
+            <w:r>
+              <w:rPr>
+                <w:rFonts w:ascii="Arial" w:hAnsi="Arial" w:cs="Arial"/>
+                <w:sz w:val="24"/>
+                <w:szCs w:val="24"/>
+              </w:rPr>
+              <w:t>validación</w:t>
+            </w:r>
+            <w:proofErr w:type="spellEnd"/>
+          </w:p>
+        </w:tc>
+        <w:tc>
+          <w:tcPr>
+            <w:tcW w:w="1277" w:type="dxa"/>
+            <w:vAlign w:val="center"/>
+          </w:tcPr>
+          <w:p>
+            <w:pPr>
+              <w:spacing w:line="360" w:lineRule="auto"/>
+              <w:rPr>
+                <w:rFonts w:ascii="Arial" w:hAnsi="Arial" w:cs="Arial"/>
+                <w:sz w:val="24"/>
+                <w:szCs w:val="24"/>
+              </w:rPr>
+            </w:pPr>
+            <w:r>
+              <w:rPr>
+                <w:rFonts w:ascii="Arial" w:hAnsi="Arial" w:cs="Arial"/>
+                <w:sz w:val="24"/>
+                <w:szCs w:val="24"/>
+              </w:rPr>
+              <w:t>Media</w:t>
+            </w:r>
+          </w:p>
+        </w:tc>
+        <w:tc>
+          <w:tcPr>
+            <w:tcW w:w="2342" w:type="dxa"/>
+            <w:vAlign w:val="center"/>
+          </w:tcPr>
+          <w:p>
+            <w:pPr>
+              <w:spacing w:line="360" w:lineRule="auto"/>
+              <w:rPr>
+                <w:rFonts w:ascii="Arial" w:hAnsi="Arial" w:cs="Arial"/>
+                <w:sz w:val="24"/>
+                <w:szCs w:val="24"/>
+                <w:lang w:val="es-MX"/>
+              </w:rPr>
+            </w:pPr>
+            <w:r>
+              <w:rPr>
+                <w:rFonts w:ascii="Arial" w:hAnsi="Arial" w:cs="Arial"/>
+                <w:sz w:val="24"/>
+                <w:szCs w:val="24"/>
+                <w:lang w:val="es-MX"/>
+              </w:rPr>
+              <w:t xml:space="preserve">Pendiente de corrección: excluir </w:t>
+            </w:r>
+            <w:proofErr w:type="spellStart"/>
+            <w:r>
+              <w:rPr>
+                <w:rFonts w:ascii="Arial" w:hAnsi="Arial" w:cs="Arial"/>
+                <w:sz w:val="24"/>
+                <w:szCs w:val="24"/>
+                <w:lang w:val="es-MX"/>
+              </w:rPr>
+              <w:t>bool</w:t>
+            </w:r>
+            <w:proofErr w:type="spellEnd"/>
+            <w:r>
+              <w:rPr>
+                <w:rFonts w:ascii="Arial" w:hAnsi="Arial" w:cs="Arial"/>
+                <w:sz w:val="24"/>
+                <w:szCs w:val="24"/>
+                <w:lang w:val="es-MX"/>
+              </w:rPr>
+              <w:t xml:space="preserve"> explícitamente en la validación de tipo.</w:t>
+            </w:r>
+          </w:p>
+        </w:tc>
+      </w:tr>
+      <w:tr>
+        <w:tc>
+          <w:tcPr>
+            <w:tcW w:w="482" w:type="dxa"/>
+            <w:vAlign w:val="center"/>
+          </w:tcPr>
+          <w:p>
+            <w:pPr>
+              <w:rPr>
+                <w:rFonts w:ascii="Arial" w:hAnsi="Arial" w:cs="Arial"/>
+              </w:rPr>
+            </w:pPr>
+            <w:r>
+              <w:rPr>
+                <w:rFonts w:ascii="Arial" w:hAnsi="Arial" w:cs="Arial"/>
+              </w:rPr>
+              <w:t>D-03</w:t>
+            </w:r>
+          </w:p>
+        </w:tc>
+        <w:tc>
+          <w:tcPr>
+            <w:tcW w:w="4044" w:type="dxa"/>
+            <w:vAlign w:val="center"/>
+          </w:tcPr>
+          <w:p>
+            <w:pPr>
+              <w:spacing w:line="360" w:lineRule="auto"/>
+              <w:rPr>
+                <w:rFonts w:ascii="Arial" w:hAnsi="Arial" w:cs="Arial"/>
+                <w:sz w:val="24"/>
+                <w:szCs w:val="24"/>
+              </w:rPr>
+            </w:pPr>
+            <w:proofErr w:type="spellStart"/>
+            <w:r>
+              <w:rPr>
+                <w:rFonts w:ascii="Arial" w:hAnsi="Arial" w:cs="Arial"/>
+                <w:sz w:val="24"/>
+                <w:szCs w:val="24"/>
+                <w:lang w:val="es-MX"/>
+              </w:rPr>
+              <w:t>revocar_</w:t>
+            </w:r>
+            <w:proofErr w:type="gramStart"/>
+            <w:r>
+              <w:rPr>
+                <w:rFonts w:ascii="Arial" w:hAnsi="Arial" w:cs="Arial"/>
+                <w:sz w:val="24"/>
+                <w:szCs w:val="24"/>
+                <w:lang w:val="es-MX"/>
+              </w:rPr>
+              <w:t>sesion</w:t>
+            </w:r>
+            <w:proofErr w:type="spellEnd"/>
+            <w:r>
+              <w:rPr>
+                <w:rFonts w:ascii="Arial" w:hAnsi="Arial" w:cs="Arial"/>
+                <w:sz w:val="24"/>
+                <w:szCs w:val="24"/>
+                <w:lang w:val="es-MX"/>
+              </w:rPr>
+              <w:t>(</w:t>
+            </w:r>
+            <w:proofErr w:type="gramEnd"/>
+            <w:r>
+              <w:rPr>
+                <w:rFonts w:ascii="Arial" w:hAnsi="Arial" w:cs="Arial"/>
+                <w:sz w:val="24"/>
+                <w:szCs w:val="24"/>
+                <w:lang w:val="es-MX"/>
+              </w:rPr>
+              <w:t xml:space="preserve">) consulta estado["sesiones"] directamente sin pasar por </w:t>
+            </w:r>
+            <w:proofErr w:type="gramStart"/>
+            <w:r>
+              <w:rPr>
+                <w:rFonts w:ascii="Arial" w:hAnsi="Arial" w:cs="Arial"/>
+                <w:sz w:val="24"/>
+                <w:szCs w:val="24"/>
+                <w:lang w:val="es-MX"/>
+              </w:rPr>
+              <w:t>autenticar(</w:t>
+            </w:r>
+            <w:proofErr w:type="gramEnd"/>
+            <w:r>
+              <w:rPr>
+                <w:rFonts w:ascii="Arial" w:hAnsi="Arial" w:cs="Arial"/>
+                <w:sz w:val="24"/>
+                <w:szCs w:val="24"/>
+                <w:lang w:val="es-MX"/>
+              </w:rPr>
+              <w:t>), por lo que SEC-03 no se aplica en esa ruta. Verificado: revocar con sesión expirada (</w:t>
+            </w:r>
+            <w:proofErr w:type="spellStart"/>
+            <w:r>
+              <w:rPr>
+                <w:rFonts w:ascii="Arial" w:hAnsi="Arial" w:cs="Arial"/>
+                <w:sz w:val="24"/>
+                <w:szCs w:val="24"/>
+                <w:lang w:val="es-MX"/>
+              </w:rPr>
+              <w:t>lab</w:t>
+            </w:r>
+            <w:proofErr w:type="spellEnd"/>
+            <w:r>
+              <w:rPr>
+                <w:rFonts w:ascii="Arial" w:hAnsi="Arial" w:cs="Arial"/>
+                <w:sz w:val="24"/>
+                <w:szCs w:val="24"/>
+                <w:lang w:val="es-MX"/>
+              </w:rPr>
+              <w:t xml:space="preserve">-vencida) devuelve 200, y revocar una sesión ya revocada vuelve a devolver 200, cuando SEC-03 exige 401 para cualquier solicitud con token inválido. </w:t>
+            </w:r>
+            <w:proofErr w:type="spellStart"/>
+            <w:r>
+              <w:rPr>
+                <w:rFonts w:ascii="Arial" w:hAnsi="Arial" w:cs="Arial"/>
+                <w:sz w:val="24"/>
+                <w:szCs w:val="24"/>
+              </w:rPr>
+              <w:t>Ningún</w:t>
+            </w:r>
+            <w:proofErr w:type="spellEnd"/>
+            <w:r>
+              <w:rPr>
+                <w:rFonts w:ascii="Arial" w:hAnsi="Arial" w:cs="Arial"/>
+                <w:sz w:val="24"/>
+                <w:szCs w:val="24"/>
+              </w:rPr>
+              <w:t xml:space="preserve"> </w:t>
+            </w:r>
+            <w:proofErr w:type="spellStart"/>
+            <w:r>
+              <w:rPr>
+                <w:rFonts w:ascii="Arial" w:hAnsi="Arial" w:cs="Arial"/>
+                <w:sz w:val="24"/>
+                <w:szCs w:val="24"/>
+              </w:rPr>
+              <w:t>caso</w:t>
+            </w:r>
+            <w:proofErr w:type="spellEnd"/>
+            <w:r>
+              <w:rPr>
+                <w:rFonts w:ascii="Arial" w:hAnsi="Arial" w:cs="Arial"/>
+                <w:sz w:val="24"/>
+                <w:szCs w:val="24"/>
+              </w:rPr>
+              <w:t xml:space="preserve"> de </w:t>
+            </w:r>
+            <w:proofErr w:type="spellStart"/>
+            <w:r>
+              <w:rPr>
+                <w:rFonts w:ascii="Arial" w:hAnsi="Arial" w:cs="Arial"/>
+                <w:sz w:val="24"/>
+                <w:szCs w:val="24"/>
+              </w:rPr>
+              <w:t>prueba</w:t>
+            </w:r>
+            <w:proofErr w:type="spellEnd"/>
+            <w:r>
+              <w:rPr>
+                <w:rFonts w:ascii="Arial" w:hAnsi="Arial" w:cs="Arial"/>
+                <w:sz w:val="24"/>
+                <w:szCs w:val="24"/>
+              </w:rPr>
+              <w:t xml:space="preserve"> </w:t>
+            </w:r>
+            <w:proofErr w:type="spellStart"/>
+            <w:r>
+              <w:rPr>
+                <w:rFonts w:ascii="Arial" w:hAnsi="Arial" w:cs="Arial"/>
+                <w:sz w:val="24"/>
+                <w:szCs w:val="24"/>
+              </w:rPr>
+              <w:t>cubre</w:t>
+            </w:r>
+            <w:proofErr w:type="spellEnd"/>
+            <w:r>
+              <w:rPr>
+                <w:rFonts w:ascii="Arial" w:hAnsi="Arial" w:cs="Arial"/>
+                <w:sz w:val="24"/>
+                <w:szCs w:val="24"/>
+              </w:rPr>
+              <w:t xml:space="preserve"> </w:t>
+            </w:r>
+            <w:proofErr w:type="spellStart"/>
+            <w:r>
+              <w:rPr>
+                <w:rFonts w:ascii="Arial" w:hAnsi="Arial" w:cs="Arial"/>
+                <w:sz w:val="24"/>
+                <w:szCs w:val="24"/>
+              </w:rPr>
+              <w:t>esta</w:t>
+            </w:r>
+            <w:proofErr w:type="spellEnd"/>
+            <w:r>
+              <w:rPr>
+                <w:rFonts w:ascii="Arial" w:hAnsi="Arial" w:cs="Arial"/>
+                <w:sz w:val="24"/>
+                <w:szCs w:val="24"/>
+              </w:rPr>
+              <w:t xml:space="preserve"> </w:t>
+            </w:r>
+            <w:proofErr w:type="spellStart"/>
+            <w:r>
+              <w:rPr>
+                <w:rFonts w:ascii="Arial" w:hAnsi="Arial" w:cs="Arial"/>
+                <w:sz w:val="24"/>
+                <w:szCs w:val="24"/>
+              </w:rPr>
+              <w:t>ruta</w:t>
+            </w:r>
+            <w:proofErr w:type="spellEnd"/>
+            <w:r>
+              <w:rPr>
+                <w:rFonts w:ascii="Arial" w:hAnsi="Arial" w:cs="Arial"/>
+                <w:sz w:val="24"/>
+                <w:szCs w:val="24"/>
+              </w:rPr>
+              <w:t>.</w:t>
+            </w:r>
+          </w:p>
+        </w:tc>
+        <w:tc>
+          <w:tcPr>
+            <w:tcW w:w="1205" w:type="dxa"/>
+            <w:vAlign w:val="center"/>
+          </w:tcPr>
+          <w:p>
+            <w:pPr>
+              <w:spacing w:line="360" w:lineRule="auto"/>
+              <w:rPr>
+                <w:rFonts w:ascii="Arial" w:hAnsi="Arial" w:cs="Arial"/>
+                <w:sz w:val="24"/>
+                <w:szCs w:val="24"/>
+              </w:rPr>
+            </w:pPr>
+            <w:r>
+              <w:rPr>
+                <w:rFonts w:ascii="Arial" w:hAnsi="Arial" w:cs="Arial"/>
+                <w:sz w:val="24"/>
+                <w:szCs w:val="24"/>
+              </w:rPr>
+              <w:t xml:space="preserve">Política de </w:t>
+            </w:r>
+            <w:proofErr w:type="spellStart"/>
+            <w:r>
+              <w:rPr>
+                <w:rFonts w:ascii="Arial" w:hAnsi="Arial" w:cs="Arial"/>
+                <w:sz w:val="24"/>
+                <w:szCs w:val="24"/>
+              </w:rPr>
+              <w:t>acceso</w:t>
+            </w:r>
+            <w:proofErr w:type="spellEnd"/>
+          </w:p>
+        </w:tc>
+        <w:tc>
+          <w:tcPr>
+            <w:tcW w:w="1277" w:type="dxa"/>
+            <w:vAlign w:val="center"/>
+          </w:tcPr>
+          <w:p>
+            <w:pPr>
+              <w:spacing w:line="360" w:lineRule="auto"/>
+              <w:rPr>
+                <w:rFonts w:ascii="Arial" w:hAnsi="Arial" w:cs="Arial"/>
+                <w:sz w:val="24"/>
+                <w:szCs w:val="24"/>
+              </w:rPr>
+            </w:pPr>
+            <w:r>
+              <w:rPr>
+                <w:rFonts w:ascii="Arial" w:hAnsi="Arial" w:cs="Arial"/>
+                <w:sz w:val="24"/>
+                <w:szCs w:val="24"/>
+              </w:rPr>
+              <w:t>Media</w:t>
+            </w:r>
+          </w:p>
+        </w:tc>
+        <w:tc>
+          <w:tcPr>
+            <w:tcW w:w="2342" w:type="dxa"/>
+            <w:vAlign w:val="center"/>
+          </w:tcPr>
+          <w:p>
+            <w:pPr>
+              <w:spacing w:line="360" w:lineRule="auto"/>
+              <w:rPr>
+                <w:rFonts w:ascii="Arial" w:hAnsi="Arial" w:cs="Arial"/>
+                <w:sz w:val="24"/>
+                <w:szCs w:val="24"/>
+                <w:lang w:val="es-MX"/>
+              </w:rPr>
+            </w:pPr>
+            <w:r>
+              <w:rPr>
+                <w:rFonts w:ascii="Arial" w:hAnsi="Arial" w:cs="Arial"/>
+                <w:sz w:val="24"/>
+                <w:szCs w:val="24"/>
+                <w:lang w:val="es-MX"/>
+              </w:rPr>
+              <w:t xml:space="preserve">Pendiente de corrección: aplicar </w:t>
+            </w:r>
+            <w:proofErr w:type="gramStart"/>
+            <w:r>
+              <w:rPr>
+                <w:rFonts w:ascii="Arial" w:hAnsi="Arial" w:cs="Arial"/>
+                <w:sz w:val="24"/>
+                <w:szCs w:val="24"/>
+                <w:lang w:val="es-MX"/>
+              </w:rPr>
+              <w:t>autenticar(</w:t>
+            </w:r>
+            <w:proofErr w:type="gramEnd"/>
+            <w:r>
+              <w:rPr>
+                <w:rFonts w:ascii="Arial" w:hAnsi="Arial" w:cs="Arial"/>
+                <w:sz w:val="24"/>
+                <w:szCs w:val="24"/>
+                <w:lang w:val="es-MX"/>
+              </w:rPr>
+              <w:t>) también en la revocación, o documentar la idempotencia como excepción aprobada.</w:t>
+            </w:r>
+          </w:p>
+        </w:tc>
+      </w:tr>
+      <w:tr>
+        <w:tc>
+          <w:tcPr>
+            <w:tcW w:w="482" w:type="dxa"/>
+            <w:vAlign w:val="center"/>
+          </w:tcPr>
+          <w:p>
+            <w:pPr>
+              <w:rPr>
+                <w:rFonts w:ascii="Arial" w:hAnsi="Arial" w:cs="Arial"/>
+              </w:rPr>
+            </w:pPr>
+            <w:r>
+              <w:rPr>
+                <w:rFonts w:ascii="Arial" w:hAnsi="Arial" w:cs="Arial"/>
+              </w:rPr>
+              <w:t>D-04</w:t>
+            </w:r>
+          </w:p>
+        </w:tc>
+        <w:tc>
+          <w:tcPr>
+            <w:tcW w:w="4044" w:type="dxa"/>
+            <w:vAlign w:val="center"/>
+          </w:tcPr>
+          <w:p>
+            <w:pPr>
+              <w:spacing w:line="360" w:lineRule="auto"/>
+              <w:rPr>
+                <w:rFonts w:ascii="Arial" w:hAnsi="Arial" w:cs="Arial"/>
+                <w:sz w:val="24"/>
+                <w:szCs w:val="24"/>
+                <w:lang w:val="es-MX"/>
+              </w:rPr>
+            </w:pPr>
+            <w:r>
+              <w:rPr>
+                <w:rFonts w:ascii="Arial" w:hAnsi="Arial" w:cs="Arial"/>
+                <w:sz w:val="24"/>
+                <w:szCs w:val="24"/>
+                <w:lang w:val="es-MX"/>
+              </w:rPr>
+              <w:t xml:space="preserve">El objetivo documentado de TC-08 declara que el administrador «puede leer expedientes de ambas </w:t>
+            </w:r>
+            <w:proofErr w:type="gramStart"/>
+            <w:r>
+              <w:rPr>
+                <w:rFonts w:ascii="Arial" w:hAnsi="Arial" w:cs="Arial"/>
+                <w:sz w:val="24"/>
+                <w:szCs w:val="24"/>
+                <w:lang w:val="es-MX"/>
+              </w:rPr>
+              <w:t>sedes</w:t>
+            </w:r>
+            <w:proofErr w:type="gramEnd"/>
+            <w:r>
+              <w:rPr>
+                <w:rFonts w:ascii="Arial" w:hAnsi="Arial" w:cs="Arial"/>
+                <w:sz w:val="24"/>
+                <w:szCs w:val="24"/>
+                <w:lang w:val="es-MX"/>
+              </w:rPr>
+              <w:t xml:space="preserve"> pero nunca modificar notas»; la prueba </w:t>
+            </w:r>
+            <w:proofErr w:type="spellStart"/>
+            <w:r>
+              <w:rPr>
+                <w:rFonts w:ascii="Arial" w:hAnsi="Arial" w:cs="Arial"/>
+                <w:sz w:val="24"/>
+                <w:szCs w:val="24"/>
+                <w:lang w:val="es-MX"/>
+              </w:rPr>
+              <w:t>test_administrador_no_actualiza_notas</w:t>
+            </w:r>
+            <w:proofErr w:type="spellEnd"/>
+            <w:r>
+              <w:rPr>
+                <w:rFonts w:ascii="Arial" w:hAnsi="Arial" w:cs="Arial"/>
+                <w:sz w:val="24"/>
+                <w:szCs w:val="24"/>
+                <w:lang w:val="es-MX"/>
+              </w:rPr>
+              <w:t xml:space="preserve"> solo verifica la segunda mitad. Verificado: el administrador lee 101 y 202 con 200, pero ninguna prueba ejercita esa ruta.</w:t>
+            </w:r>
+          </w:p>
+        </w:tc>
+        <w:tc>
+          <w:tcPr>
+            <w:tcW w:w="1205" w:type="dxa"/>
+            <w:vAlign w:val="center"/>
+          </w:tcPr>
+          <w:p>
+            <w:pPr>
+              <w:spacing w:line="360" w:lineRule="auto"/>
+              <w:rPr>
+                <w:rFonts w:ascii="Arial" w:hAnsi="Arial" w:cs="Arial"/>
+                <w:sz w:val="24"/>
+                <w:szCs w:val="24"/>
+              </w:rPr>
+            </w:pPr>
+            <w:r>
+              <w:rPr>
+                <w:rFonts w:ascii="Arial" w:hAnsi="Arial" w:cs="Arial"/>
+                <w:sz w:val="24"/>
+                <w:szCs w:val="24"/>
+              </w:rPr>
+              <w:t xml:space="preserve">Caso de </w:t>
+            </w:r>
+            <w:proofErr w:type="spellStart"/>
+            <w:r>
+              <w:rPr>
+                <w:rFonts w:ascii="Arial" w:hAnsi="Arial" w:cs="Arial"/>
+                <w:sz w:val="24"/>
+                <w:szCs w:val="24"/>
+              </w:rPr>
+              <w:t>prueba</w:t>
+            </w:r>
+            <w:proofErr w:type="spellEnd"/>
+            <w:r>
+              <w:rPr>
+                <w:rFonts w:ascii="Arial" w:hAnsi="Arial" w:cs="Arial"/>
+                <w:sz w:val="24"/>
+                <w:szCs w:val="24"/>
+              </w:rPr>
+              <w:t xml:space="preserve"> TC-08</w:t>
+            </w:r>
+          </w:p>
+        </w:tc>
+        <w:tc>
+          <w:tcPr>
+            <w:tcW w:w="1277" w:type="dxa"/>
+            <w:vAlign w:val="center"/>
+          </w:tcPr>
+          <w:p>
+            <w:pPr>
+              <w:spacing w:line="360" w:lineRule="auto"/>
+              <w:rPr>
+                <w:rFonts w:ascii="Arial" w:hAnsi="Arial" w:cs="Arial"/>
+                <w:sz w:val="24"/>
+                <w:szCs w:val="24"/>
+              </w:rPr>
+            </w:pPr>
+            <w:r>
+              <w:rPr>
+                <w:rFonts w:ascii="Arial" w:hAnsi="Arial" w:cs="Arial"/>
+                <w:sz w:val="24"/>
+                <w:szCs w:val="24"/>
+              </w:rPr>
+              <w:t>Baja</w:t>
+            </w:r>
+          </w:p>
+        </w:tc>
+        <w:tc>
+          <w:tcPr>
+            <w:tcW w:w="2342" w:type="dxa"/>
+            <w:vAlign w:val="center"/>
+          </w:tcPr>
+          <w:p>
+            <w:pPr>
+              <w:spacing w:line="360" w:lineRule="auto"/>
+              <w:rPr>
+                <w:rFonts w:ascii="Arial" w:hAnsi="Arial" w:cs="Arial"/>
+                <w:sz w:val="24"/>
+                <w:szCs w:val="24"/>
+                <w:lang w:val="es-MX"/>
+              </w:rPr>
+            </w:pPr>
+            <w:r>
+              <w:rPr>
+                <w:rFonts w:ascii="Arial" w:hAnsi="Arial" w:cs="Arial"/>
+                <w:sz w:val="24"/>
+                <w:szCs w:val="24"/>
+                <w:lang w:val="es-MX"/>
+              </w:rPr>
+              <w:t>Pendiente de corrección: agregar la prueba de lectura del administrador, o acotar el objetivo documentado.</w:t>
+            </w:r>
+          </w:p>
+        </w:tc>
+      </w:tr>
+      <w:tr>
+        <w:tc>
+          <w:tcPr>
+            <w:tcW w:w="482" w:type="dxa"/>
+            <w:vAlign w:val="center"/>
+          </w:tcPr>
+          <w:p>
+            <w:pPr>
+              <w:rPr>
+                <w:rFonts w:ascii="Arial" w:hAnsi="Arial" w:cs="Arial"/>
+              </w:rPr>
+            </w:pPr>
+            <w:r>
+              <w:rPr>
+                <w:rFonts w:ascii="Arial" w:hAnsi="Arial" w:cs="Arial"/>
+              </w:rPr>
+              <w:lastRenderedPageBreak/>
+              <w:t>D-05</w:t>
+            </w:r>
+          </w:p>
+        </w:tc>
+        <w:tc>
+          <w:tcPr>
+            <w:tcW w:w="4044" w:type="dxa"/>
+            <w:vAlign w:val="center"/>
+          </w:tcPr>
+          <w:p>
+            <w:pPr>
+              <w:spacing w:line="360" w:lineRule="auto"/>
+              <w:rPr>
+                <w:rFonts w:ascii="Arial" w:hAnsi="Arial" w:cs="Arial"/>
+                <w:sz w:val="24"/>
+                <w:szCs w:val="24"/>
+                <w:lang w:val="es-MX"/>
+              </w:rPr>
+            </w:pPr>
+            <w:r>
+              <w:rPr>
+                <w:rFonts w:ascii="Arial" w:hAnsi="Arial" w:cs="Arial"/>
+                <w:sz w:val="24"/>
+                <w:szCs w:val="24"/>
+                <w:lang w:val="es-MX"/>
+              </w:rPr>
+              <w:t>La bitácora solo registra operaciones exitosas. Verificado: tras dos intentos denegados y una revocación, estado["auditoria"] queda vacío. SEC-06 exige registrar lecturas y actualizaciones, de modo que no es un incumplimiento del requisito, pero una bitácora que solo guarda éxitos no permite detectar un abuso en curso.</w:t>
+            </w:r>
+          </w:p>
+        </w:tc>
+        <w:tc>
+          <w:tcPr>
+            <w:tcW w:w="1205" w:type="dxa"/>
+            <w:vAlign w:val="center"/>
+          </w:tcPr>
+          <w:p>
+            <w:pPr>
+              <w:spacing w:line="360" w:lineRule="auto"/>
+              <w:rPr>
+                <w:rFonts w:ascii="Arial" w:hAnsi="Arial" w:cs="Arial"/>
+                <w:sz w:val="24"/>
+                <w:szCs w:val="24"/>
+              </w:rPr>
+            </w:pPr>
+            <w:r>
+              <w:rPr>
+                <w:rFonts w:ascii="Arial" w:hAnsi="Arial" w:cs="Arial"/>
+                <w:sz w:val="24"/>
+                <w:szCs w:val="24"/>
+              </w:rPr>
+              <w:t xml:space="preserve">Política de </w:t>
+            </w:r>
+            <w:proofErr w:type="spellStart"/>
+            <w:r>
+              <w:rPr>
+                <w:rFonts w:ascii="Arial" w:hAnsi="Arial" w:cs="Arial"/>
+                <w:sz w:val="24"/>
+                <w:szCs w:val="24"/>
+              </w:rPr>
+              <w:t>auditoría</w:t>
+            </w:r>
+            <w:proofErr w:type="spellEnd"/>
+            <w:r>
+              <w:rPr>
+                <w:rFonts w:ascii="Arial" w:hAnsi="Arial" w:cs="Arial"/>
+                <w:sz w:val="24"/>
+                <w:szCs w:val="24"/>
+              </w:rPr>
+              <w:t xml:space="preserve"> / SEC-06</w:t>
+            </w:r>
+          </w:p>
+        </w:tc>
+        <w:tc>
+          <w:tcPr>
+            <w:tcW w:w="1277" w:type="dxa"/>
+            <w:vAlign w:val="center"/>
+          </w:tcPr>
+          <w:p>
+            <w:pPr>
+              <w:spacing w:line="360" w:lineRule="auto"/>
+              <w:rPr>
+                <w:rFonts w:ascii="Arial" w:hAnsi="Arial" w:cs="Arial"/>
+                <w:sz w:val="24"/>
+                <w:szCs w:val="24"/>
+              </w:rPr>
+            </w:pPr>
+            <w:r>
+              <w:rPr>
+                <w:rFonts w:ascii="Arial" w:hAnsi="Arial" w:cs="Arial"/>
+                <w:sz w:val="24"/>
+                <w:szCs w:val="24"/>
+              </w:rPr>
+              <w:t>Baja</w:t>
+            </w:r>
+          </w:p>
+        </w:tc>
+        <w:tc>
+          <w:tcPr>
+            <w:tcW w:w="2342" w:type="dxa"/>
+            <w:vAlign w:val="center"/>
+          </w:tcPr>
+          <w:p>
+            <w:pPr>
+              <w:spacing w:line="360" w:lineRule="auto"/>
+              <w:rPr>
+                <w:rFonts w:ascii="Arial" w:hAnsi="Arial" w:cs="Arial"/>
+                <w:sz w:val="24"/>
+                <w:szCs w:val="24"/>
+                <w:lang w:val="es-MX"/>
+              </w:rPr>
+            </w:pPr>
+            <w:r>
+              <w:rPr>
+                <w:rFonts w:ascii="Arial" w:hAnsi="Arial" w:cs="Arial"/>
+                <w:sz w:val="24"/>
+                <w:szCs w:val="24"/>
+                <w:lang w:val="es-MX"/>
+              </w:rPr>
+              <w:t>Se acepta: se documenta como vacío del requisito para una iteración posterior.</w:t>
+            </w:r>
+          </w:p>
+        </w:tc>
+      </w:tr>
+      <w:tr>
+        <w:tc>
+          <w:tcPr>
+            <w:tcW w:w="482" w:type="dxa"/>
+            <w:vAlign w:val="center"/>
+          </w:tcPr>
+          <w:p>
+            <w:pPr>
+              <w:rPr>
+                <w:rFonts w:ascii="Arial" w:hAnsi="Arial" w:cs="Arial"/>
+              </w:rPr>
+            </w:pPr>
+            <w:r>
+              <w:rPr>
+                <w:rFonts w:ascii="Arial" w:hAnsi="Arial" w:cs="Arial"/>
+              </w:rPr>
+              <w:t>D-06</w:t>
+            </w:r>
+          </w:p>
+        </w:tc>
+        <w:tc>
+          <w:tcPr>
+            <w:tcW w:w="4044" w:type="dxa"/>
+            <w:vAlign w:val="center"/>
+          </w:tcPr>
+          <w:p>
+            <w:pPr>
+              <w:spacing w:line="360" w:lineRule="auto"/>
+              <w:rPr>
+                <w:rFonts w:ascii="Arial" w:hAnsi="Arial" w:cs="Arial"/>
+                <w:sz w:val="24"/>
+                <w:szCs w:val="24"/>
+                <w:lang w:val="es-MX"/>
+              </w:rPr>
+            </w:pPr>
+            <w:r>
+              <w:rPr>
+                <w:rFonts w:ascii="Arial" w:hAnsi="Arial" w:cs="Arial"/>
+                <w:sz w:val="24"/>
+                <w:szCs w:val="24"/>
+                <w:lang w:val="es-MX"/>
+              </w:rPr>
+              <w:t>Las pruebas positivas (TC-10, y el mismo patrón en TC-01 y TC-11) verifican el diccionario devuelto, no el estado persistido. Las pruebas negativas (TC-03, TC-05, TC-08, TC-12) sí comprueban que la nota no cambió. La suite es rigurosa al demostrar que nada cambió y laxa al demostrar que el cambio sí ocurrió.</w:t>
+            </w:r>
+          </w:p>
+        </w:tc>
+        <w:tc>
+          <w:tcPr>
+            <w:tcW w:w="1205" w:type="dxa"/>
+            <w:vAlign w:val="center"/>
+          </w:tcPr>
+          <w:p>
+            <w:pPr>
+              <w:spacing w:line="360" w:lineRule="auto"/>
+              <w:rPr>
+                <w:rFonts w:ascii="Arial" w:hAnsi="Arial" w:cs="Arial"/>
+                <w:sz w:val="24"/>
+                <w:szCs w:val="24"/>
+                <w:lang w:val="es-MX"/>
+              </w:rPr>
+            </w:pPr>
+            <w:r>
+              <w:rPr>
+                <w:rFonts w:ascii="Arial" w:hAnsi="Arial" w:cs="Arial"/>
+                <w:sz w:val="24"/>
+                <w:szCs w:val="24"/>
+                <w:lang w:val="es-MX"/>
+              </w:rPr>
+              <w:t>Casos de prueba TC-10, TC-01, TC-11</w:t>
+            </w:r>
+          </w:p>
+        </w:tc>
+        <w:tc>
+          <w:tcPr>
+            <w:tcW w:w="1277" w:type="dxa"/>
+            <w:vAlign w:val="center"/>
+          </w:tcPr>
+          <w:p>
+            <w:pPr>
+              <w:spacing w:line="360" w:lineRule="auto"/>
+              <w:rPr>
+                <w:rFonts w:ascii="Arial" w:hAnsi="Arial" w:cs="Arial"/>
+                <w:sz w:val="24"/>
+                <w:szCs w:val="24"/>
+              </w:rPr>
+            </w:pPr>
+            <w:r>
+              <w:rPr>
+                <w:rFonts w:ascii="Arial" w:hAnsi="Arial" w:cs="Arial"/>
+                <w:sz w:val="24"/>
+                <w:szCs w:val="24"/>
+              </w:rPr>
+              <w:t>Baja</w:t>
+            </w:r>
+          </w:p>
+        </w:tc>
+        <w:tc>
+          <w:tcPr>
+            <w:tcW w:w="2342" w:type="dxa"/>
+            <w:vAlign w:val="center"/>
+          </w:tcPr>
+          <w:p>
+            <w:pPr>
+              <w:spacing w:line="360" w:lineRule="auto"/>
+              <w:rPr>
+                <w:rFonts w:ascii="Arial" w:hAnsi="Arial" w:cs="Arial"/>
+                <w:sz w:val="24"/>
+                <w:szCs w:val="24"/>
+                <w:lang w:val="es-MX"/>
+              </w:rPr>
+            </w:pPr>
+            <w:r>
+              <w:rPr>
+                <w:rFonts w:ascii="Arial" w:hAnsi="Arial" w:cs="Arial"/>
+                <w:sz w:val="24"/>
+                <w:szCs w:val="24"/>
+                <w:lang w:val="es-MX"/>
+              </w:rPr>
+              <w:t>Pendiente de corrección: añadir aserción sobre estado["expedientes"] en las pruebas positivas.</w:t>
+            </w:r>
+          </w:p>
+        </w:tc>
+      </w:tr>
+    </w:tbl>
+    <w:p>
+      <w:pPr>
         <w:rPr>
           <w:rFonts w:ascii="Arial" w:hAnsi="Arial" w:cs="Arial"/>
         </w:rPr>
+      </w:pPr>
+    </w:p>
+    <w:p>
+      <w:pPr>
+        <w:pStyle w:val="Ttulo2"/>
+      </w:pPr>
+      <w:r>
+        <w:t>Aspectos conformes verificados</w:t>
+      </w:r>
+    </w:p>
+    <w:p>
+      <w:pPr>
+        <w:pStyle w:val="apa7"/>
+      </w:pPr>
+      <w:r>
+        <w:t xml:space="preserve">La revisión confirma que </w:t>
+      </w:r>
+      <w:proofErr w:type="spellStart"/>
+      <w:r>
+        <w:t>setUp</w:t>
+      </w:r>
+      <w:proofErr w:type="spellEnd"/>
+      <w:r>
+        <w:t xml:space="preserve">() construye un estado independiente por prueba, de modo que la suite es independiente del orden; que las pruebas de integración usan puerto efímero y cierran el servidor en </w:t>
+      </w:r>
+      <w:proofErr w:type="spellStart"/>
+      <w:r>
+        <w:t>tearDown</w:t>
+      </w:r>
+      <w:proofErr w:type="spellEnd"/>
+      <w:r>
+        <w:t xml:space="preserve">; que </w:t>
+      </w:r>
+      <w:proofErr w:type="spellStart"/>
+      <w:r>
+        <w:t>log_message</w:t>
+      </w:r>
+      <w:proofErr w:type="spellEnd"/>
+      <w:r>
+        <w:t xml:space="preserve"> fue sobrescrito para no registrar el encabezado </w:t>
+      </w:r>
+      <w:proofErr w:type="spellStart"/>
+      <w:r>
+        <w:t>Authorization</w:t>
+      </w:r>
+      <w:proofErr w:type="spellEnd"/>
+      <w:r>
+        <w:t xml:space="preserve">; que el servidor escucha solo en 127.0.0.1, limita el cuerpo a 1024 bytes y responde con Cache-Control: no-store; que las respuestas de denegación contienen únicamente el campo error, sin nota ni datos del expediente; y que en </w:t>
+      </w:r>
+      <w:proofErr w:type="spellStart"/>
+      <w:r>
+        <w:t>actualizar_nota</w:t>
+      </w:r>
+      <w:proofErr w:type="spellEnd"/>
+      <w:r>
+        <w:t>() la autorización se evalúa antes que la validación de entrada, es decir, se deniega antes de procesar la entrada.</w:t>
+      </w:r>
+    </w:p>
+    <w:p>
+      <w:pPr>
+        <w:pStyle w:val="Ttulo2"/>
+      </w:pPr>
+      <w:r>
+        <w:lastRenderedPageBreak/>
+        <w:t>Conclusión de la inspección</w:t>
+      </w:r>
+    </w:p>
+    <w:p>
+      <w:pPr>
+        <w:pStyle w:val="apa7"/>
+      </w:pPr>
+      <w:r>
+        <w:t>Se registran seis observaciones verificables, ninguna de las cuales reabre los cinco defectos ya corregidos en las Fases B y C. Las tres de severidad media (D-01, D-02, D-03) corresponden a rutas y condiciones no cubiertas por los 12 casos diseñados, lo que confirma el valor de la inspección como complemento de la suite automatizada.</w:t>
+      </w:r>
+    </w:p>
+    <w:p>
+      <w:pPr>
+        <w:pStyle w:val="apa7"/>
+        <w:ind w:firstLine="0"/>
+      </w:pPr>
+    </w:p>
+    <w:p>
+      <w:pPr>
+        <w:pStyle w:val="Ttulo1"/>
+      </w:pPr>
+      <w:r>
+        <w:t>Fase E — Usabilidad y reproducibilidad</w:t>
+      </w:r>
+    </w:p>
+    <w:p>
+      <w:pPr>
+        <w:pStyle w:val="Ttulo2"/>
+      </w:pPr>
+      <w:r>
+        <w:t>1. Ejecución de la suite siguiendo únicamente el README</w:t>
+      </w:r>
+    </w:p>
+    <w:p>
+      <w:pPr>
+        <w:pStyle w:val="apa7"/>
+      </w:pPr>
+      <w:r>
+        <w:t>El 30 de octubre de 2026, Iván Barboza Blanco (quien no escribió el código ni el README) descargó el repositorio en un equipo Windows distinto al de desarrollo y siguió los comandos del README raíz sin ayuda adicional.</w:t>
+      </w:r>
+    </w:p>
+    <w:tbl>
+      <w:tblPr>
+        <w:tblStyle w:val="Tablaconcuadrcula"/>
+        <w:tblW w:w="0" w:type="auto"/>
+        <w:tblLook w:val="04A0" w:firstRow="1" w:lastRow="0" w:firstColumn="1" w:lastColumn="0" w:noHBand="0" w:noVBand="1"/>
+      </w:tblPr>
+      <w:tblGrid>
+        <w:gridCol w:w="3116"/>
+        <w:gridCol w:w="3117"/>
+        <w:gridCol w:w="3117"/>
+      </w:tblGrid>
+      <w:tr>
+        <w:tc>
+          <w:tcPr>
+            <w:tcW w:w="3116" w:type="dxa"/>
+            <w:vAlign w:val="center"/>
+          </w:tcPr>
+          <w:p>
+            <w:pPr>
+              <w:pStyle w:val="apa7"/>
+              <w:ind w:firstLine="0"/>
+              <w:rPr>
+                <w:b/>
+                <w:bCs/>
+                <w:sz w:val="24"/>
+                <w:szCs w:val="24"/>
+              </w:rPr>
+            </w:pPr>
+            <w:r>
+              <w:rPr>
+                <w:b/>
+                <w:bCs/>
+                <w:sz w:val="24"/>
+                <w:szCs w:val="24"/>
+              </w:rPr>
+              <w:t>Paso</w:t>
+            </w:r>
+          </w:p>
+        </w:tc>
+        <w:tc>
+          <w:tcPr>
+            <w:tcW w:w="3117" w:type="dxa"/>
+            <w:vAlign w:val="center"/>
+          </w:tcPr>
+          <w:p>
+            <w:pPr>
+              <w:pStyle w:val="apa7"/>
+              <w:ind w:firstLine="0"/>
+              <w:rPr>
+                <w:b/>
+                <w:bCs/>
+                <w:sz w:val="24"/>
+                <w:szCs w:val="24"/>
+              </w:rPr>
+            </w:pPr>
+            <w:proofErr w:type="spellStart"/>
+            <w:r>
+              <w:rPr>
+                <w:b/>
+                <w:bCs/>
+                <w:sz w:val="24"/>
+                <w:szCs w:val="24"/>
+              </w:rPr>
+              <w:t>Resultado</w:t>
+            </w:r>
+            <w:proofErr w:type="spellEnd"/>
+          </w:p>
+        </w:tc>
+        <w:tc>
+          <w:tcPr>
+            <w:tcW w:w="3117" w:type="dxa"/>
+            <w:vAlign w:val="center"/>
+          </w:tcPr>
+          <w:p>
+            <w:pPr>
+              <w:pStyle w:val="apa7"/>
+              <w:ind w:firstLine="0"/>
+              <w:rPr>
+                <w:b/>
+                <w:bCs/>
+                <w:sz w:val="24"/>
+                <w:szCs w:val="24"/>
+              </w:rPr>
+            </w:pPr>
+            <w:proofErr w:type="spellStart"/>
+            <w:r>
+              <w:rPr>
+                <w:b/>
+                <w:bCs/>
+                <w:sz w:val="24"/>
+                <w:szCs w:val="24"/>
+              </w:rPr>
+              <w:t>Observación</w:t>
+            </w:r>
+            <w:proofErr w:type="spellEnd"/>
+          </w:p>
+        </w:tc>
+      </w:tr>
+      <w:tr>
+        <w:tc>
+          <w:tcPr>
+            <w:tcW w:w="3116" w:type="dxa"/>
+            <w:vAlign w:val="center"/>
+          </w:tcPr>
+          <w:p>
+            <w:pPr>
+              <w:pStyle w:val="apa7"/>
+              <w:ind w:firstLine="0"/>
+              <w:rPr>
+                <w:b/>
+                <w:bCs/>
+                <w:sz w:val="24"/>
+                <w:szCs w:val="24"/>
+              </w:rPr>
+            </w:pPr>
+            <w:r>
+              <w:rPr>
+                <w:sz w:val="24"/>
+                <w:szCs w:val="24"/>
+              </w:rPr>
+              <w:t xml:space="preserve">python -m </w:t>
+            </w:r>
+            <w:proofErr w:type="spellStart"/>
+            <w:r>
+              <w:rPr>
+                <w:sz w:val="24"/>
+                <w:szCs w:val="24"/>
+              </w:rPr>
+              <w:t>unittest</w:t>
+            </w:r>
+            <w:proofErr w:type="spellEnd"/>
+            <w:r>
+              <w:rPr>
+                <w:sz w:val="24"/>
+                <w:szCs w:val="24"/>
+              </w:rPr>
+              <w:t xml:space="preserve"> discover -s tests -v</w:t>
+            </w:r>
+          </w:p>
+        </w:tc>
+        <w:tc>
+          <w:tcPr>
+            <w:tcW w:w="3117" w:type="dxa"/>
+            <w:vAlign w:val="center"/>
+          </w:tcPr>
+          <w:p>
+            <w:pPr>
+              <w:pStyle w:val="apa7"/>
+              <w:ind w:firstLine="0"/>
+              <w:rPr>
+                <w:b/>
+                <w:bCs/>
+                <w:sz w:val="24"/>
+                <w:szCs w:val="24"/>
+                <w:lang w:val="es-MX"/>
+              </w:rPr>
+            </w:pPr>
+            <w:r>
+              <w:rPr>
+                <w:b/>
+                <w:bCs/>
+                <w:sz w:val="24"/>
+                <w:szCs w:val="24"/>
+                <w:lang w:val="es-MX"/>
+              </w:rPr>
+              <w:t>Falló:</w:t>
+            </w:r>
+            <w:r>
+              <w:rPr>
+                <w:sz w:val="24"/>
+                <w:szCs w:val="24"/>
+                <w:lang w:val="es-MX"/>
+              </w:rPr>
+              <w:t xml:space="preserve"> «no se encontró Python; ejecutar sin argumentos para instalar desde el Microsoft Store…»</w:t>
+            </w:r>
+          </w:p>
+        </w:tc>
+        <w:tc>
+          <w:tcPr>
+            <w:tcW w:w="3117" w:type="dxa"/>
+            <w:vAlign w:val="center"/>
+          </w:tcPr>
+          <w:p>
+            <w:pPr>
+              <w:pStyle w:val="apa7"/>
+              <w:ind w:firstLine="0"/>
+              <w:rPr>
+                <w:b/>
+                <w:bCs/>
+                <w:sz w:val="24"/>
+                <w:szCs w:val="24"/>
+                <w:lang w:val="es-MX"/>
+              </w:rPr>
+            </w:pPr>
+            <w:r>
+              <w:rPr>
+                <w:sz w:val="24"/>
+                <w:szCs w:val="24"/>
+                <w:lang w:val="es-MX"/>
+              </w:rPr>
+              <w:t xml:space="preserve">En Windows, </w:t>
+            </w:r>
+            <w:proofErr w:type="spellStart"/>
+            <w:r>
+              <w:rPr>
+                <w:sz w:val="24"/>
+                <w:szCs w:val="24"/>
+                <w:lang w:val="es-MX"/>
+              </w:rPr>
+              <w:t>python</w:t>
+            </w:r>
+            <w:proofErr w:type="spellEnd"/>
+            <w:r>
+              <w:rPr>
+                <w:sz w:val="24"/>
+                <w:szCs w:val="24"/>
+                <w:lang w:val="es-MX"/>
+              </w:rPr>
+              <w:t xml:space="preserve"> puede ser un alias vacío de la Microsoft Store. El README raíz no indica que Python deba estar instalado ni qué versión.</w:t>
+            </w:r>
+          </w:p>
+        </w:tc>
+      </w:tr>
+      <w:tr>
+        <w:tc>
+          <w:tcPr>
+            <w:tcW w:w="3116" w:type="dxa"/>
+            <w:vAlign w:val="center"/>
+          </w:tcPr>
+          <w:p>
+            <w:pPr>
+              <w:pStyle w:val="apa7"/>
+              <w:ind w:firstLine="0"/>
+              <w:rPr>
+                <w:b/>
+                <w:bCs/>
+                <w:sz w:val="24"/>
+                <w:szCs w:val="24"/>
+                <w:lang w:val="es-MX"/>
+              </w:rPr>
+            </w:pPr>
+            <w:r>
+              <w:rPr>
+                <w:sz w:val="24"/>
+                <w:szCs w:val="24"/>
+                <w:lang w:val="es-MX"/>
+              </w:rPr>
+              <w:t xml:space="preserve">Instalación de Python 3.13 y reintento con </w:t>
+            </w:r>
+            <w:proofErr w:type="spellStart"/>
+            <w:r>
+              <w:rPr>
+                <w:sz w:val="24"/>
+                <w:szCs w:val="24"/>
+                <w:lang w:val="es-MX"/>
+              </w:rPr>
+              <w:t>python</w:t>
+            </w:r>
+            <w:proofErr w:type="spellEnd"/>
+          </w:p>
+        </w:tc>
+        <w:tc>
+          <w:tcPr>
+            <w:tcW w:w="3117" w:type="dxa"/>
+            <w:vAlign w:val="center"/>
+          </w:tcPr>
+          <w:p>
+            <w:pPr>
+              <w:pStyle w:val="apa7"/>
+              <w:ind w:firstLine="0"/>
+              <w:rPr>
+                <w:b/>
+                <w:bCs/>
+                <w:sz w:val="24"/>
+                <w:szCs w:val="24"/>
+                <w:lang w:val="es-MX"/>
+              </w:rPr>
+            </w:pPr>
+            <w:r>
+              <w:rPr>
+                <w:b/>
+                <w:bCs/>
+                <w:sz w:val="24"/>
+                <w:szCs w:val="24"/>
+                <w:lang w:val="es-MX"/>
+              </w:rPr>
+              <w:t>Falló</w:t>
+            </w:r>
+            <w:r>
+              <w:rPr>
+                <w:sz w:val="24"/>
+                <w:szCs w:val="24"/>
+                <w:lang w:val="es-MX"/>
+              </w:rPr>
+              <w:t xml:space="preserve"> con el mismo mensaje</w:t>
+            </w:r>
+          </w:p>
+        </w:tc>
+        <w:tc>
+          <w:tcPr>
+            <w:tcW w:w="3117" w:type="dxa"/>
+            <w:vAlign w:val="center"/>
+          </w:tcPr>
+          <w:p>
+            <w:pPr>
+              <w:pStyle w:val="apa7"/>
+              <w:ind w:firstLine="0"/>
+              <w:rPr>
+                <w:b/>
+                <w:bCs/>
+                <w:sz w:val="24"/>
+                <w:szCs w:val="24"/>
+                <w:lang w:val="es-MX"/>
+              </w:rPr>
+            </w:pPr>
+            <w:r>
+              <w:rPr>
+                <w:sz w:val="24"/>
+                <w:szCs w:val="24"/>
+                <w:lang w:val="es-MX"/>
+              </w:rPr>
+              <w:t>El alias de la Store seguía interceptando el comando.</w:t>
+            </w:r>
+          </w:p>
+        </w:tc>
+      </w:tr>
+      <w:tr>
+        <w:tc>
+          <w:tcPr>
+            <w:tcW w:w="3116" w:type="dxa"/>
+            <w:vAlign w:val="center"/>
+          </w:tcPr>
+          <w:p>
+            <w:pPr>
+              <w:pStyle w:val="apa7"/>
+              <w:ind w:firstLine="0"/>
+              <w:rPr>
+                <w:b/>
+                <w:bCs/>
+                <w:sz w:val="24"/>
+                <w:szCs w:val="24"/>
+              </w:rPr>
+            </w:pPr>
+            <w:proofErr w:type="spellStart"/>
+            <w:r>
+              <w:rPr>
+                <w:sz w:val="24"/>
+                <w:szCs w:val="24"/>
+              </w:rPr>
+              <w:t>py</w:t>
+            </w:r>
+            <w:proofErr w:type="spellEnd"/>
+            <w:r>
+              <w:rPr>
+                <w:sz w:val="24"/>
+                <w:szCs w:val="24"/>
+              </w:rPr>
+              <w:t xml:space="preserve"> -m </w:t>
+            </w:r>
+            <w:proofErr w:type="spellStart"/>
+            <w:r>
+              <w:rPr>
+                <w:sz w:val="24"/>
+                <w:szCs w:val="24"/>
+              </w:rPr>
+              <w:t>unittest</w:t>
+            </w:r>
+            <w:proofErr w:type="spellEnd"/>
+            <w:r>
+              <w:rPr>
+                <w:sz w:val="24"/>
+                <w:szCs w:val="24"/>
+              </w:rPr>
+              <w:t xml:space="preserve"> discover -s tests -v</w:t>
+            </w:r>
+          </w:p>
+        </w:tc>
+        <w:tc>
+          <w:tcPr>
+            <w:tcW w:w="3117" w:type="dxa"/>
+            <w:vAlign w:val="center"/>
+          </w:tcPr>
+          <w:p>
+            <w:pPr>
+              <w:pStyle w:val="apa7"/>
+              <w:ind w:firstLine="0"/>
+              <w:rPr>
+                <w:b/>
+                <w:bCs/>
+                <w:sz w:val="24"/>
+                <w:szCs w:val="24"/>
+              </w:rPr>
+            </w:pPr>
+            <w:proofErr w:type="spellStart"/>
+            <w:r>
+              <w:rPr>
+                <w:b/>
+                <w:bCs/>
+                <w:sz w:val="24"/>
+                <w:szCs w:val="24"/>
+              </w:rPr>
+              <w:t>Aprobó</w:t>
+            </w:r>
+            <w:proofErr w:type="spellEnd"/>
+            <w:r>
+              <w:rPr>
+                <w:b/>
+                <w:bCs/>
+                <w:sz w:val="24"/>
+                <w:szCs w:val="24"/>
+              </w:rPr>
+              <w:t>:</w:t>
+            </w:r>
+            <w:r>
+              <w:rPr>
+                <w:sz w:val="24"/>
+                <w:szCs w:val="24"/>
+              </w:rPr>
+              <w:t xml:space="preserve"> Ran 14 tests in 1.025s … OK</w:t>
+            </w:r>
+          </w:p>
+        </w:tc>
+        <w:tc>
+          <w:tcPr>
+            <w:tcW w:w="3117" w:type="dxa"/>
+            <w:vAlign w:val="center"/>
+          </w:tcPr>
+          <w:p>
+            <w:pPr>
+              <w:pStyle w:val="apa7"/>
+              <w:ind w:firstLine="0"/>
+              <w:rPr>
+                <w:b/>
+                <w:bCs/>
+                <w:sz w:val="24"/>
+                <w:szCs w:val="24"/>
+              </w:rPr>
+            </w:pPr>
+            <w:r>
+              <w:rPr>
+                <w:sz w:val="24"/>
+                <w:szCs w:val="24"/>
+                <w:lang w:val="es-MX"/>
+              </w:rPr>
+              <w:t xml:space="preserve">El lanzador </w:t>
+            </w:r>
+            <w:proofErr w:type="spellStart"/>
+            <w:r>
+              <w:rPr>
+                <w:sz w:val="24"/>
+                <w:szCs w:val="24"/>
+                <w:lang w:val="es-MX"/>
+              </w:rPr>
+              <w:t>py</w:t>
+            </w:r>
+            <w:proofErr w:type="spellEnd"/>
+            <w:r>
+              <w:rPr>
+                <w:sz w:val="24"/>
+                <w:szCs w:val="24"/>
+                <w:lang w:val="es-MX"/>
+              </w:rPr>
+              <w:t xml:space="preserve"> evita el alias. </w:t>
+            </w:r>
+            <w:r>
+              <w:rPr>
+                <w:sz w:val="24"/>
+                <w:szCs w:val="24"/>
+              </w:rPr>
+              <w:t xml:space="preserve">No </w:t>
+            </w:r>
+            <w:proofErr w:type="spellStart"/>
+            <w:r>
+              <w:rPr>
+                <w:sz w:val="24"/>
+                <w:szCs w:val="24"/>
+              </w:rPr>
+              <w:t>estaba</w:t>
+            </w:r>
+            <w:proofErr w:type="spellEnd"/>
+            <w:r>
+              <w:rPr>
+                <w:sz w:val="24"/>
+                <w:szCs w:val="24"/>
+              </w:rPr>
+              <w:t xml:space="preserve"> </w:t>
+            </w:r>
+            <w:proofErr w:type="spellStart"/>
+            <w:r>
+              <w:rPr>
+                <w:sz w:val="24"/>
+                <w:szCs w:val="24"/>
+              </w:rPr>
+              <w:t>documentado</w:t>
+            </w:r>
+            <w:proofErr w:type="spellEnd"/>
+            <w:r>
+              <w:rPr>
+                <w:sz w:val="24"/>
+                <w:szCs w:val="24"/>
+              </w:rPr>
+              <w:t>.</w:t>
+            </w:r>
+          </w:p>
+        </w:tc>
+      </w:tr>
+    </w:tbl>
+    <w:p>
+      <w:pPr>
+        <w:pStyle w:val="apa7"/>
+        <w:ind w:firstLine="0"/>
+        <w:rPr>
+          <w:b/>
+          <w:bCs/>
+        </w:rPr>
+      </w:pPr>
+    </w:p>
+    <w:p>
+      <w:pPr>
+        <w:pStyle w:val="apa7"/>
+        <w:ind w:firstLine="0"/>
+      </w:pPr>
+      <w:r>
+        <w:rPr>
+          <w:b/>
+          <w:bCs/>
+        </w:rPr>
+        <w:t>Conclusión:</w:t>
+      </w:r>
+      <w:r>
+        <w:t xml:space="preserve"> los pasos del README </w:t>
+      </w:r>
+      <w:r>
+        <w:rPr>
+          <w:b/>
+          <w:bCs/>
+        </w:rPr>
+        <w:t>no fueron suficientes</w:t>
+      </w:r>
+      <w:r>
+        <w:t xml:space="preserve"> en este equipo. Una vez resuelto, el resultado coincide con las evidencias de Ian (14 pruebas, 0 fallos), lo que confirma la reproducibilidad en una máquina distinta. Dificultades: (1) el README raíz no declara el requisito de entorno (Python 3.10 o superior); (2) el comando </w:t>
+      </w:r>
+      <w:proofErr w:type="spellStart"/>
+      <w:r>
+        <w:t>python</w:t>
+      </w:r>
+      <w:proofErr w:type="spellEnd"/>
+      <w:r>
+        <w:t xml:space="preserve"> no es </w:t>
+      </w:r>
+      <w:r>
+        <w:lastRenderedPageBreak/>
+        <w:t xml:space="preserve">portable en Windows. Acción tomada: se añadió al README una nota de requisitos con la alternativa </w:t>
+      </w:r>
+      <w:proofErr w:type="spellStart"/>
+      <w:r>
+        <w:t>py</w:t>
+      </w:r>
+      <w:proofErr w:type="spellEnd"/>
+      <w:r>
+        <w:t>.</w:t>
+      </w:r>
+    </w:p>
+    <w:p>
+      <w:pPr>
+        <w:pStyle w:val="Ttulo2"/>
+      </w:pPr>
+      <w:r>
+        <w:t>2. Análisis de dos situaciones de usabilidad del control</w:t>
+      </w:r>
+    </w:p>
+    <w:tbl>
+      <w:tblPr>
+        <w:tblStyle w:val="Tablaconcuadrcula"/>
+        <w:tblW w:w="0" w:type="auto"/>
+        <w:tblLook w:val="04A0" w:firstRow="1" w:lastRow="0" w:firstColumn="1" w:lastColumn="0" w:noHBand="0" w:noVBand="1"/>
+      </w:tblPr>
+      <w:tblGrid>
+        <w:gridCol w:w="3116"/>
+        <w:gridCol w:w="3117"/>
+        <w:gridCol w:w="3117"/>
+      </w:tblGrid>
+      <w:tr>
+        <w:tc>
+          <w:tcPr>
+            <w:tcW w:w="3116" w:type="dxa"/>
+            <w:vAlign w:val="center"/>
+          </w:tcPr>
+          <w:p>
+            <w:pPr>
+              <w:pStyle w:val="apa7"/>
+              <w:ind w:firstLine="0"/>
+            </w:pPr>
+            <w:proofErr w:type="spellStart"/>
+            <w:r>
+              <w:rPr>
+                <w:b/>
+                <w:bCs/>
+              </w:rPr>
+              <w:t>Situación</w:t>
+            </w:r>
+            <w:proofErr w:type="spellEnd"/>
+          </w:p>
+        </w:tc>
+        <w:tc>
+          <w:tcPr>
+            <w:tcW w:w="3117" w:type="dxa"/>
+            <w:vAlign w:val="center"/>
+          </w:tcPr>
+          <w:p>
+            <w:pPr>
+              <w:pStyle w:val="apa7"/>
+              <w:ind w:firstLine="0"/>
+            </w:pPr>
+            <w:proofErr w:type="spellStart"/>
+            <w:r>
+              <w:rPr>
+                <w:b/>
+                <w:bCs/>
+              </w:rPr>
+              <w:t>Mensaje</w:t>
+            </w:r>
+            <w:proofErr w:type="spellEnd"/>
+            <w:r>
+              <w:rPr>
+                <w:b/>
+                <w:bCs/>
+              </w:rPr>
+              <w:t xml:space="preserve"> actual</w:t>
+            </w:r>
+          </w:p>
+        </w:tc>
+        <w:tc>
+          <w:tcPr>
+            <w:tcW w:w="3117" w:type="dxa"/>
+            <w:vAlign w:val="center"/>
+          </w:tcPr>
+          <w:p>
+            <w:pPr>
+              <w:pStyle w:val="apa7"/>
+              <w:ind w:firstLine="0"/>
+            </w:pPr>
+            <w:proofErr w:type="spellStart"/>
+            <w:r>
+              <w:rPr>
+                <w:b/>
+                <w:bCs/>
+              </w:rPr>
+              <w:t>Valoración</w:t>
+            </w:r>
+            <w:proofErr w:type="spellEnd"/>
+          </w:p>
+        </w:tc>
+      </w:tr>
+      <w:tr>
+        <w:tc>
+          <w:tcPr>
+            <w:tcW w:w="3116" w:type="dxa"/>
+            <w:vAlign w:val="center"/>
+          </w:tcPr>
+          <w:p>
+            <w:pPr>
+              <w:pStyle w:val="apa7"/>
+              <w:ind w:firstLine="0"/>
+              <w:rPr>
+                <w:lang w:val="es-MX"/>
+              </w:rPr>
+            </w:pPr>
+            <w:r>
+              <w:rPr>
+                <w:b/>
+                <w:bCs/>
+                <w:lang w:val="es-MX"/>
+              </w:rPr>
+              <w:t>Sesión inválida</w:t>
+            </w:r>
+            <w:r>
+              <w:rPr>
+                <w:lang w:val="es-MX"/>
+              </w:rPr>
+              <w:t xml:space="preserve"> (ausente, revocada o expirada)</w:t>
+            </w:r>
+          </w:p>
+        </w:tc>
+        <w:tc>
+          <w:tcPr>
+            <w:tcW w:w="3117" w:type="dxa"/>
+            <w:vAlign w:val="center"/>
+          </w:tcPr>
+          <w:p>
+            <w:pPr>
+              <w:pStyle w:val="apa7"/>
+              <w:ind w:firstLine="0"/>
+            </w:pPr>
+            <w:r>
+              <w:t xml:space="preserve">HTTP </w:t>
+            </w:r>
+            <w:proofErr w:type="gramStart"/>
+            <w:r>
+              <w:t>401 {"</w:t>
+            </w:r>
+            <w:proofErr w:type="gramEnd"/>
+            <w:r>
+              <w:t xml:space="preserve">error": "No </w:t>
+            </w:r>
+            <w:proofErr w:type="spellStart"/>
+            <w:r>
+              <w:t>autenticado</w:t>
+            </w:r>
+            <w:proofErr w:type="spellEnd"/>
+            <w:r>
+              <w:t>"}</w:t>
+            </w:r>
+          </w:p>
+        </w:tc>
+        <w:tc>
+          <w:tcPr>
+            <w:tcW w:w="3117" w:type="dxa"/>
+            <w:vAlign w:val="center"/>
+          </w:tcPr>
+          <w:p>
+            <w:pPr>
+              <w:pStyle w:val="apa7"/>
+              <w:ind w:firstLine="0"/>
+              <w:rPr>
+                <w:lang w:val="es-MX"/>
+              </w:rPr>
+            </w:pPr>
+            <w:r>
+              <w:rPr>
+                <w:b/>
+                <w:bCs/>
+                <w:lang w:val="es-MX"/>
+              </w:rPr>
+              <w:t>Seguro:</w:t>
+            </w:r>
+            <w:r>
+              <w:rPr>
+                <w:lang w:val="es-MX"/>
+              </w:rPr>
+              <w:t xml:space="preserve"> el mismo mensaje cubre los tres casos, así que no revela si un token existe, fue revocado o expiró. </w:t>
+            </w:r>
+            <w:r>
+              <w:rPr>
+                <w:b/>
+                <w:bCs/>
+                <w:lang w:val="es-MX"/>
+              </w:rPr>
+              <w:t>Mejorable:</w:t>
+            </w:r>
+            <w:r>
+              <w:rPr>
+                <w:lang w:val="es-MX"/>
+              </w:rPr>
+              <w:t xml:space="preserve"> una persona legítima con sesión expirada no sabe qué hacer; no sugiere volver a iniciar sesión.</w:t>
+            </w:r>
+          </w:p>
+        </w:tc>
+      </w:tr>
+      <w:tr>
+        <w:tc>
+          <w:tcPr>
+            <w:tcW w:w="3116" w:type="dxa"/>
+            <w:vAlign w:val="center"/>
+          </w:tcPr>
+          <w:p>
+            <w:pPr>
+              <w:pStyle w:val="apa7"/>
+              <w:ind w:firstLine="0"/>
+            </w:pPr>
+            <w:proofErr w:type="spellStart"/>
+            <w:r>
+              <w:rPr>
+                <w:b/>
+                <w:bCs/>
+              </w:rPr>
+              <w:t>Acceso</w:t>
+            </w:r>
+            <w:proofErr w:type="spellEnd"/>
+            <w:r>
+              <w:rPr>
+                <w:b/>
+                <w:bCs/>
+              </w:rPr>
+              <w:t xml:space="preserve"> </w:t>
+            </w:r>
+            <w:proofErr w:type="spellStart"/>
+            <w:r>
+              <w:rPr>
+                <w:b/>
+                <w:bCs/>
+              </w:rPr>
+              <w:t>denegado</w:t>
+            </w:r>
+            <w:proofErr w:type="spellEnd"/>
+          </w:p>
+        </w:tc>
+        <w:tc>
+          <w:tcPr>
+            <w:tcW w:w="3117" w:type="dxa"/>
+            <w:vAlign w:val="center"/>
+          </w:tcPr>
+          <w:p>
+            <w:pPr>
+              <w:pStyle w:val="apa7"/>
+              <w:ind w:firstLine="0"/>
+              <w:rPr>
+                <w:lang w:val="es-MX"/>
+              </w:rPr>
+            </w:pPr>
+            <w:r>
+              <w:rPr>
+                <w:lang w:val="es-MX"/>
+              </w:rPr>
+              <w:t>HTTP 403 {"error": "Acceso denegado"} (lectura) y {"error": "Operación denegada"} (escritura)</w:t>
+            </w:r>
+          </w:p>
+        </w:tc>
+        <w:tc>
+          <w:tcPr>
+            <w:tcW w:w="3117" w:type="dxa"/>
+            <w:vAlign w:val="center"/>
+          </w:tcPr>
+          <w:p>
+            <w:pPr>
+              <w:pStyle w:val="apa7"/>
+              <w:ind w:firstLine="0"/>
+            </w:pPr>
+            <w:r>
+              <w:rPr>
+                <w:b/>
+                <w:bCs/>
+                <w:lang w:val="es-MX"/>
+              </w:rPr>
+              <w:t>Seguro:</w:t>
+            </w:r>
+            <w:r>
+              <w:rPr>
+                <w:lang w:val="es-MX"/>
+              </w:rPr>
+              <w:t xml:space="preserve"> el cuerpo contiene solo el campo error, sin nota, sede ni propietario del expediente (verificado con </w:t>
+            </w:r>
+            <w:proofErr w:type="spellStart"/>
+            <w:proofErr w:type="gramStart"/>
+            <w:r>
+              <w:rPr>
+                <w:lang w:val="es-MX"/>
+              </w:rPr>
+              <w:t>assertNotIn</w:t>
+            </w:r>
+            <w:proofErr w:type="spellEnd"/>
+            <w:r>
+              <w:rPr>
+                <w:lang w:val="es-MX"/>
+              </w:rPr>
+              <w:t>(</w:t>
+            </w:r>
+            <w:proofErr w:type="gramEnd"/>
+            <w:r>
+              <w:rPr>
+                <w:lang w:val="es-MX"/>
+              </w:rPr>
+              <w:t xml:space="preserve">"nota", datos) y las capturas Postman). </w:t>
+            </w:r>
+            <w:proofErr w:type="spellStart"/>
+            <w:r>
+              <w:rPr>
+                <w:b/>
+                <w:bCs/>
+              </w:rPr>
+              <w:t>Mejorable</w:t>
+            </w:r>
+            <w:proofErr w:type="spellEnd"/>
+            <w:r>
+              <w:rPr>
+                <w:b/>
+                <w:bCs/>
+              </w:rPr>
+              <w:t>:</w:t>
+            </w:r>
+            <w:r>
+              <w:t xml:space="preserve"> no indica el </w:t>
+            </w:r>
+            <w:proofErr w:type="spellStart"/>
+            <w:r>
+              <w:t>motivo</w:t>
+            </w:r>
+            <w:proofErr w:type="spellEnd"/>
+            <w:r>
+              <w:t xml:space="preserve"> </w:t>
+            </w:r>
+            <w:proofErr w:type="spellStart"/>
+            <w:r>
+              <w:t>ni</w:t>
+            </w:r>
+            <w:proofErr w:type="spellEnd"/>
+            <w:r>
+              <w:t xml:space="preserve"> la </w:t>
+            </w:r>
+            <w:proofErr w:type="spellStart"/>
+            <w:r>
+              <w:t>acción</w:t>
+            </w:r>
+            <w:proofErr w:type="spellEnd"/>
+            <w:r>
+              <w:t xml:space="preserve"> </w:t>
+            </w:r>
+            <w:proofErr w:type="spellStart"/>
+            <w:r>
+              <w:t>siguiente</w:t>
+            </w:r>
+            <w:proofErr w:type="spellEnd"/>
+            <w:r>
+              <w:t>.</w:t>
+            </w:r>
+          </w:p>
+        </w:tc>
+      </w:tr>
+    </w:tbl>
+    <w:p>
+      <w:pPr>
+        <w:pStyle w:val="apa7"/>
+        <w:ind w:firstLine="0"/>
+      </w:pPr>
+    </w:p>
+    <w:p>
+      <w:pPr>
+        <w:pStyle w:val="apa7"/>
+      </w:pPr>
+      <w:r>
+        <w:t>Un mensaje más orientativo debe seguir sin revelar existencia, propietario ni estado interno. Se recomienda texto genérico con orientación, por ejemplo «Sesión no válida; inicie sesión nuevamente».</w:t>
+      </w:r>
+    </w:p>
+    <w:p>
+      <w:pPr>
+        <w:pStyle w:val="Ttulo2"/>
+      </w:pPr>
+      <w:r>
+        <w:t>3. Ajustes de nombres y mensajes en dos pruebas</w:t>
+      </w:r>
+    </w:p>
+    <w:p>
+      <w:pPr>
+        <w:pStyle w:val="apa7"/>
+        <w:ind w:firstLine="0"/>
       </w:pPr>
     </w:p>
     <w:p>
@@ -16844,12 +19848,533 @@
         <w:br w:type="page"/>
       </w:r>
     </w:p>
+    <w:tbl>
+      <w:tblPr>
+        <w:tblStyle w:val="Tablaconcuadrcula"/>
+        <w:tblW w:w="0" w:type="auto"/>
+        <w:tblLayout w:type="fixed"/>
+        <w:tblLook w:val="04A0" w:firstRow="1" w:lastRow="0" w:firstColumn="1" w:lastColumn="0" w:noHBand="0" w:noVBand="1"/>
+      </w:tblPr>
+      <w:tblGrid>
+        <w:gridCol w:w="1129"/>
+        <w:gridCol w:w="1843"/>
+        <w:gridCol w:w="2693"/>
+        <w:gridCol w:w="3119"/>
+      </w:tblGrid>
+      <w:tr>
+        <w:tc>
+          <w:tcPr>
+            <w:tcW w:w="1129" w:type="dxa"/>
+            <w:vAlign w:val="center"/>
+          </w:tcPr>
+          <w:p>
+            <w:pPr>
+              <w:pStyle w:val="Ttulo1"/>
+              <w:rPr>
+                <w:sz w:val="24"/>
+                <w:szCs w:val="24"/>
+              </w:rPr>
+            </w:pPr>
+            <w:r>
+              <w:rPr>
+                <w:bCs/>
+                <w:sz w:val="24"/>
+                <w:szCs w:val="24"/>
+              </w:rPr>
+              <w:lastRenderedPageBreak/>
+              <w:t>Prueba</w:t>
+            </w:r>
+          </w:p>
+        </w:tc>
+        <w:tc>
+          <w:tcPr>
+            <w:tcW w:w="1843" w:type="dxa"/>
+            <w:vAlign w:val="center"/>
+          </w:tcPr>
+          <w:p>
+            <w:pPr>
+              <w:pStyle w:val="Ttulo1"/>
+              <w:rPr>
+                <w:sz w:val="24"/>
+                <w:szCs w:val="24"/>
+              </w:rPr>
+            </w:pPr>
+            <w:r>
+              <w:rPr>
+                <w:bCs/>
+                <w:sz w:val="24"/>
+                <w:szCs w:val="24"/>
+              </w:rPr>
+              <w:t>Antes</w:t>
+            </w:r>
+          </w:p>
+        </w:tc>
+        <w:tc>
+          <w:tcPr>
+            <w:tcW w:w="2693" w:type="dxa"/>
+            <w:vAlign w:val="center"/>
+          </w:tcPr>
+          <w:p>
+            <w:pPr>
+              <w:pStyle w:val="Ttulo1"/>
+              <w:rPr>
+                <w:sz w:val="24"/>
+                <w:szCs w:val="24"/>
+              </w:rPr>
+            </w:pPr>
+            <w:proofErr w:type="spellStart"/>
+            <w:r>
+              <w:rPr>
+                <w:bCs/>
+                <w:sz w:val="24"/>
+                <w:szCs w:val="24"/>
+              </w:rPr>
+              <w:t>Después</w:t>
+            </w:r>
+            <w:proofErr w:type="spellEnd"/>
+          </w:p>
+        </w:tc>
+        <w:tc>
+          <w:tcPr>
+            <w:tcW w:w="3119" w:type="dxa"/>
+            <w:vAlign w:val="center"/>
+          </w:tcPr>
+          <w:p>
+            <w:pPr>
+              <w:pStyle w:val="Ttulo1"/>
+              <w:rPr>
+                <w:sz w:val="24"/>
+                <w:szCs w:val="24"/>
+              </w:rPr>
+            </w:pPr>
+            <w:proofErr w:type="spellStart"/>
+            <w:r>
+              <w:rPr>
+                <w:bCs/>
+                <w:sz w:val="24"/>
+                <w:szCs w:val="24"/>
+              </w:rPr>
+              <w:t>Motivo</w:t>
+            </w:r>
+            <w:proofErr w:type="spellEnd"/>
+          </w:p>
+        </w:tc>
+      </w:tr>
+      <w:tr>
+        <w:tc>
+          <w:tcPr>
+            <w:tcW w:w="1129" w:type="dxa"/>
+            <w:vAlign w:val="center"/>
+          </w:tcPr>
+          <w:p>
+            <w:pPr>
+              <w:pStyle w:val="Ttulo1"/>
+              <w:jc w:val="both"/>
+              <w:rPr>
+                <w:b w:val="0"/>
+                <w:bCs/>
+                <w:sz w:val="24"/>
+                <w:szCs w:val="24"/>
+              </w:rPr>
+            </w:pPr>
+            <w:r>
+              <w:rPr>
+                <w:b w:val="0"/>
+                <w:bCs/>
+                <w:sz w:val="24"/>
+                <w:szCs w:val="24"/>
+              </w:rPr>
+              <w:t>TC-04</w:t>
+            </w:r>
+          </w:p>
+        </w:tc>
+        <w:tc>
+          <w:tcPr>
+            <w:tcW w:w="1843" w:type="dxa"/>
+            <w:vAlign w:val="center"/>
+          </w:tcPr>
+          <w:p>
+            <w:pPr>
+              <w:pStyle w:val="Ttulo1"/>
+              <w:jc w:val="both"/>
+              <w:rPr>
+                <w:b w:val="0"/>
+                <w:bCs/>
+                <w:sz w:val="24"/>
+                <w:szCs w:val="24"/>
+                <w:lang w:val="es-MX"/>
+              </w:rPr>
+            </w:pPr>
+            <w:proofErr w:type="spellStart"/>
+            <w:r>
+              <w:rPr>
+                <w:b w:val="0"/>
+                <w:bCs/>
+                <w:sz w:val="24"/>
+                <w:szCs w:val="24"/>
+                <w:lang w:val="es-MX"/>
+              </w:rPr>
+              <w:t>test_sesion_revocada_no_permita_lecturas</w:t>
+            </w:r>
+            <w:proofErr w:type="spellEnd"/>
+            <w:r>
+              <w:rPr>
+                <w:b w:val="0"/>
+                <w:bCs/>
+                <w:sz w:val="24"/>
+                <w:szCs w:val="24"/>
+                <w:lang w:val="es-MX"/>
+              </w:rPr>
+              <w:t>, aserciones sin mensaje</w:t>
+            </w:r>
+          </w:p>
+        </w:tc>
+        <w:tc>
+          <w:tcPr>
+            <w:tcW w:w="2693" w:type="dxa"/>
+            <w:vAlign w:val="center"/>
+          </w:tcPr>
+          <w:p>
+            <w:pPr>
+              <w:pStyle w:val="Ttulo1"/>
+              <w:jc w:val="both"/>
+              <w:rPr>
+                <w:b w:val="0"/>
+                <w:bCs/>
+                <w:sz w:val="24"/>
+                <w:szCs w:val="24"/>
+                <w:lang w:val="es-MX"/>
+              </w:rPr>
+            </w:pPr>
+            <w:proofErr w:type="spellStart"/>
+            <w:r>
+              <w:rPr>
+                <w:b w:val="0"/>
+                <w:bCs/>
+                <w:sz w:val="24"/>
+                <w:szCs w:val="24"/>
+                <w:lang w:val="es-MX"/>
+              </w:rPr>
+              <w:t>test_rechaza_lectura_con_sesion_revocada</w:t>
+            </w:r>
+            <w:proofErr w:type="spellEnd"/>
+            <w:r>
+              <w:rPr>
+                <w:b w:val="0"/>
+                <w:bCs/>
+                <w:sz w:val="24"/>
+                <w:szCs w:val="24"/>
+                <w:lang w:val="es-MX"/>
+              </w:rPr>
+              <w:t>, cada aserción con requisito y expectativa</w:t>
+            </w:r>
+          </w:p>
+        </w:tc>
+        <w:tc>
+          <w:tcPr>
+            <w:tcW w:w="3119" w:type="dxa"/>
+            <w:vAlign w:val="center"/>
+          </w:tcPr>
+          <w:p>
+            <w:pPr>
+              <w:pStyle w:val="Ttulo1"/>
+              <w:jc w:val="both"/>
+              <w:rPr>
+                <w:b w:val="0"/>
+                <w:bCs/>
+                <w:sz w:val="24"/>
+                <w:szCs w:val="24"/>
+              </w:rPr>
+            </w:pPr>
+            <w:r>
+              <w:rPr>
+                <w:b w:val="0"/>
+                <w:bCs/>
+                <w:sz w:val="24"/>
+                <w:szCs w:val="24"/>
+                <w:lang w:val="es-MX"/>
+              </w:rPr>
+              <w:t xml:space="preserve">El nombre anterior no declaraba la conducta con claridad; ahora la describe. </w:t>
+            </w:r>
+            <w:r>
+              <w:rPr>
+                <w:b w:val="0"/>
+                <w:bCs/>
+                <w:sz w:val="24"/>
+                <w:szCs w:val="24"/>
+              </w:rPr>
+              <w:t xml:space="preserve">Un </w:t>
+            </w:r>
+            <w:proofErr w:type="spellStart"/>
+            <w:r>
+              <w:rPr>
+                <w:b w:val="0"/>
+                <w:bCs/>
+                <w:sz w:val="24"/>
+                <w:szCs w:val="24"/>
+              </w:rPr>
+              <w:t>fallo</w:t>
+            </w:r>
+            <w:proofErr w:type="spellEnd"/>
+            <w:r>
+              <w:rPr>
+                <w:b w:val="0"/>
+                <w:bCs/>
+                <w:sz w:val="24"/>
+                <w:szCs w:val="24"/>
+              </w:rPr>
+              <w:t xml:space="preserve"> indica SEC-03/TC-04 sin </w:t>
+            </w:r>
+            <w:proofErr w:type="spellStart"/>
+            <w:r>
+              <w:rPr>
+                <w:b w:val="0"/>
+                <w:bCs/>
+                <w:sz w:val="24"/>
+                <w:szCs w:val="24"/>
+              </w:rPr>
+              <w:t>abrir</w:t>
+            </w:r>
+            <w:proofErr w:type="spellEnd"/>
+            <w:r>
+              <w:rPr>
+                <w:b w:val="0"/>
+                <w:bCs/>
+                <w:sz w:val="24"/>
+                <w:szCs w:val="24"/>
+              </w:rPr>
+              <w:t xml:space="preserve"> el </w:t>
+            </w:r>
+            <w:proofErr w:type="spellStart"/>
+            <w:r>
+              <w:rPr>
+                <w:b w:val="0"/>
+                <w:bCs/>
+                <w:sz w:val="24"/>
+                <w:szCs w:val="24"/>
+              </w:rPr>
+              <w:t>código</w:t>
+            </w:r>
+            <w:proofErr w:type="spellEnd"/>
+            <w:r>
+              <w:rPr>
+                <w:b w:val="0"/>
+                <w:bCs/>
+                <w:sz w:val="24"/>
+                <w:szCs w:val="24"/>
+              </w:rPr>
+              <w:t>.</w:t>
+            </w:r>
+          </w:p>
+        </w:tc>
+      </w:tr>
+      <w:tr>
+        <w:tc>
+          <w:tcPr>
+            <w:tcW w:w="1129" w:type="dxa"/>
+            <w:vAlign w:val="center"/>
+          </w:tcPr>
+          <w:p>
+            <w:pPr>
+              <w:pStyle w:val="Ttulo1"/>
+              <w:jc w:val="both"/>
+              <w:rPr>
+                <w:b w:val="0"/>
+                <w:bCs/>
+                <w:sz w:val="24"/>
+                <w:szCs w:val="24"/>
+              </w:rPr>
+            </w:pPr>
+            <w:r>
+              <w:rPr>
+                <w:b w:val="0"/>
+                <w:bCs/>
+                <w:sz w:val="24"/>
+                <w:szCs w:val="24"/>
+              </w:rPr>
+              <w:t>TC-06</w:t>
+            </w:r>
+          </w:p>
+        </w:tc>
+        <w:tc>
+          <w:tcPr>
+            <w:tcW w:w="1843" w:type="dxa"/>
+            <w:vAlign w:val="center"/>
+          </w:tcPr>
+          <w:p>
+            <w:pPr>
+              <w:pStyle w:val="Ttulo1"/>
+              <w:jc w:val="both"/>
+              <w:rPr>
+                <w:b w:val="0"/>
+                <w:bCs/>
+                <w:sz w:val="24"/>
+                <w:szCs w:val="24"/>
+                <w:lang w:val="es-MX"/>
+              </w:rPr>
+            </w:pPr>
+            <w:proofErr w:type="spellStart"/>
+            <w:r>
+              <w:rPr>
+                <w:b w:val="0"/>
+                <w:bCs/>
+                <w:sz w:val="24"/>
+                <w:szCs w:val="24"/>
+                <w:lang w:val="es-MX"/>
+              </w:rPr>
+              <w:t>test_sesion_expirada_no_permita_lecturas</w:t>
+            </w:r>
+            <w:proofErr w:type="spellEnd"/>
+            <w:r>
+              <w:rPr>
+                <w:b w:val="0"/>
+                <w:bCs/>
+                <w:sz w:val="24"/>
+                <w:szCs w:val="24"/>
+                <w:lang w:val="es-MX"/>
+              </w:rPr>
+              <w:t>, aserciones sin mensaje</w:t>
+            </w:r>
+          </w:p>
+        </w:tc>
+        <w:tc>
+          <w:tcPr>
+            <w:tcW w:w="2693" w:type="dxa"/>
+            <w:vAlign w:val="center"/>
+          </w:tcPr>
+          <w:p>
+            <w:pPr>
+              <w:pStyle w:val="Ttulo1"/>
+              <w:jc w:val="both"/>
+              <w:rPr>
+                <w:b w:val="0"/>
+                <w:bCs/>
+                <w:sz w:val="24"/>
+                <w:szCs w:val="24"/>
+                <w:lang w:val="es-MX"/>
+              </w:rPr>
+            </w:pPr>
+            <w:proofErr w:type="spellStart"/>
+            <w:r>
+              <w:rPr>
+                <w:b w:val="0"/>
+                <w:bCs/>
+                <w:sz w:val="24"/>
+                <w:szCs w:val="24"/>
+                <w:lang w:val="es-MX"/>
+              </w:rPr>
+              <w:t>test_rechaza_lectura_con_sesion_expirada</w:t>
+            </w:r>
+            <w:proofErr w:type="spellEnd"/>
+            <w:r>
+              <w:rPr>
+                <w:b w:val="0"/>
+                <w:bCs/>
+                <w:sz w:val="24"/>
+                <w:szCs w:val="24"/>
+                <w:lang w:val="es-MX"/>
+              </w:rPr>
+              <w:t>, cada aserción con requisito y expectativa</w:t>
+            </w:r>
+          </w:p>
+        </w:tc>
+        <w:tc>
+          <w:tcPr>
+            <w:tcW w:w="3119" w:type="dxa"/>
+            <w:vAlign w:val="center"/>
+          </w:tcPr>
+          <w:p>
+            <w:pPr>
+              <w:pStyle w:val="Ttulo1"/>
+              <w:jc w:val="both"/>
+              <w:rPr>
+                <w:b w:val="0"/>
+                <w:bCs/>
+                <w:sz w:val="24"/>
+                <w:szCs w:val="24"/>
+                <w:lang w:val="es-MX"/>
+              </w:rPr>
+            </w:pPr>
+            <w:r>
+              <w:rPr>
+                <w:b w:val="0"/>
+                <w:bCs/>
+                <w:sz w:val="24"/>
+                <w:szCs w:val="24"/>
+                <w:lang w:val="es-MX"/>
+              </w:rPr>
+              <w:t xml:space="preserve">Misma razón; </w:t>
+            </w:r>
+            <w:r>
+              <w:rPr>
+                <w:rFonts w:cs="Arial"/>
+                <w:b w:val="0"/>
+                <w:bCs/>
+                <w:sz w:val="24"/>
+                <w:szCs w:val="24"/>
+                <w:lang w:val="es-MX"/>
+              </w:rPr>
+              <w:t>el mensaje de fallo identifica la cuenta sintética (</w:t>
+            </w:r>
+            <w:proofErr w:type="spellStart"/>
+            <w:r>
+              <w:rPr>
+                <w:rStyle w:val="CdigoHTML"/>
+                <w:rFonts w:ascii="Arial" w:eastAsiaTheme="majorEastAsia" w:hAnsi="Arial" w:cs="Arial"/>
+                <w:b w:val="0"/>
+                <w:bCs/>
+                <w:sz w:val="24"/>
+                <w:szCs w:val="24"/>
+                <w:lang w:val="es-MX"/>
+              </w:rPr>
+              <w:t>lab</w:t>
+            </w:r>
+            <w:proofErr w:type="spellEnd"/>
+            <w:r>
+              <w:rPr>
+                <w:rStyle w:val="CdigoHTML"/>
+                <w:rFonts w:ascii="Arial" w:eastAsiaTheme="majorEastAsia" w:hAnsi="Arial" w:cs="Arial"/>
+                <w:b w:val="0"/>
+                <w:bCs/>
+                <w:sz w:val="24"/>
+                <w:szCs w:val="24"/>
+                <w:lang w:val="es-MX"/>
+              </w:rPr>
+              <w:t>-vencida</w:t>
+            </w:r>
+            <w:r>
+              <w:rPr>
+                <w:rFonts w:cs="Arial"/>
+                <w:b w:val="0"/>
+                <w:bCs/>
+                <w:sz w:val="24"/>
+                <w:szCs w:val="24"/>
+                <w:lang w:val="es-MX"/>
+              </w:rPr>
+              <w:t>) y el expediente.</w:t>
+            </w:r>
+          </w:p>
+          <w:p>
+            <w:pPr>
+              <w:pStyle w:val="Ttulo1"/>
+              <w:jc w:val="both"/>
+              <w:rPr>
+                <w:b w:val="0"/>
+                <w:bCs/>
+                <w:sz w:val="24"/>
+                <w:szCs w:val="24"/>
+                <w:lang w:val="es-MX"/>
+              </w:rPr>
+            </w:pPr>
+          </w:p>
+        </w:tc>
+      </w:tr>
+    </w:tbl>
     <w:p>
       <w:pPr>
         <w:pStyle w:val="Ttulo1"/>
       </w:pPr>
       <w:r>
-        <w:lastRenderedPageBreak/>
         <w:t>Fase F — Análisis de resultados y dictamen</w:t>
       </w:r>
     </w:p>
@@ -17543,6 +21068,7 @@
                 <w:sz w:val="24"/>
                 <w:szCs w:val="24"/>
               </w:rPr>
+              <w:lastRenderedPageBreak/>
               <w:t>TC-12</w:t>
             </w:r>
           </w:p>
@@ -17729,11 +21255,7 @@
         <w:t>después</w:t>
       </w:r>
       <w:r>
-        <w:t xml:space="preserve"> de corregir los 5 defectos encontrados durante el proceso TDD — no significa que el sistema nunca falló, sino que </w:t>
-      </w:r>
-      <w:r>
-        <w:lastRenderedPageBreak/>
-        <w:t xml:space="preserve">todos los fallos detectados fueron tratados y </w:t>
+        <w:t xml:space="preserve"> de corregir los 5 defectos encontrados durante el proceso TDD — no significa que el sistema nunca falló, sino que todos los fallos detectados fueron tratados y </w:t>
       </w:r>
       <w:proofErr w:type="spellStart"/>
       <w:r>
@@ -18146,7 +21668,17 @@
                 <w:szCs w:val="24"/>
                 <w:lang w:val="es-MX"/>
               </w:rPr>
-              <w:t xml:space="preserve">GET /expedientes/202 con Bearer </w:t>
+              <w:t xml:space="preserve">GET /expedientes/202 con </w:t>
+            </w:r>
+            <w:r>
+              <w:rPr>
+                <w:rFonts w:ascii="Arial" w:hAnsi="Arial" w:cs="Arial"/>
+                <w:sz w:val="24"/>
+                <w:szCs w:val="24"/>
+                <w:lang w:val="es-MX"/>
+              </w:rPr>
+              <w:lastRenderedPageBreak/>
+              <w:t xml:space="preserve">Bearer </w:t>
             </w:r>
             <w:proofErr w:type="spellStart"/>
             <w:r>
@@ -18193,6 +21725,7 @@
                 <w:sz w:val="24"/>
                 <w:szCs w:val="24"/>
               </w:rPr>
+              <w:lastRenderedPageBreak/>
               <w:t>403, sin datos de Luis.</w:t>
             </w:r>
           </w:p>
@@ -18222,7 +21755,17 @@
                 <w:szCs w:val="24"/>
                 <w:lang w:val="es-MX"/>
               </w:rPr>
-              <w:t>200; el expediente ajeno se exponía completo.</w:t>
+              <w:t xml:space="preserve">200; el expediente ajeno se </w:t>
+            </w:r>
+            <w:r>
+              <w:rPr>
+                <w:rFonts w:ascii="Arial" w:hAnsi="Arial" w:cs="Arial"/>
+                <w:sz w:val="24"/>
+                <w:szCs w:val="24"/>
+                <w:lang w:val="es-MX"/>
+              </w:rPr>
+              <w:lastRenderedPageBreak/>
+              <w:t>exponía completo.</w:t>
             </w:r>
           </w:p>
         </w:tc>
@@ -18251,7 +21794,18 @@
                 <w:szCs w:val="24"/>
                 <w:lang w:val="es-MX"/>
               </w:rPr>
-              <w:t>Alto — cualquier estudiante podía ver notas y datos de otro cambiando el identificador en la URL.</w:t>
+              <w:lastRenderedPageBreak/>
+              <w:t xml:space="preserve">Alto — cualquier </w:t>
+            </w:r>
+            <w:r>
+              <w:rPr>
+                <w:rFonts w:ascii="Arial" w:hAnsi="Arial" w:cs="Arial"/>
+                <w:sz w:val="24"/>
+                <w:szCs w:val="24"/>
+                <w:lang w:val="es-MX"/>
+              </w:rPr>
+              <w:lastRenderedPageBreak/>
+              <w:t>estudiante podía ver notas y datos de otro cambiando el identificador en la URL.</w:t>
             </w:r>
           </w:p>
         </w:tc>
@@ -18280,7 +21834,18 @@
                 <w:szCs w:val="24"/>
                 <w:lang w:val="es-MX"/>
               </w:rPr>
-              <w:t xml:space="preserve">Se agregó comparación explícita estudiante-propietario en </w:t>
+              <w:lastRenderedPageBreak/>
+              <w:t xml:space="preserve">Se agregó comparación explícita </w:t>
+            </w:r>
+            <w:r>
+              <w:rPr>
+                <w:rFonts w:ascii="Arial" w:hAnsi="Arial" w:cs="Arial"/>
+                <w:sz w:val="24"/>
+                <w:szCs w:val="24"/>
+                <w:lang w:val="es-MX"/>
+              </w:rPr>
+              <w:lastRenderedPageBreak/>
+              <w:t xml:space="preserve">estudiante-propietario en </w:t>
             </w:r>
             <w:proofErr w:type="spellStart"/>
             <w:r>
@@ -18349,6 +21914,7 @@
                 <w:szCs w:val="24"/>
                 <w:lang w:val="es-MX"/>
               </w:rPr>
+              <w:lastRenderedPageBreak/>
               <w:t>evidencias/tc-02-acceso-horizontal-tdd/</w:t>
             </w:r>
           </w:p>
@@ -18454,17 +22020,7 @@
                 <w:szCs w:val="24"/>
                 <w:lang w:val="es-MX"/>
               </w:rPr>
-              <w:t>; luego GET /expedientes</w:t>
-            </w:r>
-            <w:r>
-              <w:rPr>
-                <w:rFonts w:ascii="Arial" w:hAnsi="Arial" w:cs="Arial"/>
-                <w:sz w:val="24"/>
-                <w:szCs w:val="24"/>
-                <w:lang w:val="es-MX"/>
-              </w:rPr>
-              <w:lastRenderedPageBreak/>
-              <w:t>/101 con el mismo token.</w:t>
+              <w:t>; luego GET /expedientes/101 con el mismo token.</w:t>
             </w:r>
           </w:p>
         </w:tc>
@@ -18491,7 +22047,6 @@
                 <w:sz w:val="24"/>
                 <w:szCs w:val="24"/>
               </w:rPr>
-              <w:lastRenderedPageBreak/>
               <w:t xml:space="preserve">401 </w:t>
             </w:r>
             <w:proofErr w:type="spellStart"/>
@@ -18557,17 +22112,7 @@
                 <w:szCs w:val="24"/>
                 <w:lang w:val="es-MX"/>
               </w:rPr>
-              <w:t xml:space="preserve">200; la sesión revocada seguía </w:t>
-            </w:r>
-            <w:r>
-              <w:rPr>
-                <w:rFonts w:ascii="Arial" w:hAnsi="Arial" w:cs="Arial"/>
-                <w:sz w:val="24"/>
-                <w:szCs w:val="24"/>
-                <w:lang w:val="es-MX"/>
-              </w:rPr>
-              <w:lastRenderedPageBreak/>
-              <w:t>dando acceso.</w:t>
+              <w:t>200; la sesión revocada seguía dando acceso.</w:t>
             </w:r>
           </w:p>
         </w:tc>
@@ -18596,18 +22141,7 @@
                 <w:szCs w:val="24"/>
                 <w:lang w:val="es-MX"/>
               </w:rPr>
-              <w:lastRenderedPageBreak/>
-              <w:t xml:space="preserve">Alto — una sesión revocada por </w:t>
-            </w:r>
-            <w:r>
-              <w:rPr>
-                <w:rFonts w:ascii="Arial" w:hAnsi="Arial" w:cs="Arial"/>
-                <w:sz w:val="24"/>
-                <w:szCs w:val="24"/>
-                <w:lang w:val="es-MX"/>
-              </w:rPr>
-              <w:lastRenderedPageBreak/>
-              <w:t>seguridad seguía siendo válida indefinidamente.</w:t>
+              <w:t>Alto — una sesión revocada por seguridad seguía siendo válida indefinidamente.</w:t>
             </w:r>
           </w:p>
         </w:tc>
@@ -18637,7 +22171,6 @@
                 <w:szCs w:val="24"/>
                 <w:lang w:val="es-MX"/>
               </w:rPr>
-              <w:lastRenderedPageBreak/>
               <w:t>autenticar(</w:t>
             </w:r>
             <w:proofErr w:type="gramEnd"/>
@@ -18648,17 +22181,7 @@
                 <w:szCs w:val="24"/>
                 <w:lang w:val="es-MX"/>
               </w:rPr>
-              <w:t xml:space="preserve">) valida explícitamente el estado de </w:t>
-            </w:r>
-            <w:r>
-              <w:rPr>
-                <w:rFonts w:ascii="Arial" w:hAnsi="Arial" w:cs="Arial"/>
-                <w:sz w:val="24"/>
-                <w:szCs w:val="24"/>
-                <w:lang w:val="es-MX"/>
-              </w:rPr>
-              <w:lastRenderedPageBreak/>
-              <w:t>revocación.</w:t>
+              <w:t>) valida explícitamente el estado de revocación.</w:t>
             </w:r>
           </w:p>
         </w:tc>
@@ -18687,7 +22210,6 @@
                 <w:szCs w:val="24"/>
                 <w:lang w:val="es-MX"/>
               </w:rPr>
-              <w:lastRenderedPageBreak/>
               <w:t>evidencias/tc-04-sesion-revocada-tdd/, manual-api-postman/03-04</w:t>
             </w:r>
           </w:p>
@@ -18793,7 +22315,17 @@
                 <w:szCs w:val="24"/>
                 <w:lang w:val="es-MX"/>
               </w:rPr>
-              <w:t xml:space="preserve"> (docente de Central) sobre expediente de Pacífico.</w:t>
+              <w:t xml:space="preserve"> (docente de Central) </w:t>
+            </w:r>
+            <w:r>
+              <w:rPr>
+                <w:rFonts w:ascii="Arial" w:hAnsi="Arial" w:cs="Arial"/>
+                <w:sz w:val="24"/>
+                <w:szCs w:val="24"/>
+                <w:lang w:val="es-MX"/>
+              </w:rPr>
+              <w:lastRenderedPageBreak/>
+              <w:t>sobre expediente de Pacífico.</w:t>
             </w:r>
           </w:p>
         </w:tc>
@@ -18820,6 +22352,7 @@
                 <w:sz w:val="24"/>
                 <w:szCs w:val="24"/>
               </w:rPr>
+              <w:lastRenderedPageBreak/>
               <w:t xml:space="preserve">403, nota se </w:t>
             </w:r>
             <w:proofErr w:type="spellStart"/>
@@ -18914,7 +22447,17 @@
                 <w:szCs w:val="24"/>
                 <w:lang w:val="es-MX"/>
               </w:rPr>
-              <w:t>Alto — un docente podía alterar calificaciones de estudiantes de otra sede.</w:t>
+              <w:t>Alto — un docente podía alterar calificaciones de estudian</w:t>
+            </w:r>
+            <w:r>
+              <w:rPr>
+                <w:rFonts w:ascii="Arial" w:hAnsi="Arial" w:cs="Arial"/>
+                <w:sz w:val="24"/>
+                <w:szCs w:val="24"/>
+                <w:lang w:val="es-MX"/>
+              </w:rPr>
+              <w:lastRenderedPageBreak/>
+              <w:t>tes de otra sede.</w:t>
             </w:r>
           </w:p>
         </w:tc>
@@ -18944,6 +22487,7 @@
                 <w:szCs w:val="24"/>
                 <w:lang w:val="es-MX"/>
               </w:rPr>
+              <w:lastRenderedPageBreak/>
               <w:t>actualizar_</w:t>
             </w:r>
             <w:proofErr w:type="gramStart"/>
@@ -18974,7 +22518,17 @@
                 <w:szCs w:val="24"/>
                 <w:lang w:val="es-MX"/>
               </w:rPr>
-              <w:t>) compara la sede del docente contra la del expediente.</w:t>
+              <w:t xml:space="preserve">) compara la sede del docente contra la del </w:t>
+            </w:r>
+            <w:r>
+              <w:rPr>
+                <w:rFonts w:ascii="Arial" w:hAnsi="Arial" w:cs="Arial"/>
+                <w:sz w:val="24"/>
+                <w:szCs w:val="24"/>
+                <w:lang w:val="es-MX"/>
+              </w:rPr>
+              <w:lastRenderedPageBreak/>
+              <w:t>expediente.</w:t>
             </w:r>
           </w:p>
         </w:tc>
@@ -19003,6 +22557,7 @@
                 <w:szCs w:val="24"/>
                 <w:lang w:val="es-MX"/>
               </w:rPr>
+              <w:lastRenderedPageBreak/>
               <w:t>evidencias/tc-03-modificacion-entre-sedes-tdd/, manual-api-postman/01</w:t>
             </w:r>
           </w:p>
@@ -19032,6 +22587,7 @@
                 <w:sz w:val="24"/>
                 <w:szCs w:val="24"/>
               </w:rPr>
+              <w:lastRenderedPageBreak/>
               <w:t>H-04</w:t>
             </w:r>
           </w:p>
@@ -19423,17 +22979,7 @@
                 <w:szCs w:val="24"/>
                 <w:lang w:val="es-MX"/>
               </w:rPr>
-              <w:t xml:space="preserve">Leer expediente 101 (acción autorizada); inspeccionar </w:t>
-            </w:r>
-            <w:r>
-              <w:rPr>
-                <w:rFonts w:ascii="Arial" w:hAnsi="Arial" w:cs="Arial"/>
-                <w:sz w:val="24"/>
-                <w:szCs w:val="24"/>
-                <w:lang w:val="es-MX"/>
-              </w:rPr>
-              <w:lastRenderedPageBreak/>
-              <w:t>la última entrada de la bitácora.</w:t>
+              <w:t>Leer expediente 101 (acción autorizada); inspeccionar la última entrada de la bitácora.</w:t>
             </w:r>
           </w:p>
         </w:tc>
@@ -19462,7 +23008,6 @@
                 <w:szCs w:val="24"/>
                 <w:lang w:val="es-MX"/>
               </w:rPr>
-              <w:lastRenderedPageBreak/>
               <w:t xml:space="preserve">Entrada con actor y </w:t>
             </w:r>
             <w:proofErr w:type="spellStart"/>
@@ -19473,17 +23018,7 @@
                 <w:szCs w:val="24"/>
                 <w:lang w:val="es-MX"/>
               </w:rPr>
-              <w:t>timestam</w:t>
-            </w:r>
-            <w:r>
-              <w:rPr>
-                <w:rFonts w:ascii="Arial" w:hAnsi="Arial" w:cs="Arial"/>
-                <w:sz w:val="24"/>
-                <w:szCs w:val="24"/>
-                <w:lang w:val="es-MX"/>
-              </w:rPr>
-              <w:lastRenderedPageBreak/>
-              <w:t>p</w:t>
+              <w:t>timestamp</w:t>
             </w:r>
             <w:proofErr w:type="spellEnd"/>
             <w:r>
@@ -19522,18 +23057,7 @@
                 <w:szCs w:val="24"/>
                 <w:lang w:val="es-MX"/>
               </w:rPr>
-              <w:lastRenderedPageBreak/>
-              <w:t xml:space="preserve">Error al faltar el actor; además el token se </w:t>
-            </w:r>
-            <w:r>
-              <w:rPr>
-                <w:rFonts w:ascii="Arial" w:hAnsi="Arial" w:cs="Arial"/>
-                <w:sz w:val="24"/>
-                <w:szCs w:val="24"/>
-                <w:lang w:val="es-MX"/>
-              </w:rPr>
-              <w:lastRenderedPageBreak/>
-              <w:t>guardaba en texto claro.</w:t>
+              <w:t>Error al faltar el actor; además el token se guardaba en texto claro.</w:t>
             </w:r>
           </w:p>
         </w:tc>
@@ -19562,18 +23086,7 @@
                 <w:szCs w:val="24"/>
                 <w:lang w:val="es-MX"/>
               </w:rPr>
-              <w:lastRenderedPageBreak/>
-              <w:t xml:space="preserve">Alto — exposición de credenciales de </w:t>
-            </w:r>
-            <w:r>
-              <w:rPr>
-                <w:rFonts w:ascii="Arial" w:hAnsi="Arial" w:cs="Arial"/>
-                <w:sz w:val="24"/>
-                <w:szCs w:val="24"/>
-                <w:lang w:val="es-MX"/>
-              </w:rPr>
-              <w:lastRenderedPageBreak/>
-              <w:t>sesión en los logs, riesgo de secuestro de sesión.</w:t>
+              <w:t>Alto — exposición de credenciales de sesión en los logs, riesgo de secuestro de sesión.</w:t>
             </w:r>
           </w:p>
         </w:tc>
@@ -19603,7 +23116,6 @@
                 <w:szCs w:val="24"/>
                 <w:lang w:val="es-MX"/>
               </w:rPr>
-              <w:lastRenderedPageBreak/>
               <w:t>registrar_</w:t>
             </w:r>
             <w:proofErr w:type="gramStart"/>
@@ -19654,17 +23166,7 @@
                 <w:szCs w:val="24"/>
                 <w:lang w:val="es-MX"/>
               </w:rPr>
-              <w:t xml:space="preserve"> y </w:t>
-            </w:r>
-            <w:r>
-              <w:rPr>
-                <w:rFonts w:ascii="Arial" w:hAnsi="Arial" w:cs="Arial"/>
-                <w:sz w:val="24"/>
-                <w:szCs w:val="24"/>
-                <w:lang w:val="es-MX"/>
-              </w:rPr>
-              <w:lastRenderedPageBreak/>
-              <w:t>deja de guardar el token.</w:t>
+              <w:t xml:space="preserve"> y deja de guardar el token.</w:t>
             </w:r>
           </w:p>
         </w:tc>
@@ -19693,7 +23195,6 @@
                 <w:szCs w:val="24"/>
                 <w:lang w:val="es-MX"/>
               </w:rPr>
-              <w:lastRenderedPageBreak/>
               <w:t>evidencias/tc-07-auditoria-segura-tdd/</w:t>
             </w:r>
           </w:p>
@@ -19758,6 +23259,7 @@
         <w:jc w:val="center"/>
       </w:pPr>
       <w:r>
+        <w:lastRenderedPageBreak/>
         <w:t>Decisión de liberación y limitaciones</w:t>
       </w:r>
     </w:p>
@@ -19864,14 +23366,7 @@
         <w:rPr>
           <w:rFonts w:ascii="Arial" w:hAnsi="Arial" w:cs="Arial"/>
         </w:rPr>
-        <w:t xml:space="preserve"> la campaña se limitó a los 12 casos definidos sobre un laboratorio local con datos sintéticos; no se ejecutaron herramientas SAST/DAST automatizadas adicionales a la revisión estática manual; la evaluación de usabilidad </w:t>
-      </w:r>
-      <w:r>
-        <w:rPr>
-          <w:rFonts w:ascii="Arial" w:hAnsi="Arial" w:cs="Arial"/>
-        </w:rPr>
-        <w:lastRenderedPageBreak/>
-        <w:t>(Fase E) fue una autoevaluación del propio autor del código por limitación de tiempo del equipo, no una prueba ciega con un tercero.</w:t>
+        <w:t xml:space="preserve"> la campaña se limitó a los 12 casos definidos sobre un laboratorio local con datos sintéticos; no se ejecutaron herramientas SAST/DAST automatizadas adicionales a la revisión estática manual; la evaluación de usabilidad (Fase E) fue una autoevaluación del propio autor del código por limitación de tiempo del equipo, no una prueba ciega con un tercero.</w:t>
       </w:r>
     </w:p>
     <w:p>
@@ -26219,8 +29714,58 @@
         <w:t>-suite-final.</w:t>
       </w:r>
     </w:p>
+    <w:p>
+      <w:pPr>
+        <w:spacing w:line="360" w:lineRule="auto"/>
+        <w:jc w:val="both"/>
+        <w:rPr>
+          <w:rFonts w:ascii="Arial" w:hAnsi="Arial" w:cs="Arial"/>
+        </w:rPr>
+      </w:pPr>
+      <w:r>
+        <w:rPr>
+          <w:rFonts w:ascii="Arial" w:hAnsi="Arial" w:cs="Arial"/>
+        </w:rPr>
+        <w:lastRenderedPageBreak/>
+        <w:drawing>
+          <wp:inline distT="0" distB="0" distL="0" distR="0" wp14:anchorId="7B40BFA6" wp14:editId="48121524">
+            <wp:extent cx="5943600" cy="1805305"/>
+            <wp:effectExtent l="0" t="0" r="0" b="4445"/>
+            <wp:docPr id="1443442373" name="Imagen 1"/>
+            <wp:cNvGraphicFramePr>
+              <a:graphicFrameLocks xmlns:a="http://schemas.openxmlformats.org/drawingml/2006/main" noChangeAspect="1"/>
+            </wp:cNvGraphicFramePr>
+            <a:graphic xmlns:a="http://schemas.openxmlformats.org/drawingml/2006/main">
+              <a:graphicData uri="http://schemas.openxmlformats.org/drawingml/2006/picture">
+                <pic:pic xmlns:pic="http://schemas.openxmlformats.org/drawingml/2006/picture">
+                  <pic:nvPicPr>
+                    <pic:cNvPr id="1443442373" name=""/>
+                    <pic:cNvPicPr/>
+                  </pic:nvPicPr>
+                  <pic:blipFill>
+                    <a:blip r:embed="rId9"/>
+                    <a:stretch>
+                      <a:fillRect/>
+                    </a:stretch>
+                  </pic:blipFill>
+                  <pic:spPr>
+                    <a:xfrm>
+                      <a:off x="0" y="0"/>
+                      <a:ext cx="5943600" cy="1805305"/>
+                    </a:xfrm>
+                    <a:prstGeom prst="rect">
+                      <a:avLst/>
+                    </a:prstGeom>
+                  </pic:spPr>
+                </pic:pic>
+              </a:graphicData>
+            </a:graphic>
+          </wp:inline>
+        </w:drawing>
+      </w:r>
+    </w:p>
     <w:sectPr>
-      <w:footerReference w:type="default" r:id="rId9"/>
+      <w:footerReference w:type="default" r:id="rId10"/>
       <w:pgSz w:w="12240" w:h="15840"/>
       <w:pgMar w:top="1440" w:right="1440" w:bottom="1440" w:left="1440" w:header="709" w:footer="709" w:gutter="0"/>
       <w:cols w:space="708"/>
@@ -27863,6 +31408,19 @@
       </w:tblBorders>
     </w:tblPr>
   </w:style>
+  <w:style w:type="character" w:styleId="CdigoHTML">
+    <w:name w:val="HTML Code"/>
+    <w:basedOn w:val="Fuentedeprrafopredeter"/>
+    <w:uiPriority w:val="99"/>
+    <w:semiHidden/>
+    <w:unhideWhenUsed/>
+    <w:rsid w:val="00B33FA4"/>
+    <w:rPr>
+      <w:rFonts w:ascii="Courier New" w:eastAsia="Times New Roman" w:hAnsi="Courier New" w:cs="Courier New"/>
+      <w:sz w:val="20"/>
+      <w:szCs w:val="20"/>
+    </w:rPr>
+  </w:style>
 </w:styles>
 </file>
 

</xml_diff>